<commit_message>
Added unsigned compare statements
updated documents to reflect changes and re-clarified a few different sections of the manual to specify how data is stored and used
added ULT() 
added UGT()
</commit_message>
<xml_diff>
--- a/documents/MICRO-BASIC-Manual.docx
+++ b/documents/MICRO-BASIC-Manual.docx
@@ -1,6 +1,6 @@
 
 <file path=word/document.xml><?xml version="1.0" encoding="utf-8"?>
-<w:document xmlns:o="urn:schemas-microsoft-com:office:office" xmlns:r="http://schemas.openxmlformats.org/officeDocument/2006/relationships" xmlns:v="urn:schemas-microsoft-com:vml" xmlns:w="http://schemas.openxmlformats.org/wordprocessingml/2006/main" xmlns:w10="urn:schemas-microsoft-com:office:word" xmlns:wp="http://schemas.openxmlformats.org/drawingml/2006/wordprocessingDrawing" xmlns:wps="http://schemas.microsoft.com/office/word/2010/wordprocessingShape" xmlns:wpg="http://schemas.microsoft.com/office/word/2010/wordprocessingGroup" xmlns:mc="http://schemas.openxmlformats.org/markup-compatibility/2006" xmlns:wp14="http://schemas.microsoft.com/office/word/2010/wordprocessingDrawing" xmlns:w14="http://schemas.microsoft.com/office/word/2010/wordml" xmlns:w15="http://schemas.microsoft.com/office/word/2012/wordml" mc:Ignorable="w14 wp14 w15">
+<w:document xmlns:o="urn:schemas-microsoft-com:office:office" xmlns:r="http://schemas.openxmlformats.org/officeDocument/2006/relationships" xmlns:v="urn:schemas-microsoft-com:vml" xmlns:w="http://schemas.openxmlformats.org/wordprocessingml/2006/main" xmlns:w10="urn:schemas-microsoft-com:office:word" xmlns:wp="http://schemas.openxmlformats.org/drawingml/2006/wordprocessingDrawing" xmlns:pic="http://schemas.openxmlformats.org/drawingml/2006/picture" xmlns:wps="http://schemas.microsoft.com/office/word/2010/wordprocessingShape" xmlns:wpg="http://schemas.microsoft.com/office/word/2010/wordprocessingGroup" xmlns:mc="http://schemas.openxmlformats.org/markup-compatibility/2006" xmlns:wp14="http://schemas.microsoft.com/office/word/2010/wordprocessingDrawing" xmlns:w14="http://schemas.microsoft.com/office/word/2010/wordml" xmlns:w15="http://schemas.microsoft.com/office/word/2012/wordml" mc:Ignorable="w14 wp14 w15">
   <w:body>
     <w:p>
       <w:pPr>
@@ -121,7 +121,7 @@
       </w:pPr>
       <w:r>
         <w:rPr>
-          <w:rFonts w:eastAsia="Arial" w:cs="Arial" w:ascii="Arial" w:hAnsi="Arial"/>
+          <w:rFonts w:eastAsia="Arial" w:cs="Arial"/>
           <w:b/>
           <w:bCs/>
           <w:color w:val="1F4E79"/>
@@ -143,7 +143,7 @@
           <w:sz w:val="22"/>
           <w:szCs w:val="22"/>
         </w:rPr>
-        <w:t>MICRO-BASIC is a small, fast integer BASIC interpreter. It is designed to run on a wide range of hardware, from modern 64-bit Linux and Windows systems down to 16-bit DOS machines and embedded targets such as the Z80 and 6809. All arithmetic is performed in 16-bit signed integers, which keeps the interpreter compact and fast.</w:t>
+        <w:t>MICRO-BASIC is a small, fast integer BASIC interpreter. It is designed to run on a wide range of hardware, from modern 64-bit Linux and Windows systems down to 16-bit DOS machines and embedded targets such as the Z80 and 6809. All values are stored as 16-bit quantities and interpreted as signed by default, which keeps the interpreter compact and fast.</w:t>
       </w:r>
     </w:p>
     <w:p>
@@ -189,7 +189,7 @@
       </w:pPr>
       <w:r>
         <w:rPr>
-          <w:rFonts w:eastAsia="Arial" w:cs="Arial" w:ascii="Arial" w:hAnsi="Arial"/>
+          <w:rFonts w:eastAsia="Arial" w:cs="Arial"/>
           <w:b/>
           <w:bCs/>
           <w:color w:val="2E75B6"/>
@@ -344,7 +344,7 @@
       </w:pPr>
       <w:r>
         <w:rPr>
-          <w:rFonts w:eastAsia="Arial" w:cs="Arial" w:ascii="Arial" w:hAnsi="Arial"/>
+          <w:rFonts w:eastAsia="Arial" w:cs="Arial"/>
           <w:b/>
           <w:bCs/>
           <w:color w:val="2E75B6"/>
@@ -366,7 +366,7 @@
           <w:sz w:val="22"/>
           <w:szCs w:val="22"/>
         </w:rPr>
-        <w:t>All numeric values are signed 16-bit integers. The valid range is -32768 to 32767. Arithmetic wraps at 16-bit boundaries. There is no floating point.</w:t>
+        <w:t>All numeric values are stored as 16-bit quantities and interpreted as signed by default. The signed range is -32768 to 32767; the unsigned range is 0 to 65535. Arithmetic wraps at 16-bit boundaries. There is no floating point.</w:t>
       </w:r>
     </w:p>
     <w:p>
@@ -416,7 +416,7 @@
       </w:pPr>
       <w:r>
         <w:rPr>
-          <w:rFonts w:eastAsia="Arial" w:cs="Arial" w:ascii="Arial" w:hAnsi="Arial"/>
+          <w:rFonts w:eastAsia="Arial" w:cs="Arial"/>
           <w:b/>
           <w:bCs/>
           <w:color w:val="1F4E79"/>
@@ -434,7 +434,7 @@
       </w:pPr>
       <w:r>
         <w:rPr>
-          <w:rFonts w:eastAsia="Arial" w:cs="Arial" w:ascii="Arial" w:hAnsi="Arial"/>
+          <w:rFonts w:eastAsia="Arial" w:cs="Arial"/>
           <w:b/>
           <w:bCs/>
           <w:color w:val="2E75B6"/>
@@ -574,7 +574,7 @@
       </w:pPr>
       <w:r>
         <w:rPr>
-          <w:rFonts w:eastAsia="Arial" w:cs="Arial" w:ascii="Arial" w:hAnsi="Arial"/>
+          <w:rFonts w:eastAsia="Arial" w:cs="Arial"/>
           <w:b/>
           <w:bCs/>
           <w:color w:val="2E75B6"/>
@@ -634,7 +634,7 @@
       </w:pPr>
       <w:r>
         <w:rPr>
-          <w:rFonts w:eastAsia="Arial" w:cs="Arial" w:ascii="Arial" w:hAnsi="Arial"/>
+          <w:rFonts w:eastAsia="Arial" w:cs="Arial"/>
           <w:b/>
           <w:bCs/>
           <w:color w:val="2E75B6"/>
@@ -677,7 +677,7 @@
       </w:pPr>
       <w:r>
         <w:rPr>
-          <w:rFonts w:eastAsia="Arial" w:cs="Arial" w:ascii="Arial" w:hAnsi="Arial"/>
+          <w:rFonts w:eastAsia="Arial" w:cs="Arial"/>
           <w:b/>
           <w:bCs/>
           <w:color w:val="2E75B6"/>
@@ -815,7 +815,7 @@
       </w:pPr>
       <w:r>
         <w:rPr>
-          <w:rFonts w:eastAsia="Arial" w:cs="Arial" w:ascii="Arial" w:hAnsi="Arial"/>
+          <w:rFonts w:eastAsia="Arial" w:cs="Arial"/>
           <w:b/>
           <w:bCs/>
           <w:color w:val="1F4E79"/>
@@ -848,7 +848,7 @@
       </w:pPr>
       <w:r>
         <w:rPr>
-          <w:rFonts w:eastAsia="Arial" w:cs="Arial" w:ascii="Arial" w:hAnsi="Arial"/>
+          <w:rFonts w:eastAsia="Arial" w:cs="Arial"/>
           <w:b/>
           <w:bCs/>
           <w:color w:val="2E75B6"/>
@@ -898,7 +898,7 @@
       </w:tblPr>
       <w:tblGrid>
         <w:gridCol w:w="4000"/>
-        <w:gridCol w:w="5359"/>
+        <w:gridCol w:w="5360"/>
       </w:tblGrid>
       <w:tr>
         <w:trPr>
@@ -935,7 +935,7 @@
         </w:tc>
         <w:tc>
           <w:tcPr>
-            <w:tcW w:w="5359" w:type="dxa"/>
+            <w:tcW w:w="5360" w:type="dxa"/>
             <w:tcBorders>
               <w:top w:val="single" w:sz="2" w:space="0" w:color="CCCCCC"/>
               <w:start w:val="single" w:sz="2" w:space="0" w:color="CCCCCC"/>
@@ -994,7 +994,7 @@
         </w:tc>
         <w:tc>
           <w:tcPr>
-            <w:tcW w:w="5359" w:type="dxa"/>
+            <w:tcW w:w="5360" w:type="dxa"/>
             <w:tcBorders>
               <w:top w:val="single" w:sz="2" w:space="0" w:color="CCCCCC"/>
               <w:start w:val="single" w:sz="2" w:space="0" w:color="CCCCCC"/>
@@ -1051,7 +1051,7 @@
         </w:tc>
         <w:tc>
           <w:tcPr>
-            <w:tcW w:w="5359" w:type="dxa"/>
+            <w:tcW w:w="5360" w:type="dxa"/>
             <w:tcBorders>
               <w:top w:val="single" w:sz="2" w:space="0" w:color="CCCCCC"/>
               <w:start w:val="single" w:sz="2" w:space="0" w:color="CCCCCC"/>
@@ -1108,7 +1108,7 @@
         </w:tc>
         <w:tc>
           <w:tcPr>
-            <w:tcW w:w="5359" w:type="dxa"/>
+            <w:tcW w:w="5360" w:type="dxa"/>
             <w:tcBorders>
               <w:top w:val="single" w:sz="2" w:space="0" w:color="CCCCCC"/>
               <w:start w:val="single" w:sz="2" w:space="0" w:color="CCCCCC"/>
@@ -1153,7 +1153,7 @@
       </w:pPr>
       <w:r>
         <w:rPr>
-          <w:rFonts w:eastAsia="Arial" w:cs="Arial" w:ascii="Arial" w:hAnsi="Arial"/>
+          <w:rFonts w:eastAsia="Arial" w:cs="Arial"/>
           <w:b/>
           <w:bCs/>
           <w:color w:val="2E75B6"/>
@@ -1175,7 +1175,7 @@
           <w:sz w:val="22"/>
           <w:szCs w:val="22"/>
         </w:rPr>
-        <w:t xml:space="preserve">Numeric variables hold signed 16-bit integers. Assign with </w:t>
+        <w:t xml:space="preserve">Numeric variables hold 16-bit quantities, interpreted as signed by default. Assign with </w:t>
       </w:r>
       <w:r>
         <w:rPr>
@@ -1246,7 +1246,7 @@
       </w:pPr>
       <w:r>
         <w:rPr>
-          <w:rFonts w:eastAsia="Arial" w:cs="Arial" w:ascii="Arial" w:hAnsi="Arial"/>
+          <w:rFonts w:eastAsia="Arial" w:cs="Arial"/>
           <w:b/>
           <w:bCs/>
           <w:color w:val="2E75B6"/>
@@ -1323,7 +1323,7 @@
       </w:pPr>
       <w:r>
         <w:rPr>
-          <w:rFonts w:eastAsia="Arial" w:cs="Arial" w:ascii="Arial" w:hAnsi="Arial"/>
+          <w:rFonts w:eastAsia="Arial" w:cs="Arial"/>
           <w:b/>
           <w:bCs/>
           <w:color w:val="2E75B6"/>
@@ -1480,7 +1480,7 @@
       </w:pPr>
       <w:r>
         <w:rPr>
-          <w:rFonts w:eastAsia="Arial" w:cs="Arial" w:ascii="Arial" w:hAnsi="Arial"/>
+          <w:rFonts w:eastAsia="Arial" w:cs="Arial"/>
           <w:b/>
           <w:bCs/>
           <w:color w:val="2E75B6"/>
@@ -1556,7 +1556,7 @@
       </w:pPr>
       <w:r>
         <w:rPr>
-          <w:rFonts w:eastAsia="Arial" w:cs="Arial" w:ascii="Arial" w:hAnsi="Arial"/>
+          <w:rFonts w:eastAsia="Arial" w:cs="Arial"/>
           <w:b/>
           <w:bCs/>
           <w:color w:val="1F4E79"/>
@@ -1574,7 +1574,7 @@
       </w:pPr>
       <w:r>
         <w:rPr>
-          <w:rFonts w:eastAsia="Arial" w:cs="Arial" w:ascii="Arial" w:hAnsi="Arial"/>
+          <w:rFonts w:eastAsia="Arial" w:cs="Arial"/>
           <w:b/>
           <w:bCs/>
           <w:color w:val="2E75B6"/>
@@ -1599,7 +1599,7 @@
       </w:tblPr>
       <w:tblGrid>
         <w:gridCol w:w="2000"/>
-        <w:gridCol w:w="7359"/>
+        <w:gridCol w:w="7360"/>
       </w:tblGrid>
       <w:tr>
         <w:trPr>
@@ -1636,7 +1636,7 @@
         </w:tc>
         <w:tc>
           <w:tcPr>
-            <w:tcW w:w="7359" w:type="dxa"/>
+            <w:tcW w:w="7360" w:type="dxa"/>
             <w:tcBorders>
               <w:top w:val="single" w:sz="2" w:space="0" w:color="CCCCCC"/>
               <w:start w:val="single" w:sz="2" w:space="0" w:color="CCCCCC"/>
@@ -1695,7 +1695,7 @@
         </w:tc>
         <w:tc>
           <w:tcPr>
-            <w:tcW w:w="7359" w:type="dxa"/>
+            <w:tcW w:w="7360" w:type="dxa"/>
             <w:tcBorders>
               <w:top w:val="single" w:sz="2" w:space="0" w:color="CCCCCC"/>
               <w:start w:val="single" w:sz="2" w:space="0" w:color="CCCCCC"/>
@@ -1752,7 +1752,7 @@
         </w:tc>
         <w:tc>
           <w:tcPr>
-            <w:tcW w:w="7359" w:type="dxa"/>
+            <w:tcW w:w="7360" w:type="dxa"/>
             <w:tcBorders>
               <w:top w:val="single" w:sz="2" w:space="0" w:color="CCCCCC"/>
               <w:start w:val="single" w:sz="2" w:space="0" w:color="CCCCCC"/>
@@ -1809,7 +1809,7 @@
         </w:tc>
         <w:tc>
           <w:tcPr>
-            <w:tcW w:w="7359" w:type="dxa"/>
+            <w:tcW w:w="7360" w:type="dxa"/>
             <w:tcBorders>
               <w:top w:val="single" w:sz="2" w:space="0" w:color="CCCCCC"/>
               <w:start w:val="single" w:sz="2" w:space="0" w:color="CCCCCC"/>
@@ -1866,7 +1866,7 @@
         </w:tc>
         <w:tc>
           <w:tcPr>
-            <w:tcW w:w="7359" w:type="dxa"/>
+            <w:tcW w:w="7360" w:type="dxa"/>
             <w:tcBorders>
               <w:top w:val="single" w:sz="2" w:space="0" w:color="CCCCCC"/>
               <w:start w:val="single" w:sz="2" w:space="0" w:color="CCCCCC"/>
@@ -1923,7 +1923,7 @@
         </w:tc>
         <w:tc>
           <w:tcPr>
-            <w:tcW w:w="7359" w:type="dxa"/>
+            <w:tcW w:w="7360" w:type="dxa"/>
             <w:tcBorders>
               <w:top w:val="single" w:sz="2" w:space="0" w:color="CCCCCC"/>
               <w:start w:val="single" w:sz="2" w:space="0" w:color="CCCCCC"/>
@@ -1980,7 +1980,7 @@
         </w:tc>
         <w:tc>
           <w:tcPr>
-            <w:tcW w:w="7359" w:type="dxa"/>
+            <w:tcW w:w="7360" w:type="dxa"/>
             <w:tcBorders>
               <w:top w:val="single" w:sz="2" w:space="0" w:color="CCCCCC"/>
               <w:start w:val="single" w:sz="2" w:space="0" w:color="CCCCCC"/>
@@ -2037,7 +2037,7 @@
         </w:tc>
         <w:tc>
           <w:tcPr>
-            <w:tcW w:w="7359" w:type="dxa"/>
+            <w:tcW w:w="7360" w:type="dxa"/>
             <w:tcBorders>
               <w:top w:val="single" w:sz="2" w:space="0" w:color="CCCCCC"/>
               <w:start w:val="single" w:sz="2" w:space="0" w:color="CCCCCC"/>
@@ -2094,7 +2094,7 @@
         </w:tc>
         <w:tc>
           <w:tcPr>
-            <w:tcW w:w="7359" w:type="dxa"/>
+            <w:tcW w:w="7360" w:type="dxa"/>
             <w:tcBorders>
               <w:top w:val="single" w:sz="2" w:space="0" w:color="CCCCCC"/>
               <w:start w:val="single" w:sz="2" w:space="0" w:color="CCCCCC"/>
@@ -2151,7 +2151,7 @@
         </w:tc>
         <w:tc>
           <w:tcPr>
-            <w:tcW w:w="7359" w:type="dxa"/>
+            <w:tcW w:w="7360" w:type="dxa"/>
             <w:tcBorders>
               <w:top w:val="single" w:sz="2" w:space="0" w:color="CCCCCC"/>
               <w:start w:val="single" w:sz="2" w:space="0" w:color="CCCCCC"/>
@@ -2208,7 +2208,7 @@
         </w:tc>
         <w:tc>
           <w:tcPr>
-            <w:tcW w:w="7359" w:type="dxa"/>
+            <w:tcW w:w="7360" w:type="dxa"/>
             <w:tcBorders>
               <w:top w:val="single" w:sz="2" w:space="0" w:color="CCCCCC"/>
               <w:start w:val="single" w:sz="2" w:space="0" w:color="CCCCCC"/>
@@ -2265,7 +2265,7 @@
         </w:tc>
         <w:tc>
           <w:tcPr>
-            <w:tcW w:w="7359" w:type="dxa"/>
+            <w:tcW w:w="7360" w:type="dxa"/>
             <w:tcBorders>
               <w:top w:val="single" w:sz="2" w:space="0" w:color="CCCCCC"/>
               <w:start w:val="single" w:sz="2" w:space="0" w:color="CCCCCC"/>
@@ -2322,7 +2322,7 @@
         </w:tc>
         <w:tc>
           <w:tcPr>
-            <w:tcW w:w="7359" w:type="dxa"/>
+            <w:tcW w:w="7360" w:type="dxa"/>
             <w:tcBorders>
               <w:top w:val="single" w:sz="2" w:space="0" w:color="CCCCCC"/>
               <w:start w:val="single" w:sz="2" w:space="0" w:color="CCCCCC"/>
@@ -2379,7 +2379,7 @@
         </w:tc>
         <w:tc>
           <w:tcPr>
-            <w:tcW w:w="7359" w:type="dxa"/>
+            <w:tcW w:w="7360" w:type="dxa"/>
             <w:tcBorders>
               <w:top w:val="single" w:sz="2" w:space="0" w:color="CCCCCC"/>
               <w:start w:val="single" w:sz="2" w:space="0" w:color="CCCCCC"/>
@@ -2436,7 +2436,7 @@
         </w:tc>
         <w:tc>
           <w:tcPr>
-            <w:tcW w:w="7359" w:type="dxa"/>
+            <w:tcW w:w="7360" w:type="dxa"/>
             <w:tcBorders>
               <w:top w:val="single" w:sz="2" w:space="0" w:color="CCCCCC"/>
               <w:start w:val="single" w:sz="2" w:space="0" w:color="CCCCCC"/>
@@ -2493,7 +2493,7 @@
         </w:tc>
         <w:tc>
           <w:tcPr>
-            <w:tcW w:w="7359" w:type="dxa"/>
+            <w:tcW w:w="7360" w:type="dxa"/>
             <w:tcBorders>
               <w:top w:val="single" w:sz="2" w:space="0" w:color="CCCCCC"/>
               <w:start w:val="single" w:sz="2" w:space="0" w:color="CCCCCC"/>
@@ -2550,7 +2550,7 @@
         </w:tc>
         <w:tc>
           <w:tcPr>
-            <w:tcW w:w="7359" w:type="dxa"/>
+            <w:tcW w:w="7360" w:type="dxa"/>
             <w:tcBorders>
               <w:top w:val="single" w:sz="2" w:space="0" w:color="CCCCCC"/>
               <w:start w:val="single" w:sz="2" w:space="0" w:color="CCCCCC"/>
@@ -2607,7 +2607,7 @@
         </w:tc>
         <w:tc>
           <w:tcPr>
-            <w:tcW w:w="7359" w:type="dxa"/>
+            <w:tcW w:w="7360" w:type="dxa"/>
             <w:tcBorders>
               <w:top w:val="single" w:sz="2" w:space="0" w:color="CCCCCC"/>
               <w:start w:val="single" w:sz="2" w:space="0" w:color="CCCCCC"/>
@@ -2694,7 +2694,7 @@
       </w:pPr>
       <w:r>
         <w:rPr>
-          <w:rFonts w:eastAsia="Arial" w:cs="Arial" w:ascii="Arial" w:hAnsi="Arial"/>
+          <w:rFonts w:eastAsia="Arial" w:cs="Arial"/>
           <w:b/>
           <w:bCs/>
           <w:color w:val="2E75B6"/>
@@ -2713,11 +2713,11 @@
       <w:r>
         <w:rPr>
           <w:rFonts w:eastAsia="Arial" w:cs="Arial"/>
+          <w:color w:val="1F1F1F"/>
           <w:sz w:val="22"/>
           <w:szCs w:val="22"/>
-          <w:color w:val="1F1F1F"/>
-        </w:rPr>
-        <w:t xml:space="preserve">Integer literals are normally written as signed decimal. Two prefix characters allow hexadecimal and unsigned decimal input. All values are stored as signed 16-bit integers regardless of how they are written.</w:t>
+        </w:rPr>
+        <w:t>Integer literals are normally written as signed decimal. Two prefix characters allow hexadecimal and unsigned decimal input. All values are stored as 16-bit quantities and interpreted as signed by default.</w:t>
       </w:r>
     </w:p>
     <w:tbl>
@@ -2909,7 +2909,7 @@
                 <w:sz w:val="20"/>
                 <w:szCs w:val="20"/>
               </w:rPr>
-              <w:t xml:space="preserve">#FF   #1A2B   A = #8000</w:t>
+              <w:t>#FF   #1A2B   A = #8000</w:t>
             </w:r>
           </w:p>
         </w:tc>
@@ -2993,7 +2993,7 @@
                 <w:sz w:val="20"/>
                 <w:szCs w:val="20"/>
               </w:rPr>
-              <w:t xml:space="preserve">@65535   @32768   P = @65535</w:t>
+              <w:t>@65535   @32768   P = @65535</w:t>
             </w:r>
           </w:p>
         </w:tc>
@@ -3008,11 +3008,11 @@
       <w:r>
         <w:rPr>
           <w:rFonts w:eastAsia="Arial" w:cs="Arial"/>
+          <w:color w:val="1F1F1F"/>
           <w:sz w:val="22"/>
           <w:szCs w:val="22"/>
-          <w:color w:val="1F1F1F"/>
-        </w:rPr>
-        <w:t xml:space="preserve">Prefixed literals are valid anywhere a numeric value is expected: assignment, arithmetic expressions, PRINT, IF conditions, and function arguments. There is no binary prefix; use hexadecimal for bit patterns (e.g. #0F instead of %00001111).</w:t>
+        </w:rPr>
+        <w:t>Prefixed literals are valid anywhere a numeric value is expected: assignment, arithmetic expressions, PRINT, IF conditions, and function arguments. There is no binary prefix; use hexadecimal for bit patterns (e.g. #0F instead of %00001111).</w:t>
       </w:r>
     </w:p>
     <w:p>
@@ -3033,7 +3033,7 @@
       </w:pPr>
       <w:r>
         <w:rPr>
-          <w:rFonts w:eastAsia="Arial" w:cs="Arial" w:ascii="Arial" w:hAnsi="Arial"/>
+          <w:rFonts w:eastAsia="Arial" w:cs="Arial"/>
           <w:b/>
           <w:bCs/>
           <w:color w:val="2E75B6"/>
@@ -3202,7 +3202,11 @@
         <w:pStyle w:val="Normal"/>
         <w:spacing w:before="40" w:after="40"/>
         <w:ind w:start="720"/>
-        <w:rPr/>
+        <w:rPr>
+          <w:rFonts w:ascii="Courier New" w:hAnsi="Courier New" w:cs="Courier New"/>
+          <w:sz w:val="20"/>
+          <w:szCs w:val="20"/>
+        </w:rPr>
       </w:pPr>
       <w:r>
         <w:rPr>
@@ -3212,37 +3216,24 @@
         </w:rPr>
         <w:t>IF ((A + B) = C) + D THEN 100</w:t>
       </w:r>
-      <w:r>
-        <w:br w:type="page"/>
-      </w:r>
-    </w:p>
-    <w:p>
-      <w:pPr>
-        <w:pStyle w:val="Normal"/>
-        <w:spacing w:before="40" w:after="40"/>
-        <w:ind w:start="720"/>
-        <w:rPr>
-          <w:rFonts w:ascii="Courier New" w:hAnsi="Courier New" w:cs="Courier New"/>
-          <w:sz w:val="20"/>
-          <w:szCs w:val="20"/>
-        </w:rPr>
-      </w:pPr>
-      <w:r>
-        <w:rPr/>
-      </w:r>
-    </w:p>
-    <w:p>
-      <w:pPr>
-        <w:pStyle w:val="Normal"/>
-        <w:spacing w:before="60" w:after="60"/>
-        <w:rPr/>
-      </w:pPr>
-      <w:r>
+    </w:p>
+    <w:p>
+      <w:pPr>
+        <w:pStyle w:val="Normal"/>
+        <w:spacing w:before="40" w:after="40"/>
+        <w:ind w:start="720"/>
         <w:rPr>
           <w:rFonts w:eastAsia="Arial" w:cs="Arial"/>
           <w:sz w:val="22"/>
           <w:szCs w:val="22"/>
         </w:rPr>
+      </w:pPr>
+      <w:r>
+        <w:rPr>
+          <w:rFonts w:eastAsia="Arial" w:cs="Arial"/>
+          <w:sz w:val="22"/>
+          <w:szCs w:val="22"/>
+        </w:rPr>
         <w:t>which compares A+B to C, then adds D to the result. The correct way to write it is:</w:t>
       </w:r>
     </w:p>
@@ -3251,7 +3242,11 @@
         <w:pStyle w:val="Normal"/>
         <w:spacing w:before="40" w:after="40"/>
         <w:ind w:start="720"/>
-        <w:rPr/>
+        <w:rPr>
+          <w:rFonts w:ascii="Courier New" w:hAnsi="Courier New" w:cs="Courier New"/>
+          <w:sz w:val="20"/>
+          <w:szCs w:val="20"/>
+        </w:rPr>
       </w:pPr>
       <w:r>
         <w:rPr>
@@ -3260,6 +3255,25 @@
           <w:szCs w:val="20"/>
         </w:rPr>
         <w:t>IF (A + B) = (C + D) THEN 100</w:t>
+      </w:r>
+    </w:p>
+    <w:p>
+      <w:pPr>
+        <w:pStyle w:val="Normal"/>
+        <w:spacing w:before="40" w:after="40"/>
+        <w:ind w:start="720"/>
+        <w:rPr>
+          <w:rFonts w:ascii="Courier New" w:hAnsi="Courier New" w:cs="Courier New"/>
+          <w:sz w:val="20"/>
+          <w:szCs w:val="20"/>
+        </w:rPr>
+      </w:pPr>
+      <w:r>
+        <w:rPr>
+          <w:rFonts w:cs="Courier New" w:ascii="Courier New" w:hAnsi="Courier New"/>
+          <w:sz w:val="20"/>
+          <w:szCs w:val="20"/>
+        </w:rPr>
       </w:r>
     </w:p>
     <w:p>
@@ -3344,7 +3358,11 @@
         </w:rPr>
       </w:pPr>
       <w:r>
-        <w:rPr/>
+        <w:rPr>
+          <w:rFonts w:eastAsia="Arial" w:cs="Arial"/>
+          <w:sz w:val="22"/>
+          <w:szCs w:val="22"/>
+        </w:rPr>
       </w:r>
     </w:p>
     <w:p>
@@ -3499,7 +3517,7 @@
       </w:pPr>
       <w:r>
         <w:rPr>
-          <w:rFonts w:eastAsia="Arial" w:cs="Arial" w:ascii="Arial" w:hAnsi="Arial"/>
+          <w:rFonts w:eastAsia="Arial" w:cs="Arial"/>
           <w:b/>
           <w:bCs/>
           <w:color w:val="2E75B6"/>
@@ -3567,6 +3585,9 @@
       <w:r>
         <w:rPr/>
       </w:r>
+      <w:r>
+        <w:br w:type="page"/>
+      </w:r>
     </w:p>
     <w:p>
       <w:pPr>
@@ -3576,7 +3597,7 @@
       </w:pPr>
       <w:r>
         <w:rPr>
-          <w:rFonts w:eastAsia="Arial" w:cs="Arial" w:ascii="Arial" w:hAnsi="Arial"/>
+          <w:rFonts w:eastAsia="Arial" w:cs="Arial"/>
           <w:b/>
           <w:bCs/>
           <w:color w:val="2E75B6"/>
@@ -3601,7 +3622,7 @@
       </w:tblPr>
       <w:tblGrid>
         <w:gridCol w:w="2799"/>
-        <w:gridCol w:w="6560"/>
+        <w:gridCol w:w="6561"/>
       </w:tblGrid>
       <w:tr>
         <w:trPr>
@@ -3638,7 +3659,7 @@
         </w:tc>
         <w:tc>
           <w:tcPr>
-            <w:tcW w:w="6560" w:type="dxa"/>
+            <w:tcW w:w="6561" w:type="dxa"/>
             <w:tcBorders>
               <w:top w:val="single" w:sz="2" w:space="0" w:color="CCCCCC"/>
               <w:start w:val="single" w:sz="2" w:space="0" w:color="CCCCCC"/>
@@ -3697,7 +3718,7 @@
         </w:tc>
         <w:tc>
           <w:tcPr>
-            <w:tcW w:w="6560" w:type="dxa"/>
+            <w:tcW w:w="6561" w:type="dxa"/>
             <w:tcBorders>
               <w:top w:val="single" w:sz="2" w:space="0" w:color="CCCCCC"/>
               <w:start w:val="single" w:sz="2" w:space="0" w:color="CCCCCC"/>
@@ -3754,7 +3775,7 @@
         </w:tc>
         <w:tc>
           <w:tcPr>
-            <w:tcW w:w="6560" w:type="dxa"/>
+            <w:tcW w:w="6561" w:type="dxa"/>
             <w:tcBorders>
               <w:top w:val="single" w:sz="2" w:space="0" w:color="CCCCCC"/>
               <w:start w:val="single" w:sz="2" w:space="0" w:color="CCCCCC"/>
@@ -3811,7 +3832,7 @@
         </w:tc>
         <w:tc>
           <w:tcPr>
-            <w:tcW w:w="6560" w:type="dxa"/>
+            <w:tcW w:w="6561" w:type="dxa"/>
             <w:tcBorders>
               <w:top w:val="single" w:sz="2" w:space="0" w:color="CCCCCC"/>
               <w:start w:val="single" w:sz="2" w:space="0" w:color="CCCCCC"/>
@@ -3868,7 +3889,7 @@
         </w:tc>
         <w:tc>
           <w:tcPr>
-            <w:tcW w:w="6560" w:type="dxa"/>
+            <w:tcW w:w="6561" w:type="dxa"/>
             <w:tcBorders>
               <w:top w:val="single" w:sz="2" w:space="0" w:color="CCCCCC"/>
               <w:start w:val="single" w:sz="2" w:space="0" w:color="CCCCCC"/>
@@ -3925,7 +3946,7 @@
         </w:tc>
         <w:tc>
           <w:tcPr>
-            <w:tcW w:w="6560" w:type="dxa"/>
+            <w:tcW w:w="6561" w:type="dxa"/>
             <w:tcBorders>
               <w:top w:val="single" w:sz="2" w:space="0" w:color="CCCCCC"/>
               <w:start w:val="single" w:sz="2" w:space="0" w:color="CCCCCC"/>
@@ -3982,7 +4003,7 @@
         </w:tc>
         <w:tc>
           <w:tcPr>
-            <w:tcW w:w="6560" w:type="dxa"/>
+            <w:tcW w:w="6561" w:type="dxa"/>
             <w:tcBorders>
               <w:top w:val="single" w:sz="2" w:space="0" w:color="CCCCCC"/>
               <w:start w:val="single" w:sz="2" w:space="0" w:color="CCCCCC"/>
@@ -4008,6 +4029,120 @@
           </w:p>
         </w:tc>
       </w:tr>
+      <w:tr>
+        <w:trPr/>
+        <w:tc>
+          <w:tcPr>
+            <w:tcW w:w="2799" w:type="dxa"/>
+            <w:tcBorders>
+              <w:top w:val="single" w:sz="2" w:space="0" w:color="CCCCCC"/>
+              <w:start w:val="single" w:sz="2" w:space="0" w:color="CCCCCC"/>
+              <w:bottom w:val="single" w:sz="2" w:space="0" w:color="CCCCCC"/>
+              <w:end w:val="single" w:sz="2" w:space="0" w:color="CCCCCC"/>
+            </w:tcBorders>
+            <w:shd w:fill="F5F5F5" w:val="clear"/>
+          </w:tcPr>
+          <w:p>
+            <w:pPr>
+              <w:pStyle w:val="Normal"/>
+              <w:rPr/>
+            </w:pPr>
+            <w:r>
+              <w:rPr>
+                <w:rFonts w:eastAsia="Courier New" w:cs="Courier New" w:ascii="Courier New" w:hAnsi="Courier New"/>
+                <w:color w:val="1F1F1F"/>
+                <w:sz w:val="20"/>
+                <w:szCs w:val="20"/>
+              </w:rPr>
+              <w:t>UGT(a, b)</w:t>
+            </w:r>
+          </w:p>
+        </w:tc>
+        <w:tc>
+          <w:tcPr>
+            <w:tcW w:w="6561" w:type="dxa"/>
+            <w:tcBorders>
+              <w:top w:val="single" w:sz="2" w:space="0" w:color="CCCCCC"/>
+              <w:start w:val="single" w:sz="2" w:space="0" w:color="CCCCCC"/>
+              <w:bottom w:val="single" w:sz="2" w:space="0" w:color="CCCCCC"/>
+              <w:end w:val="single" w:sz="2" w:space="0" w:color="CCCCCC"/>
+            </w:tcBorders>
+            <w:shd w:fill="FFFFFF" w:val="clear"/>
+          </w:tcPr>
+          <w:p>
+            <w:pPr>
+              <w:pStyle w:val="Normal"/>
+              <w:rPr/>
+            </w:pPr>
+            <w:r>
+              <w:rPr>
+                <w:rFonts w:eastAsia="Arial" w:cs="Arial"/>
+                <w:color w:val="404040"/>
+                <w:sz w:val="20"/>
+                <w:szCs w:val="20"/>
+              </w:rPr>
+              <w:t>Unsigned greater-than. Returns 1 if a &gt; b treating both as unsigned 16-bit, 0 otherwise. Use instead of &gt; when values may exceed 32767.</w:t>
+            </w:r>
+          </w:p>
+        </w:tc>
+      </w:tr>
+      <w:tr>
+        <w:trPr/>
+        <w:tc>
+          <w:tcPr>
+            <w:tcW w:w="2799" w:type="dxa"/>
+            <w:tcBorders>
+              <w:top w:val="single" w:sz="2" w:space="0" w:color="CCCCCC"/>
+              <w:start w:val="single" w:sz="2" w:space="0" w:color="CCCCCC"/>
+              <w:bottom w:val="single" w:sz="2" w:space="0" w:color="CCCCCC"/>
+              <w:end w:val="single" w:sz="2" w:space="0" w:color="CCCCCC"/>
+            </w:tcBorders>
+            <w:shd w:fill="F5F5F5" w:val="clear"/>
+          </w:tcPr>
+          <w:p>
+            <w:pPr>
+              <w:pStyle w:val="Normal"/>
+              <w:rPr/>
+            </w:pPr>
+            <w:r>
+              <w:rPr>
+                <w:rFonts w:eastAsia="Courier New" w:cs="Courier New" w:ascii="Courier New" w:hAnsi="Courier New"/>
+                <w:color w:val="1F1F1F"/>
+                <w:sz w:val="20"/>
+                <w:szCs w:val="20"/>
+              </w:rPr>
+              <w:t>ULT(a, b)</w:t>
+            </w:r>
+          </w:p>
+        </w:tc>
+        <w:tc>
+          <w:tcPr>
+            <w:tcW w:w="6561" w:type="dxa"/>
+            <w:tcBorders>
+              <w:top w:val="single" w:sz="2" w:space="0" w:color="CCCCCC"/>
+              <w:start w:val="single" w:sz="2" w:space="0" w:color="CCCCCC"/>
+              <w:bottom w:val="single" w:sz="2" w:space="0" w:color="CCCCCC"/>
+              <w:end w:val="single" w:sz="2" w:space="0" w:color="CCCCCC"/>
+            </w:tcBorders>
+            <w:shd w:fill="FFFFFF" w:val="clear"/>
+          </w:tcPr>
+          <w:p>
+            <w:pPr>
+              <w:pStyle w:val="Normal"/>
+              <w:rPr/>
+            </w:pPr>
+            <w:r>
+              <w:rPr>
+                <w:rFonts w:eastAsia="Arial" w:cs="Arial"/>
+                <w:color w:val="404040"/>
+                <w:sz w:val="20"/>
+                <w:szCs w:val="20"/>
+              </w:rPr>
+              <w:t>Unsigned less-than. Returns 1 if a &lt; b treating both as unsigned 16-bit, 0 otherwise. Use instead of &lt; when values may exceed 32767.</w:t>
+            </w:r>
+          </w:p>
+        </w:tc>
+      </w:tr>
     </w:tbl>
     <w:p>
       <w:pPr>
@@ -4027,7 +4162,7 @@
       </w:pPr>
       <w:r>
         <w:rPr>
-          <w:rFonts w:eastAsia="Arial" w:cs="Arial" w:ascii="Arial" w:hAnsi="Arial"/>
+          <w:rFonts w:eastAsia="Arial" w:cs="Arial"/>
           <w:b/>
           <w:bCs/>
           <w:color w:val="2E75B6"/>
@@ -4052,7 +4187,7 @@
       </w:tblPr>
       <w:tblGrid>
         <w:gridCol w:w="2799"/>
-        <w:gridCol w:w="6560"/>
+        <w:gridCol w:w="6561"/>
       </w:tblGrid>
       <w:tr>
         <w:trPr>
@@ -4089,7 +4224,7 @@
         </w:tc>
         <w:tc>
           <w:tcPr>
-            <w:tcW w:w="6560" w:type="dxa"/>
+            <w:tcW w:w="6561" w:type="dxa"/>
             <w:tcBorders>
               <w:top w:val="single" w:sz="2" w:space="0" w:color="CCCCCC"/>
               <w:start w:val="single" w:sz="2" w:space="0" w:color="CCCCCC"/>
@@ -4148,7 +4283,7 @@
         </w:tc>
         <w:tc>
           <w:tcPr>
-            <w:tcW w:w="6560" w:type="dxa"/>
+            <w:tcW w:w="6561" w:type="dxa"/>
             <w:tcBorders>
               <w:top w:val="single" w:sz="2" w:space="0" w:color="CCCCCC"/>
               <w:start w:val="single" w:sz="2" w:space="0" w:color="CCCCCC"/>
@@ -4205,7 +4340,7 @@
         </w:tc>
         <w:tc>
           <w:tcPr>
-            <w:tcW w:w="6560" w:type="dxa"/>
+            <w:tcW w:w="6561" w:type="dxa"/>
             <w:tcBorders>
               <w:top w:val="single" w:sz="2" w:space="0" w:color="CCCCCC"/>
               <w:start w:val="single" w:sz="2" w:space="0" w:color="CCCCCC"/>
@@ -4262,7 +4397,7 @@
         </w:tc>
         <w:tc>
           <w:tcPr>
-            <w:tcW w:w="6560" w:type="dxa"/>
+            <w:tcW w:w="6561" w:type="dxa"/>
             <w:tcBorders>
               <w:top w:val="single" w:sz="2" w:space="0" w:color="CCCCCC"/>
               <w:start w:val="single" w:sz="2" w:space="0" w:color="CCCCCC"/>
@@ -4283,7 +4418,7 @@
                 <w:sz w:val="20"/>
                 <w:szCs w:val="20"/>
               </w:rPr>
-              <w:t xml:space="preserve">Convert number n to uppercase hexadecimal string (e.g. FF, 1A2B). Treats n as unsigned 16-bit.</w:t>
+              <w:t>Convert number n to uppercase hexadecimal string (e.g. FF, 1A2B). Treats n as unsigned 16-bit.</w:t>
             </w:r>
           </w:p>
         </w:tc>
@@ -4319,7 +4454,7 @@
         </w:tc>
         <w:tc>
           <w:tcPr>
-            <w:tcW w:w="6560" w:type="dxa"/>
+            <w:tcW w:w="6561" w:type="dxa"/>
             <w:tcBorders>
               <w:top w:val="single" w:sz="2" w:space="0" w:color="CCCCCC"/>
               <w:start w:val="single" w:sz="2" w:space="0" w:color="CCCCCC"/>
@@ -4340,7 +4475,7 @@
                 <w:sz w:val="20"/>
                 <w:szCs w:val="20"/>
               </w:rPr>
-              <w:t xml:space="preserve">Convert number n to unsigned decimal string (e.g. 65535). Treats n as unsigned 16-bit.</w:t>
+              <w:t>Convert number n to unsigned decimal string (e.g. 65535). Treats n as unsigned 16-bit.</w:t>
             </w:r>
           </w:p>
         </w:tc>
@@ -4393,7 +4528,7 @@
       </w:pPr>
       <w:r>
         <w:rPr>
-          <w:rFonts w:eastAsia="Arial" w:cs="Arial" w:ascii="Arial" w:hAnsi="Arial"/>
+          <w:rFonts w:eastAsia="Arial" w:cs="Arial"/>
           <w:b/>
           <w:bCs/>
           <w:color w:val="1F4E79"/>
@@ -4411,7 +4546,7 @@
       </w:pPr>
       <w:r>
         <w:rPr>
-          <w:rFonts w:eastAsia="Arial" w:cs="Arial" w:ascii="Arial" w:hAnsi="Arial"/>
+          <w:rFonts w:eastAsia="Arial" w:cs="Arial"/>
           <w:b/>
           <w:bCs/>
           <w:color w:val="2E75B6"/>
@@ -4471,7 +4606,7 @@
       </w:pPr>
       <w:r>
         <w:rPr>
-          <w:rFonts w:eastAsia="Arial" w:cs="Arial" w:ascii="Arial" w:hAnsi="Arial"/>
+          <w:rFonts w:eastAsia="Arial" w:cs="Arial"/>
           <w:b/>
           <w:bCs/>
           <w:color w:val="2E75B6"/>
@@ -4514,7 +4649,7 @@
       </w:pPr>
       <w:r>
         <w:rPr>
-          <w:rFonts w:eastAsia="Arial" w:cs="Arial" w:ascii="Arial" w:hAnsi="Arial"/>
+          <w:rFonts w:eastAsia="Arial" w:cs="Arial"/>
           <w:b/>
           <w:bCs/>
           <w:color w:val="2E75B6"/>
@@ -4574,7 +4709,7 @@
       </w:pPr>
       <w:r>
         <w:rPr>
-          <w:rFonts w:eastAsia="Arial" w:cs="Arial" w:ascii="Arial" w:hAnsi="Arial"/>
+          <w:rFonts w:eastAsia="Arial" w:cs="Arial"/>
           <w:b/>
           <w:bCs/>
           <w:color w:val="2E75B6"/>
@@ -4651,7 +4786,7 @@
       </w:pPr>
       <w:r>
         <w:rPr>
-          <w:rFonts w:eastAsia="Arial" w:cs="Arial" w:ascii="Arial" w:hAnsi="Arial"/>
+          <w:rFonts w:eastAsia="Arial" w:cs="Arial"/>
           <w:b/>
           <w:bCs/>
           <w:color w:val="2E75B6"/>
@@ -4711,7 +4846,7 @@
       </w:pPr>
       <w:r>
         <w:rPr>
-          <w:rFonts w:eastAsia="Arial" w:cs="Arial" w:ascii="Arial" w:hAnsi="Arial"/>
+          <w:rFonts w:eastAsia="Arial" w:cs="Arial"/>
           <w:b/>
           <w:bCs/>
           <w:color w:val="2E75B6"/>
@@ -4774,7 +4909,7 @@
       </w:pPr>
       <w:r>
         <w:rPr>
-          <w:rFonts w:eastAsia="Arial" w:cs="Arial" w:ascii="Arial" w:hAnsi="Arial"/>
+          <w:rFonts w:eastAsia="Arial" w:cs="Arial"/>
           <w:b/>
           <w:bCs/>
           <w:color w:val="2E75B6"/>
@@ -4851,7 +4986,7 @@
       </w:pPr>
       <w:r>
         <w:rPr>
-          <w:rFonts w:eastAsia="Arial" w:cs="Arial" w:ascii="Arial" w:hAnsi="Arial"/>
+          <w:rFonts w:eastAsia="Arial" w:cs="Arial"/>
           <w:b/>
           <w:bCs/>
           <w:color w:val="2E75B6"/>
@@ -4894,7 +5029,7 @@
       </w:pPr>
       <w:r>
         <w:rPr>
-          <w:rFonts w:eastAsia="Arial" w:cs="Arial" w:ascii="Arial" w:hAnsi="Arial"/>
+          <w:rFonts w:eastAsia="Arial" w:cs="Arial"/>
           <w:b/>
           <w:bCs/>
           <w:color w:val="2E75B6"/>
@@ -4937,7 +5072,7 @@
       </w:pPr>
       <w:r>
         <w:rPr>
-          <w:rFonts w:eastAsia="Arial" w:cs="Arial" w:ascii="Arial" w:hAnsi="Arial"/>
+          <w:rFonts w:eastAsia="Arial" w:cs="Arial"/>
           <w:b/>
           <w:bCs/>
           <w:color w:val="2E75B6"/>
@@ -4955,7 +5090,7 @@
       </w:pPr>
       <w:r>
         <w:rPr>
-          <w:rFonts w:eastAsia="Arial" w:cs="Arial" w:ascii="Arial" w:hAnsi="Arial"/>
+          <w:rFonts w:eastAsia="Arial" w:cs="Arial"/>
           <w:b/>
           <w:bCs/>
           <w:color w:val="404040"/>
@@ -5011,7 +5146,16 @@
           <w:sz w:val="20"/>
           <w:szCs w:val="20"/>
         </w:rPr>
-        <w:t xml:space="preserve">  PRINT I</w:t>
+        <w:t xml:space="preserve">  </w:t>
+      </w:r>
+      <w:r>
+        <w:rPr>
+          <w:rFonts w:eastAsia="Courier New" w:cs="Courier New" w:ascii="Courier New" w:hAnsi="Courier New"/>
+          <w:color w:val="1F1F1F"/>
+          <w:sz w:val="20"/>
+          <w:szCs w:val="20"/>
+        </w:rPr>
+        <w:t>PRINT I</w:t>
       </w:r>
     </w:p>
     <w:p>
@@ -5106,7 +5250,7 @@
       </w:pPr>
       <w:r>
         <w:rPr>
-          <w:rFonts w:eastAsia="Arial" w:cs="Arial" w:ascii="Arial" w:hAnsi="Arial"/>
+          <w:rFonts w:eastAsia="Arial" w:cs="Arial"/>
           <w:b/>
           <w:bCs/>
           <w:color w:val="2E75B6"/>
@@ -5124,7 +5268,7 @@
       </w:pPr>
       <w:r>
         <w:rPr>
-          <w:rFonts w:eastAsia="Arial" w:cs="Arial" w:ascii="Arial" w:hAnsi="Arial"/>
+          <w:rFonts w:eastAsia="Arial" w:cs="Arial"/>
           <w:b/>
           <w:bCs/>
           <w:color w:val="404040"/>
@@ -5255,7 +5399,7 @@
       </w:pPr>
       <w:r>
         <w:rPr>
-          <w:rFonts w:eastAsia="Arial" w:cs="Arial" w:ascii="Arial" w:hAnsi="Arial"/>
+          <w:rFonts w:eastAsia="Arial" w:cs="Arial"/>
           <w:b/>
           <w:bCs/>
           <w:color w:val="2E75B6"/>
@@ -5315,7 +5459,7 @@
       </w:pPr>
       <w:r>
         <w:rPr>
-          <w:rFonts w:eastAsia="Arial" w:cs="Arial" w:ascii="Arial" w:hAnsi="Arial"/>
+          <w:rFonts w:eastAsia="Arial" w:cs="Arial"/>
           <w:b/>
           <w:bCs/>
           <w:color w:val="2E75B6"/>
@@ -5427,7 +5571,7 @@
       </w:pPr>
       <w:r>
         <w:rPr>
-          <w:rFonts w:eastAsia="Arial" w:cs="Arial" w:ascii="Arial" w:hAnsi="Arial"/>
+          <w:rFonts w:eastAsia="Arial" w:cs="Arial"/>
           <w:b/>
           <w:bCs/>
           <w:color w:val="2E75B6"/>
@@ -5497,7 +5641,7 @@
       </w:pPr>
       <w:r>
         <w:rPr>
-          <w:rFonts w:eastAsia="Arial" w:cs="Arial" w:ascii="Arial" w:hAnsi="Arial"/>
+          <w:rFonts w:eastAsia="Arial" w:cs="Arial"/>
           <w:b/>
           <w:bCs/>
           <w:color w:val="2E75B6"/>
@@ -5515,7 +5659,7 @@
       </w:pPr>
       <w:r>
         <w:rPr>
-          <w:rFonts w:eastAsia="Arial" w:cs="Arial" w:ascii="Arial" w:hAnsi="Arial"/>
+          <w:rFonts w:eastAsia="Arial" w:cs="Arial"/>
           <w:b/>
           <w:bCs/>
           <w:color w:val="404040"/>
@@ -5609,7 +5753,7 @@
       </w:pPr>
       <w:r>
         <w:rPr>
-          <w:rFonts w:eastAsia="Arial" w:cs="Arial" w:ascii="Arial" w:hAnsi="Arial"/>
+          <w:rFonts w:eastAsia="Arial" w:cs="Arial"/>
           <w:b/>
           <w:bCs/>
           <w:color w:val="2E75B6"/>
@@ -5627,7 +5771,7 @@
       </w:pPr>
       <w:r>
         <w:rPr>
-          <w:rFonts w:eastAsia="Arial" w:cs="Arial" w:ascii="Arial" w:hAnsi="Arial"/>
+          <w:rFonts w:eastAsia="Arial" w:cs="Arial"/>
           <w:b/>
           <w:bCs/>
           <w:color w:val="404040"/>
@@ -5738,7 +5882,7 @@
       </w:pPr>
       <w:r>
         <w:rPr>
-          <w:rFonts w:eastAsia="Arial" w:cs="Arial" w:ascii="Arial" w:hAnsi="Arial"/>
+          <w:rFonts w:eastAsia="Arial" w:cs="Arial"/>
           <w:b/>
           <w:bCs/>
           <w:color w:val="2E75B6"/>
@@ -5798,7 +5942,7 @@
       </w:pPr>
       <w:r>
         <w:rPr>
-          <w:rFonts w:eastAsia="Arial" w:cs="Arial" w:ascii="Arial" w:hAnsi="Arial"/>
+          <w:rFonts w:eastAsia="Arial" w:cs="Arial"/>
           <w:b/>
           <w:bCs/>
           <w:color w:val="2E75B6"/>
@@ -5841,7 +5985,7 @@
       </w:pPr>
       <w:r>
         <w:rPr>
-          <w:rFonts w:eastAsia="Arial" w:cs="Arial" w:ascii="Arial" w:hAnsi="Arial"/>
+          <w:rFonts w:eastAsia="Arial" w:cs="Arial"/>
           <w:b/>
           <w:bCs/>
           <w:color w:val="2E75B6"/>
@@ -5918,7 +6062,7 @@
       </w:pPr>
       <w:r>
         <w:rPr>
-          <w:rFonts w:eastAsia="Arial" w:cs="Arial" w:ascii="Arial" w:hAnsi="Arial"/>
+          <w:rFonts w:eastAsia="Arial" w:cs="Arial"/>
           <w:b/>
           <w:bCs/>
           <w:color w:val="2E75B6"/>
@@ -5995,7 +6139,7 @@
       </w:pPr>
       <w:r>
         <w:rPr>
-          <w:rFonts w:eastAsia="Arial" w:cs="Arial" w:ascii="Arial" w:hAnsi="Arial"/>
+          <w:rFonts w:eastAsia="Arial" w:cs="Arial"/>
           <w:b/>
           <w:bCs/>
           <w:color w:val="2E75B6"/>
@@ -6055,14 +6199,14 @@
       </w:pPr>
       <w:r>
         <w:rPr>
-          <w:rFonts w:eastAsia="Arial" w:cs="Arial" w:ascii="Arial" w:hAnsi="Arial"/>
+          <w:rFonts w:eastAsia="Arial" w:cs="Arial"/>
           <w:b/>
           <w:bCs/>
           <w:color w:val="2E75B6"/>
           <w:sz w:val="26"/>
           <w:szCs w:val="26"/>
         </w:rPr>
-        <w:t>PRINT [expr [, expr ...]]</w:t>
+        <w:t>PRINT [expr [; expr ...] [, expr ...]]</w:t>
       </w:r>
     </w:p>
     <w:p>
@@ -6073,7 +6217,7 @@
       </w:pPr>
       <w:r>
         <w:rPr>
-          <w:rFonts w:eastAsia="Arial" w:cs="Arial" w:ascii="Arial" w:hAnsi="Arial"/>
+          <w:rFonts w:eastAsia="Arial" w:cs="Arial"/>
           <w:b/>
           <w:bCs/>
           <w:color w:val="404040"/>
@@ -6095,7 +6239,7 @@
           <w:sz w:val="22"/>
           <w:szCs w:val="22"/>
         </w:rPr>
-        <w:t>Print values to the console or to a file. Numeric values are preceded by a space. A trailing comma suppresses the newline, so the next PRINT continues on the same line. PRINT with no arguments prints a blank line.</w:t>
+        <w:t>Print values to the console or to a file. Numeric values are preceded by a space. Items may be separated by commas or semicolons. A semicolon suppresses the space before the next item. Neither comma nor semicolon implements print zones. A trailing comma or semicolon suppresses the newline, so the next PRINT continues on the same line. PRINT with no arguments prints a blank line.</w:t>
       </w:r>
     </w:p>
     <w:p>
@@ -6170,7 +6314,7 @@
       </w:pPr>
       <w:r>
         <w:rPr>
-          <w:rFonts w:eastAsia="Arial" w:cs="Arial" w:ascii="Arial" w:hAnsi="Arial"/>
+          <w:rFonts w:eastAsia="Arial" w:cs="Arial"/>
           <w:b/>
           <w:bCs/>
           <w:color w:val="2E75B6"/>
@@ -6247,7 +6391,7 @@
       </w:pPr>
       <w:r>
         <w:rPr>
-          <w:rFonts w:eastAsia="Arial" w:cs="Arial" w:ascii="Arial" w:hAnsi="Arial"/>
+          <w:rFonts w:eastAsia="Arial" w:cs="Arial"/>
           <w:b/>
           <w:bCs/>
           <w:color w:val="2E75B6"/>
@@ -6307,7 +6451,7 @@
       </w:pPr>
       <w:r>
         <w:rPr>
-          <w:rFonts w:eastAsia="Arial" w:cs="Arial" w:ascii="Arial" w:hAnsi="Arial"/>
+          <w:rFonts w:eastAsia="Arial" w:cs="Arial"/>
           <w:b/>
           <w:bCs/>
           <w:color w:val="2E75B6"/>
@@ -6384,7 +6528,7 @@
       </w:pPr>
       <w:r>
         <w:rPr>
-          <w:rFonts w:eastAsia="Arial" w:cs="Arial" w:ascii="Arial" w:hAnsi="Arial"/>
+          <w:rFonts w:eastAsia="Arial" w:cs="Arial"/>
           <w:b/>
           <w:bCs/>
           <w:color w:val="2E75B6"/>
@@ -6444,7 +6588,7 @@
       </w:pPr>
       <w:r>
         <w:rPr>
-          <w:rFonts w:eastAsia="Arial" w:cs="Arial" w:ascii="Arial" w:hAnsi="Arial"/>
+          <w:rFonts w:eastAsia="Arial" w:cs="Arial"/>
           <w:b/>
           <w:bCs/>
           <w:color w:val="2E75B6"/>
@@ -6516,7 +6660,7 @@
       </w:pPr>
       <w:r>
         <w:rPr>
-          <w:rFonts w:eastAsia="Arial" w:cs="Arial" w:ascii="Arial" w:hAnsi="Arial"/>
+          <w:rFonts w:eastAsia="Arial" w:cs="Arial"/>
           <w:b/>
           <w:bCs/>
           <w:color w:val="1F4E79"/>
@@ -6775,7 +6919,7 @@
       </w:pPr>
       <w:r>
         <w:rPr>
-          <w:rFonts w:eastAsia="Arial" w:cs="Arial" w:ascii="Arial" w:hAnsi="Arial"/>
+          <w:rFonts w:eastAsia="Arial" w:cs="Arial"/>
           <w:b/>
           <w:bCs/>
           <w:color w:val="1F4E79"/>
@@ -7067,7 +7211,7 @@
       </w:pPr>
       <w:r>
         <w:rPr>
-          <w:rFonts w:eastAsia="Arial" w:cs="Arial" w:ascii="Arial" w:hAnsi="Arial"/>
+          <w:rFonts w:eastAsia="Arial" w:cs="Arial"/>
           <w:b/>
           <w:bCs/>
           <w:color w:val="1F4E79"/>
@@ -7085,7 +7229,7 @@
       </w:pPr>
       <w:r>
         <w:rPr>
-          <w:rFonts w:eastAsia="Arial" w:cs="Arial" w:ascii="Arial" w:hAnsi="Arial"/>
+          <w:rFonts w:eastAsia="Arial" w:cs="Arial"/>
           <w:b/>
           <w:bCs/>
           <w:color w:val="2E75B6"/>
@@ -7196,7 +7340,7 @@
       </w:pPr>
       <w:r>
         <w:rPr>
-          <w:rFonts w:eastAsia="Arial" w:cs="Arial" w:ascii="Arial" w:hAnsi="Arial"/>
+          <w:rFonts w:eastAsia="Arial" w:cs="Arial"/>
           <w:b/>
           <w:bCs/>
           <w:color w:val="2E75B6"/>
@@ -7239,7 +7383,7 @@
       </w:pPr>
       <w:r>
         <w:rPr>
-          <w:rFonts w:eastAsia="Arial" w:cs="Arial" w:ascii="Arial" w:hAnsi="Arial"/>
+          <w:rFonts w:eastAsia="Arial" w:cs="Arial"/>
           <w:b/>
           <w:bCs/>
           <w:color w:val="2E75B6"/>
@@ -7375,7 +7519,7 @@
       </w:pPr>
       <w:r>
         <w:rPr>
-          <w:rFonts w:eastAsia="Arial" w:cs="Arial" w:ascii="Arial" w:hAnsi="Arial"/>
+          <w:rFonts w:eastAsia="Arial" w:cs="Arial"/>
           <w:b/>
           <w:bCs/>
           <w:color w:val="1F4E79"/>
@@ -7400,7 +7544,7 @@
       </w:tblPr>
       <w:tblGrid>
         <w:gridCol w:w="2998"/>
-        <w:gridCol w:w="6361"/>
+        <w:gridCol w:w="6362"/>
       </w:tblGrid>
       <w:tr>
         <w:trPr>
@@ -7437,7 +7581,7 @@
         </w:tc>
         <w:tc>
           <w:tcPr>
-            <w:tcW w:w="6361" w:type="dxa"/>
+            <w:tcW w:w="6362" w:type="dxa"/>
             <w:tcBorders>
               <w:top w:val="single" w:sz="2" w:space="0" w:color="CCCCCC"/>
               <w:start w:val="single" w:sz="2" w:space="0" w:color="CCCCCC"/>
@@ -7496,7 +7640,7 @@
         </w:tc>
         <w:tc>
           <w:tcPr>
-            <w:tcW w:w="6361" w:type="dxa"/>
+            <w:tcW w:w="6362" w:type="dxa"/>
             <w:tcBorders>
               <w:top w:val="single" w:sz="2" w:space="0" w:color="CCCCCC"/>
               <w:start w:val="single" w:sz="2" w:space="0" w:color="CCCCCC"/>
@@ -7553,7 +7697,7 @@
         </w:tc>
         <w:tc>
           <w:tcPr>
-            <w:tcW w:w="6361" w:type="dxa"/>
+            <w:tcW w:w="6362" w:type="dxa"/>
             <w:tcBorders>
               <w:top w:val="single" w:sz="2" w:space="0" w:color="CCCCCC"/>
               <w:start w:val="single" w:sz="2" w:space="0" w:color="CCCCCC"/>
@@ -7610,7 +7754,7 @@
         </w:tc>
         <w:tc>
           <w:tcPr>
-            <w:tcW w:w="6361" w:type="dxa"/>
+            <w:tcW w:w="6362" w:type="dxa"/>
             <w:tcBorders>
               <w:top w:val="single" w:sz="2" w:space="0" w:color="CCCCCC"/>
               <w:start w:val="single" w:sz="2" w:space="0" w:color="CCCCCC"/>
@@ -7667,7 +7811,7 @@
         </w:tc>
         <w:tc>
           <w:tcPr>
-            <w:tcW w:w="6361" w:type="dxa"/>
+            <w:tcW w:w="6362" w:type="dxa"/>
             <w:tcBorders>
               <w:top w:val="single" w:sz="2" w:space="0" w:color="CCCCCC"/>
               <w:start w:val="single" w:sz="2" w:space="0" w:color="CCCCCC"/>
@@ -7724,7 +7868,7 @@
         </w:tc>
         <w:tc>
           <w:tcPr>
-            <w:tcW w:w="6361" w:type="dxa"/>
+            <w:tcW w:w="6362" w:type="dxa"/>
             <w:tcBorders>
               <w:top w:val="single" w:sz="2" w:space="0" w:color="CCCCCC"/>
               <w:start w:val="single" w:sz="2" w:space="0" w:color="CCCCCC"/>
@@ -7781,7 +7925,7 @@
         </w:tc>
         <w:tc>
           <w:tcPr>
-            <w:tcW w:w="6361" w:type="dxa"/>
+            <w:tcW w:w="6362" w:type="dxa"/>
             <w:tcBorders>
               <w:top w:val="single" w:sz="2" w:space="0" w:color="CCCCCC"/>
               <w:start w:val="single" w:sz="2" w:space="0" w:color="CCCCCC"/>
@@ -7838,7 +7982,7 @@
         </w:tc>
         <w:tc>
           <w:tcPr>
-            <w:tcW w:w="6361" w:type="dxa"/>
+            <w:tcW w:w="6362" w:type="dxa"/>
             <w:tcBorders>
               <w:top w:val="single" w:sz="2" w:space="0" w:color="CCCCCC"/>
               <w:start w:val="single" w:sz="2" w:space="0" w:color="CCCCCC"/>
@@ -7895,7 +8039,7 @@
         </w:tc>
         <w:tc>
           <w:tcPr>
-            <w:tcW w:w="6361" w:type="dxa"/>
+            <w:tcW w:w="6362" w:type="dxa"/>
             <w:tcBorders>
               <w:top w:val="single" w:sz="2" w:space="0" w:color="CCCCCC"/>
               <w:start w:val="single" w:sz="2" w:space="0" w:color="CCCCCC"/>
@@ -7952,7 +8096,7 @@
         </w:tc>
         <w:tc>
           <w:tcPr>
-            <w:tcW w:w="6361" w:type="dxa"/>
+            <w:tcW w:w="6362" w:type="dxa"/>
             <w:tcBorders>
               <w:top w:val="single" w:sz="2" w:space="0" w:color="CCCCCC"/>
               <w:start w:val="single" w:sz="2" w:space="0" w:color="CCCCCC"/>
@@ -8009,7 +8153,7 @@
         </w:tc>
         <w:tc>
           <w:tcPr>
-            <w:tcW w:w="6361" w:type="dxa"/>
+            <w:tcW w:w="6362" w:type="dxa"/>
             <w:tcBorders>
               <w:top w:val="single" w:sz="2" w:space="0" w:color="CCCCCC"/>
               <w:start w:val="single" w:sz="2" w:space="0" w:color="CCCCCC"/>
@@ -8066,7 +8210,7 @@
         </w:tc>
         <w:tc>
           <w:tcPr>
-            <w:tcW w:w="6361" w:type="dxa"/>
+            <w:tcW w:w="6362" w:type="dxa"/>
             <w:tcBorders>
               <w:top w:val="single" w:sz="2" w:space="0" w:color="CCCCCC"/>
               <w:start w:val="single" w:sz="2" w:space="0" w:color="CCCCCC"/>
@@ -8123,7 +8267,7 @@
         </w:tc>
         <w:tc>
           <w:tcPr>
-            <w:tcW w:w="6361" w:type="dxa"/>
+            <w:tcW w:w="6362" w:type="dxa"/>
             <w:tcBorders>
               <w:top w:val="single" w:sz="2" w:space="0" w:color="CCCCCC"/>
               <w:start w:val="single" w:sz="2" w:space="0" w:color="CCCCCC"/>
@@ -8180,7 +8324,7 @@
         </w:tc>
         <w:tc>
           <w:tcPr>
-            <w:tcW w:w="6361" w:type="dxa"/>
+            <w:tcW w:w="6362" w:type="dxa"/>
             <w:tcBorders>
               <w:top w:val="single" w:sz="2" w:space="0" w:color="CCCCCC"/>
               <w:start w:val="single" w:sz="2" w:space="0" w:color="CCCCCC"/>
@@ -8237,7 +8381,7 @@
         </w:tc>
         <w:tc>
           <w:tcPr>
-            <w:tcW w:w="6361" w:type="dxa"/>
+            <w:tcW w:w="6362" w:type="dxa"/>
             <w:tcBorders>
               <w:top w:val="single" w:sz="2" w:space="0" w:color="CCCCCC"/>
               <w:start w:val="single" w:sz="2" w:space="0" w:color="CCCCCC"/>
@@ -8311,7 +8455,7 @@
       </w:pPr>
       <w:r>
         <w:rPr>
-          <w:rFonts w:eastAsia="Arial" w:cs="Arial" w:ascii="Arial" w:hAnsi="Arial"/>
+          <w:rFonts w:eastAsia="Arial" w:cs="Arial"/>
           <w:b/>
           <w:bCs/>
           <w:color w:val="1F4E79"/>
@@ -8329,7 +8473,7 @@
       </w:pPr>
       <w:r>
         <w:rPr>
-          <w:rFonts w:eastAsia="Arial" w:cs="Arial" w:ascii="Arial" w:hAnsi="Arial"/>
+          <w:rFonts w:eastAsia="Arial" w:cs="Arial"/>
           <w:b/>
           <w:bCs/>
           <w:color w:val="2E75B6"/>
@@ -8354,7 +8498,7 @@
       </w:tblPr>
       <w:tblGrid>
         <w:gridCol w:w="2998"/>
-        <w:gridCol w:w="6361"/>
+        <w:gridCol w:w="6362"/>
       </w:tblGrid>
       <w:tr>
         <w:trPr>
@@ -8391,7 +8535,7 @@
         </w:tc>
         <w:tc>
           <w:tcPr>
-            <w:tcW w:w="6361" w:type="dxa"/>
+            <w:tcW w:w="6362" w:type="dxa"/>
             <w:tcBorders>
               <w:top w:val="single" w:sz="2" w:space="0" w:color="CCCCCC"/>
               <w:start w:val="single" w:sz="2" w:space="0" w:color="CCCCCC"/>
@@ -8450,7 +8594,7 @@
         </w:tc>
         <w:tc>
           <w:tcPr>
-            <w:tcW w:w="6361" w:type="dxa"/>
+            <w:tcW w:w="6362" w:type="dxa"/>
             <w:tcBorders>
               <w:top w:val="single" w:sz="2" w:space="0" w:color="CCCCCC"/>
               <w:start w:val="single" w:sz="2" w:space="0" w:color="CCCCCC"/>
@@ -8507,7 +8651,7 @@
         </w:tc>
         <w:tc>
           <w:tcPr>
-            <w:tcW w:w="6361" w:type="dxa"/>
+            <w:tcW w:w="6362" w:type="dxa"/>
             <w:tcBorders>
               <w:top w:val="single" w:sz="2" w:space="0" w:color="CCCCCC"/>
               <w:start w:val="single" w:sz="2" w:space="0" w:color="CCCCCC"/>
@@ -8564,7 +8708,7 @@
         </w:tc>
         <w:tc>
           <w:tcPr>
-            <w:tcW w:w="6361" w:type="dxa"/>
+            <w:tcW w:w="6362" w:type="dxa"/>
             <w:tcBorders>
               <w:top w:val="single" w:sz="2" w:space="0" w:color="CCCCCC"/>
               <w:start w:val="single" w:sz="2" w:space="0" w:color="CCCCCC"/>
@@ -8621,7 +8765,7 @@
         </w:tc>
         <w:tc>
           <w:tcPr>
-            <w:tcW w:w="6361" w:type="dxa"/>
+            <w:tcW w:w="6362" w:type="dxa"/>
             <w:tcBorders>
               <w:top w:val="single" w:sz="2" w:space="0" w:color="CCCCCC"/>
               <w:start w:val="single" w:sz="2" w:space="0" w:color="CCCCCC"/>
@@ -8678,7 +8822,7 @@
         </w:tc>
         <w:tc>
           <w:tcPr>
-            <w:tcW w:w="6361" w:type="dxa"/>
+            <w:tcW w:w="6362" w:type="dxa"/>
             <w:tcBorders>
               <w:top w:val="single" w:sz="2" w:space="0" w:color="CCCCCC"/>
               <w:start w:val="single" w:sz="2" w:space="0" w:color="CCCCCC"/>
@@ -8723,7 +8867,7 @@
       </w:pPr>
       <w:r>
         <w:rPr>
-          <w:rFonts w:eastAsia="Arial" w:cs="Arial" w:ascii="Arial" w:hAnsi="Arial"/>
+          <w:rFonts w:eastAsia="Arial" w:cs="Arial"/>
           <w:b/>
           <w:bCs/>
           <w:color w:val="2E75B6"/>
@@ -8790,7 +8934,7 @@
       </w:tblPr>
       <w:tblGrid>
         <w:gridCol w:w="2199"/>
-        <w:gridCol w:w="7160"/>
+        <w:gridCol w:w="7161"/>
       </w:tblGrid>
       <w:tr>
         <w:trPr>
@@ -8827,7 +8971,7 @@
         </w:tc>
         <w:tc>
           <w:tcPr>
-            <w:tcW w:w="7160" w:type="dxa"/>
+            <w:tcW w:w="7161" w:type="dxa"/>
             <w:tcBorders>
               <w:top w:val="single" w:sz="2" w:space="0" w:color="CCCCCC"/>
               <w:start w:val="single" w:sz="2" w:space="0" w:color="CCCCCC"/>
@@ -8886,7 +9030,7 @@
         </w:tc>
         <w:tc>
           <w:tcPr>
-            <w:tcW w:w="7160" w:type="dxa"/>
+            <w:tcW w:w="7161" w:type="dxa"/>
             <w:tcBorders>
               <w:top w:val="single" w:sz="2" w:space="0" w:color="CCCCCC"/>
               <w:start w:val="single" w:sz="2" w:space="0" w:color="CCCCCC"/>
@@ -8943,7 +9087,7 @@
         </w:tc>
         <w:tc>
           <w:tcPr>
-            <w:tcW w:w="7160" w:type="dxa"/>
+            <w:tcW w:w="7161" w:type="dxa"/>
             <w:tcBorders>
               <w:top w:val="single" w:sz="2" w:space="0" w:color="CCCCCC"/>
               <w:start w:val="single" w:sz="2" w:space="0" w:color="CCCCCC"/>
@@ -9000,7 +9144,7 @@
         </w:tc>
         <w:tc>
           <w:tcPr>
-            <w:tcW w:w="7160" w:type="dxa"/>
+            <w:tcW w:w="7161" w:type="dxa"/>
             <w:tcBorders>
               <w:top w:val="single" w:sz="2" w:space="0" w:color="CCCCCC"/>
               <w:start w:val="single" w:sz="2" w:space="0" w:color="CCCCCC"/>
@@ -9057,7 +9201,7 @@
         </w:tc>
         <w:tc>
           <w:tcPr>
-            <w:tcW w:w="7160" w:type="dxa"/>
+            <w:tcW w:w="7161" w:type="dxa"/>
             <w:tcBorders>
               <w:top w:val="single" w:sz="2" w:space="0" w:color="CCCCCC"/>
               <w:start w:val="single" w:sz="2" w:space="0" w:color="CCCCCC"/>
@@ -9114,7 +9258,7 @@
         </w:tc>
         <w:tc>
           <w:tcPr>
-            <w:tcW w:w="7160" w:type="dxa"/>
+            <w:tcW w:w="7161" w:type="dxa"/>
             <w:tcBorders>
               <w:top w:val="single" w:sz="2" w:space="0" w:color="CCCCCC"/>
               <w:start w:val="single" w:sz="2" w:space="0" w:color="CCCCCC"/>
@@ -9245,7 +9389,7 @@
       </w:pPr>
       <w:r>
         <w:rPr>
-          <w:rFonts w:eastAsia="Arial" w:cs="Arial" w:ascii="Arial" w:hAnsi="Arial"/>
+          <w:rFonts w:eastAsia="Arial" w:cs="Arial"/>
           <w:b/>
           <w:bCs/>
           <w:color w:val="1F4E79"/>
@@ -9263,7 +9407,7 @@
       </w:pPr>
       <w:r>
         <w:rPr>
-          <w:rFonts w:eastAsia="Arial" w:cs="Arial" w:ascii="Arial" w:hAnsi="Arial"/>
+          <w:rFonts w:eastAsia="Arial" w:cs="Arial"/>
           <w:b/>
           <w:bCs/>
           <w:color w:val="2E75B6"/>
@@ -9496,7 +9640,7 @@
       </w:pPr>
       <w:r>
         <w:rPr>
-          <w:rFonts w:eastAsia="Arial" w:cs="Arial" w:ascii="Arial" w:hAnsi="Arial"/>
+          <w:rFonts w:eastAsia="Arial" w:cs="Arial"/>
           <w:b/>
           <w:bCs/>
           <w:color w:val="2E75B6"/>
@@ -9745,7 +9889,7 @@
       </w:pPr>
       <w:r>
         <w:rPr>
-          <w:rFonts w:eastAsia="Arial" w:cs="Arial" w:ascii="Arial" w:hAnsi="Arial"/>
+          <w:rFonts w:eastAsia="Arial" w:cs="Arial"/>
           <w:b/>
           <w:bCs/>
           <w:color w:val="2E75B6"/>
@@ -9905,7 +10049,7 @@
       </w:pPr>
       <w:r>
         <w:rPr>
-          <w:rFonts w:eastAsia="Arial" w:cs="Arial" w:ascii="Arial" w:hAnsi="Arial"/>
+          <w:rFonts w:eastAsia="Arial" w:cs="Arial"/>
           <w:b/>
           <w:bCs/>
           <w:color w:val="1F4E79"/>
@@ -9972,7 +10116,7 @@
 </file>
 
 <file path=word/footer1.xml><?xml version="1.0" encoding="utf-8"?>
-<w:ftr xmlns:o="urn:schemas-microsoft-com:office:office" xmlns:r="http://schemas.openxmlformats.org/officeDocument/2006/relationships" xmlns:v="urn:schemas-microsoft-com:vml" xmlns:w="http://schemas.openxmlformats.org/wordprocessingml/2006/main" xmlns:w10="urn:schemas-microsoft-com:office:word" xmlns:wp="http://schemas.openxmlformats.org/drawingml/2006/wordprocessingDrawing" xmlns:wps="http://schemas.microsoft.com/office/word/2010/wordprocessingShape" xmlns:wpg="http://schemas.microsoft.com/office/word/2010/wordprocessingGroup" xmlns:mc="http://schemas.openxmlformats.org/markup-compatibility/2006" xmlns:wp14="http://schemas.microsoft.com/office/word/2010/wordprocessingDrawing" xmlns:w14="http://schemas.microsoft.com/office/word/2010/wordml" xmlns:w15="http://schemas.microsoft.com/office/word/2012/wordml" mc:Ignorable="w14 wp14 w15">
+<w:ftr xmlns:o="urn:schemas-microsoft-com:office:office" xmlns:r="http://schemas.openxmlformats.org/officeDocument/2006/relationships" xmlns:v="urn:schemas-microsoft-com:vml" xmlns:w="http://schemas.openxmlformats.org/wordprocessingml/2006/main" xmlns:w10="urn:schemas-microsoft-com:office:word" xmlns:wp="http://schemas.openxmlformats.org/drawingml/2006/wordprocessingDrawing" xmlns:pic="http://schemas.openxmlformats.org/drawingml/2006/picture" xmlns:wps="http://schemas.microsoft.com/office/word/2010/wordprocessingShape" xmlns:wpg="http://schemas.microsoft.com/office/word/2010/wordprocessingGroup" xmlns:mc="http://schemas.openxmlformats.org/markup-compatibility/2006" xmlns:wp14="http://schemas.microsoft.com/office/word/2010/wordprocessingDrawing" xmlns:w14="http://schemas.microsoft.com/office/word/2010/wordml" xmlns:w15="http://schemas.microsoft.com/office/word/2012/wordml" mc:Ignorable="w14 wp14 w15">
   <w:p>
     <w:pPr>
       <w:pStyle w:val="Footer"/>
@@ -9986,7 +10130,7 @@
 </file>
 
 <file path=word/footer2.xml><?xml version="1.0" encoding="utf-8"?>
-<w:ftr xmlns:o="urn:schemas-microsoft-com:office:office" xmlns:r="http://schemas.openxmlformats.org/officeDocument/2006/relationships" xmlns:v="urn:schemas-microsoft-com:vml" xmlns:w="http://schemas.openxmlformats.org/wordprocessingml/2006/main" xmlns:w10="urn:schemas-microsoft-com:office:word" xmlns:wp="http://schemas.openxmlformats.org/drawingml/2006/wordprocessingDrawing" xmlns:wps="http://schemas.microsoft.com/office/word/2010/wordprocessingShape" xmlns:wpg="http://schemas.microsoft.com/office/word/2010/wordprocessingGroup" xmlns:mc="http://schemas.openxmlformats.org/markup-compatibility/2006" xmlns:wp14="http://schemas.microsoft.com/office/word/2010/wordprocessingDrawing" xmlns:w14="http://schemas.microsoft.com/office/word/2010/wordml" xmlns:w15="http://schemas.microsoft.com/office/word/2012/wordml" mc:Ignorable="w14 wp14 w15">
+<w:ftr xmlns:o="urn:schemas-microsoft-com:office:office" xmlns:r="http://schemas.openxmlformats.org/officeDocument/2006/relationships" xmlns:v="urn:schemas-microsoft-com:vml" xmlns:w="http://schemas.openxmlformats.org/wordprocessingml/2006/main" xmlns:w10="urn:schemas-microsoft-com:office:word" xmlns:wp="http://schemas.openxmlformats.org/drawingml/2006/wordprocessingDrawing" xmlns:pic="http://schemas.openxmlformats.org/drawingml/2006/picture" xmlns:wps="http://schemas.microsoft.com/office/word/2010/wordprocessingShape" xmlns:wpg="http://schemas.microsoft.com/office/word/2010/wordprocessingGroup" xmlns:mc="http://schemas.openxmlformats.org/markup-compatibility/2006" xmlns:wp14="http://schemas.microsoft.com/office/word/2010/wordprocessingDrawing" xmlns:w14="http://schemas.microsoft.com/office/word/2010/wordml" xmlns:w15="http://schemas.microsoft.com/office/word/2012/wordml" mc:Ignorable="w14 wp14 w15">
   <w:p>
     <w:pPr>
       <w:pStyle w:val="Normal"/>
@@ -10016,7 +10160,7 @@
     </w:r>
     <w:r>
       <w:rPr/>
-      <w:t>1</w:t>
+      <w:t>18</w:t>
     </w:r>
     <w:r>
       <w:rPr/>
@@ -10027,7 +10171,7 @@
 </file>
 
 <file path=word/footer3.xml><?xml version="1.0" encoding="utf-8"?>
-<w:ftr xmlns:o="urn:schemas-microsoft-com:office:office" xmlns:r="http://schemas.openxmlformats.org/officeDocument/2006/relationships" xmlns:v="urn:schemas-microsoft-com:vml" xmlns:w="http://schemas.openxmlformats.org/wordprocessingml/2006/main" xmlns:w10="urn:schemas-microsoft-com:office:word" xmlns:wp="http://schemas.openxmlformats.org/drawingml/2006/wordprocessingDrawing" xmlns:wps="http://schemas.microsoft.com/office/word/2010/wordprocessingShape" xmlns:wpg="http://schemas.microsoft.com/office/word/2010/wordprocessingGroup" xmlns:mc="http://schemas.openxmlformats.org/markup-compatibility/2006" xmlns:wp14="http://schemas.microsoft.com/office/word/2010/wordprocessingDrawing" xmlns:w14="http://schemas.microsoft.com/office/word/2010/wordml" xmlns:w15="http://schemas.microsoft.com/office/word/2012/wordml" mc:Ignorable="w14 wp14 w15">
+<w:ftr xmlns:o="urn:schemas-microsoft-com:office:office" xmlns:r="http://schemas.openxmlformats.org/officeDocument/2006/relationships" xmlns:v="urn:schemas-microsoft-com:vml" xmlns:w="http://schemas.openxmlformats.org/wordprocessingml/2006/main" xmlns:w10="urn:schemas-microsoft-com:office:word" xmlns:wp="http://schemas.openxmlformats.org/drawingml/2006/wordprocessingDrawing" xmlns:pic="http://schemas.openxmlformats.org/drawingml/2006/picture" xmlns:wps="http://schemas.microsoft.com/office/word/2010/wordprocessingShape" xmlns:wpg="http://schemas.microsoft.com/office/word/2010/wordprocessingGroup" xmlns:mc="http://schemas.openxmlformats.org/markup-compatibility/2006" xmlns:wp14="http://schemas.microsoft.com/office/word/2010/wordprocessingDrawing" xmlns:w14="http://schemas.microsoft.com/office/word/2010/wordml" xmlns:w15="http://schemas.microsoft.com/office/word/2012/wordml" mc:Ignorable="w14 wp14 w15">
   <w:p>
     <w:pPr>
       <w:pStyle w:val="Normal"/>
@@ -10057,7 +10201,7 @@
     </w:r>
     <w:r>
       <w:rPr/>
-      <w:t>1</w:t>
+      <w:t>18</w:t>
     </w:r>
     <w:r>
       <w:rPr/>
@@ -10996,7 +11140,7 @@
     </w:rPr>
   </w:style>
   <w:style w:type="paragraph" w:styleId="Heading1">
-    <w:name w:val="Heading 1"/>
+    <w:name w:val="heading 1"/>
     <w:basedOn w:val="Heading"/>
     <w:qFormat/>
     <w:pPr>
@@ -11013,7 +11157,7 @@
     </w:rPr>
   </w:style>
   <w:style w:type="paragraph" w:styleId="Heading2">
-    <w:name w:val="Heading 2"/>
+    <w:name w:val="heading 2"/>
     <w:basedOn w:val="Heading"/>
     <w:qFormat/>
     <w:pPr>
@@ -11030,7 +11174,7 @@
     </w:rPr>
   </w:style>
   <w:style w:type="paragraph" w:styleId="Heading3">
-    <w:name w:val="Heading 3"/>
+    <w:name w:val="heading 3"/>
     <w:basedOn w:val="Heading"/>
     <w:qFormat/>
     <w:pPr>
@@ -11047,7 +11191,7 @@
     </w:rPr>
   </w:style>
   <w:style w:type="paragraph" w:styleId="Heading4">
-    <w:name w:val="Heading 4"/>
+    <w:name w:val="heading 4"/>
     <w:basedOn w:val="Heading"/>
     <w:qFormat/>
     <w:pPr/>
@@ -11058,7 +11202,7 @@
     </w:rPr>
   </w:style>
   <w:style w:type="paragraph" w:styleId="Heading5">
-    <w:name w:val="Heading 5"/>
+    <w:name w:val="heading 5"/>
     <w:basedOn w:val="Heading"/>
     <w:qFormat/>
     <w:pPr/>
@@ -11067,7 +11211,7 @@
     </w:rPr>
   </w:style>
   <w:style w:type="paragraph" w:styleId="Heading6">
-    <w:name w:val="Heading 6"/>
+    <w:name w:val="heading 6"/>
     <w:basedOn w:val="Heading"/>
     <w:qFormat/>
     <w:pPr/>
@@ -11084,8 +11228,8 @@
       <w:u w:val="single"/>
     </w:rPr>
   </w:style>
-  <w:style w:type="character" w:styleId="FootnoteCharacters">
-    <w:name w:val="Footnote Characters"/>
+  <w:style w:type="character" w:styleId="FootnoteCharactersuser">
+    <w:name w:val="Footnote Characters (user)"/>
     <w:uiPriority w:val="99"/>
     <w:semiHidden/>
     <w:unhideWhenUsed/>
@@ -11094,8 +11238,15 @@
       <w:vertAlign w:val="superscript"/>
     </w:rPr>
   </w:style>
+  <w:style w:type="character" w:styleId="FootnoteCharacters">
+    <w:name w:val="Footnote Characters"/>
+    <w:qFormat/>
+    <w:rPr>
+      <w:vertAlign w:val="superscript"/>
+    </w:rPr>
+  </w:style>
   <w:style w:type="character" w:styleId="FootnoteReference">
-    <w:name w:val="Footnote Reference"/>
+    <w:name w:val="footnote reference"/>
     <w:rPr>
       <w:vertAlign w:val="superscript"/>
     </w:rPr>
@@ -11159,7 +11310,7 @@
     </w:rPr>
   </w:style>
   <w:style w:type="paragraph" w:styleId="Caption">
-    <w:name w:val="Caption"/>
+    <w:name w:val="caption"/>
     <w:basedOn w:val="Normal"/>
     <w:qFormat/>
     <w:pPr>
@@ -11236,7 +11387,7 @@
     </w:rPr>
   </w:style>
   <w:style w:type="paragraph" w:styleId="FootnoteText">
-    <w:name w:val="Footnote Text"/>
+    <w:name w:val="footnote text"/>
     <w:basedOn w:val="Normal"/>
     <w:link w:val="FootnoteTextChar"/>
     <w:uiPriority w:val="99"/>
@@ -11258,13 +11409,13 @@
     <w:rPr/>
   </w:style>
   <w:style w:type="paragraph" w:styleId="Footer">
-    <w:name w:val="Footer"/>
+    <w:name w:val="footer"/>
     <w:basedOn w:val="HeaderandFooter"/>
     <w:pPr/>
     <w:rPr/>
   </w:style>
-  <w:style w:type="paragraph" w:styleId="BlockQuotation">
-    <w:name w:val="Block Quotation"/>
+  <w:style w:type="paragraph" w:styleId="BlockQuotationuser">
+    <w:name w:val="Block Quotation (user)"/>
     <w:basedOn w:val="Normal"/>
     <w:qFormat/>
     <w:pPr>

</xml_diff>

<commit_message>
added segments see docs
</commit_message>
<xml_diff>
--- a/documents/MICRO-BASIC-Manual.docx
+++ b/documents/MICRO-BASIC-Manual.docx
@@ -1,6 +1,6 @@
 
 <file path=word/document.xml><?xml version="1.0" encoding="utf-8"?>
-<w:document xmlns:o="urn:schemas-microsoft-com:office:office" xmlns:r="http://schemas.openxmlformats.org/officeDocument/2006/relationships" xmlns:v="urn:schemas-microsoft-com:vml" xmlns:w="http://schemas.openxmlformats.org/wordprocessingml/2006/main" xmlns:w10="urn:schemas-microsoft-com:office:word" xmlns:wp="http://schemas.openxmlformats.org/drawingml/2006/wordprocessingDrawing" xmlns:pic="http://schemas.openxmlformats.org/drawingml/2006/picture" xmlns:wps="http://schemas.microsoft.com/office/word/2010/wordprocessingShape" xmlns:wpg="http://schemas.microsoft.com/office/word/2010/wordprocessingGroup" xmlns:mc="http://schemas.openxmlformats.org/markup-compatibility/2006" xmlns:wp14="http://schemas.microsoft.com/office/word/2010/wordprocessingDrawing" xmlns:w14="http://schemas.microsoft.com/office/word/2010/wordml" xmlns:w15="http://schemas.microsoft.com/office/word/2012/wordml" mc:Ignorable="w14 wp14 w15">
+<w:document xmlns:o="urn:schemas-microsoft-com:office:office" xmlns:r="http://schemas.openxmlformats.org/officeDocument/2006/relationships" xmlns:v="urn:schemas-microsoft-com:vml" xmlns:w="http://schemas.openxmlformats.org/wordprocessingml/2006/main" xmlns:w10="urn:schemas-microsoft-com:office:word" xmlns:wp="http://schemas.openxmlformats.org/drawingml/2006/wordprocessingDrawing" xmlns:wps="http://schemas.microsoft.com/office/word/2010/wordprocessingShape" xmlns:wpg="http://schemas.microsoft.com/office/word/2010/wordprocessingGroup" xmlns:mc="http://schemas.openxmlformats.org/markup-compatibility/2006" xmlns:wp14="http://schemas.microsoft.com/office/word/2010/wordprocessingDrawing" xmlns:w14="http://schemas.microsoft.com/office/word/2010/wordml" xmlns:w15="http://schemas.microsoft.com/office/word/2012/wordml" mc:Ignorable="w14 wp14 w15">
   <w:body>
     <w:p>
       <w:pPr>
@@ -81,7 +81,38 @@
           <w:sz w:val="20"/>
           <w:szCs w:val="20"/>
         </w:rPr>
-        <w:t>All numeric values are 16-bit signed integers. The interpreter is single-file C and is designed to be easy to retarget to other architectures such as Z80 or 6809.</w:t>
+        <w:t xml:space="preserve">All numeric values are 16-bit </w:t>
+      </w:r>
+      <w:r>
+        <w:rPr>
+          <w:rFonts w:eastAsia="Arial" w:cs="Arial"/>
+          <w:sz w:val="20"/>
+          <w:szCs w:val="20"/>
+        </w:rPr>
+        <w:t>values, referenced as signed integers by default for compatibilit</w:t>
+      </w:r>
+      <w:r>
+        <w:rPr>
+          <w:rFonts w:eastAsia="Arial" w:cs="Arial"/>
+          <w:sz w:val="20"/>
+          <w:szCs w:val="20"/>
+        </w:rPr>
+        <w:t>y. The interpreter is single-file C and is designed to be easy to re-target to other architectures such as Z80 or 6809.</w:t>
+      </w:r>
+    </w:p>
+    <w:p>
+      <w:pPr>
+        <w:pStyle w:val="Normal"/>
+        <w:spacing w:before="0" w:after="80"/>
+        <w:rPr/>
+      </w:pPr>
+      <w:r>
+        <w:rPr>
+          <w:rFonts w:eastAsia="Arial" w:cs="Arial"/>
+          <w:sz w:val="20"/>
+          <w:szCs w:val="20"/>
+        </w:rPr>
+        <w:t>The implementation is written in C, as such a large environment with a disk operating system is amused, and heap management is performed by the compiler, and through the standard library, as such direct access is managed through that development lens.</w:t>
       </w:r>
     </w:p>
     <w:p>
@@ -120,18 +151,18 @@
     <w:tbl>
       <w:tblPr>
         <w:tblW w:w="9360" w:type="dxa"/>
-        <w:jc w:val="start"/>
+        <w:jc w:val="left"/>
         <w:tblInd w:w="0" w:type="dxa"/>
         <w:tblLayout w:type="fixed"/>
         <w:tblCellMar>
           <w:top w:w="80" w:type="dxa"/>
-          <w:start w:w="120" w:type="dxa"/>
+          <w:left w:w="120" w:type="dxa"/>
           <w:bottom w:w="80" w:type="dxa"/>
-          <w:end w:w="120" w:type="dxa"/>
+          <w:right w:w="120" w:type="dxa"/>
         </w:tblCellMar>
       </w:tblPr>
       <w:tblGrid>
-        <w:gridCol w:w="2999"/>
+        <w:gridCol w:w="2998"/>
         <w:gridCol w:w="6361"/>
       </w:tblGrid>
       <w:tr>
@@ -140,12 +171,12 @@
         </w:trPr>
         <w:tc>
           <w:tcPr>
-            <w:tcW w:w="2999" w:type="dxa"/>
-            <w:tcBorders>
-              <w:top w:val="single" w:sz="2" w:space="0" w:color="CCCCCC"/>
-              <w:start w:val="single" w:sz="2" w:space="0" w:color="CCCCCC"/>
-              <w:bottom w:val="single" w:sz="2" w:space="0" w:color="CCCCCC"/>
-              <w:end w:val="single" w:sz="2" w:space="0" w:color="CCCCCC"/>
+            <w:tcW w:w="2998" w:type="dxa"/>
+            <w:tcBorders>
+              <w:top w:val="single" w:sz="2" w:space="0" w:color="CCCCCC"/>
+              <w:left w:val="single" w:sz="2" w:space="0" w:color="CCCCCC"/>
+              <w:bottom w:val="single" w:sz="2" w:space="0" w:color="CCCCCC"/>
+              <w:right w:val="single" w:sz="2" w:space="0" w:color="CCCCCC"/>
             </w:tcBorders>
             <w:shd w:fill="2E5090" w:val="clear"/>
           </w:tcPr>
@@ -172,9 +203,9 @@
             <w:tcW w:w="6361" w:type="dxa"/>
             <w:tcBorders>
               <w:top w:val="single" w:sz="2" w:space="0" w:color="CCCCCC"/>
-              <w:start w:val="single" w:sz="2" w:space="0" w:color="CCCCCC"/>
-              <w:bottom w:val="single" w:sz="2" w:space="0" w:color="CCCCCC"/>
-              <w:end w:val="single" w:sz="2" w:space="0" w:color="CCCCCC"/>
+              <w:left w:val="single" w:sz="2" w:space="0" w:color="CCCCCC"/>
+              <w:bottom w:val="single" w:sz="2" w:space="0" w:color="CCCCCC"/>
+              <w:right w:val="single" w:sz="2" w:space="0" w:color="CCCCCC"/>
             </w:tcBorders>
             <w:shd w:fill="2E5090" w:val="clear"/>
           </w:tcPr>
@@ -201,12 +232,12 @@
         <w:trPr/>
         <w:tc>
           <w:tcPr>
-            <w:tcW w:w="2999" w:type="dxa"/>
-            <w:tcBorders>
-              <w:top w:val="single" w:sz="2" w:space="0" w:color="CCCCCC"/>
-              <w:start w:val="single" w:sz="2" w:space="0" w:color="CCCCCC"/>
-              <w:bottom w:val="single" w:sz="2" w:space="0" w:color="CCCCCC"/>
-              <w:end w:val="single" w:sz="2" w:space="0" w:color="CCCCCC"/>
+            <w:tcW w:w="2998" w:type="dxa"/>
+            <w:tcBorders>
+              <w:top w:val="single" w:sz="2" w:space="0" w:color="CCCCCC"/>
+              <w:left w:val="single" w:sz="2" w:space="0" w:color="CCCCCC"/>
+              <w:bottom w:val="single" w:sz="2" w:space="0" w:color="CCCCCC"/>
+              <w:right w:val="single" w:sz="2" w:space="0" w:color="CCCCCC"/>
             </w:tcBorders>
             <w:shd w:fill="F0F0F0" w:val="clear"/>
           </w:tcPr>
@@ -232,9 +263,9 @@
             <w:tcW w:w="6361" w:type="dxa"/>
             <w:tcBorders>
               <w:top w:val="single" w:sz="2" w:space="0" w:color="CCCCCC"/>
-              <w:start w:val="single" w:sz="2" w:space="0" w:color="CCCCCC"/>
-              <w:bottom w:val="single" w:sz="2" w:space="0" w:color="CCCCCC"/>
-              <w:end w:val="single" w:sz="2" w:space="0" w:color="CCCCCC"/>
+              <w:left w:val="single" w:sz="2" w:space="0" w:color="CCCCCC"/>
+              <w:bottom w:val="single" w:sz="2" w:space="0" w:color="CCCCCC"/>
+              <w:right w:val="single" w:sz="2" w:space="0" w:color="CCCCCC"/>
             </w:tcBorders>
             <w:shd w:fill="FFFFFF" w:val="clear"/>
           </w:tcPr>
@@ -260,12 +291,12 @@
         <w:trPr/>
         <w:tc>
           <w:tcPr>
-            <w:tcW w:w="2999" w:type="dxa"/>
-            <w:tcBorders>
-              <w:top w:val="single" w:sz="2" w:space="0" w:color="CCCCCC"/>
-              <w:start w:val="single" w:sz="2" w:space="0" w:color="CCCCCC"/>
-              <w:bottom w:val="single" w:sz="2" w:space="0" w:color="CCCCCC"/>
-              <w:end w:val="single" w:sz="2" w:space="0" w:color="CCCCCC"/>
+            <w:tcW w:w="2998" w:type="dxa"/>
+            <w:tcBorders>
+              <w:top w:val="single" w:sz="2" w:space="0" w:color="CCCCCC"/>
+              <w:left w:val="single" w:sz="2" w:space="0" w:color="CCCCCC"/>
+              <w:bottom w:val="single" w:sz="2" w:space="0" w:color="CCCCCC"/>
+              <w:right w:val="single" w:sz="2" w:space="0" w:color="CCCCCC"/>
             </w:tcBorders>
             <w:shd w:fill="F0F0F0" w:val="clear"/>
           </w:tcPr>
@@ -291,9 +322,9 @@
             <w:tcW w:w="6361" w:type="dxa"/>
             <w:tcBorders>
               <w:top w:val="single" w:sz="2" w:space="0" w:color="CCCCCC"/>
-              <w:start w:val="single" w:sz="2" w:space="0" w:color="CCCCCC"/>
-              <w:bottom w:val="single" w:sz="2" w:space="0" w:color="CCCCCC"/>
-              <w:end w:val="single" w:sz="2" w:space="0" w:color="CCCCCC"/>
+              <w:left w:val="single" w:sz="2" w:space="0" w:color="CCCCCC"/>
+              <w:bottom w:val="single" w:sz="2" w:space="0" w:color="CCCCCC"/>
+              <w:right w:val="single" w:sz="2" w:space="0" w:color="CCCCCC"/>
             </w:tcBorders>
             <w:shd w:fill="FFFFFF" w:val="clear"/>
           </w:tcPr>
@@ -319,12 +350,12 @@
         <w:trPr/>
         <w:tc>
           <w:tcPr>
-            <w:tcW w:w="2999" w:type="dxa"/>
-            <w:tcBorders>
-              <w:top w:val="single" w:sz="2" w:space="0" w:color="CCCCCC"/>
-              <w:start w:val="single" w:sz="2" w:space="0" w:color="CCCCCC"/>
-              <w:bottom w:val="single" w:sz="2" w:space="0" w:color="CCCCCC"/>
-              <w:end w:val="single" w:sz="2" w:space="0" w:color="CCCCCC"/>
+            <w:tcW w:w="2998" w:type="dxa"/>
+            <w:tcBorders>
+              <w:top w:val="single" w:sz="2" w:space="0" w:color="CCCCCC"/>
+              <w:left w:val="single" w:sz="2" w:space="0" w:color="CCCCCC"/>
+              <w:bottom w:val="single" w:sz="2" w:space="0" w:color="CCCCCC"/>
+              <w:right w:val="single" w:sz="2" w:space="0" w:color="CCCCCC"/>
             </w:tcBorders>
             <w:shd w:fill="F0F0F0" w:val="clear"/>
           </w:tcPr>
@@ -350,9 +381,9 @@
             <w:tcW w:w="6361" w:type="dxa"/>
             <w:tcBorders>
               <w:top w:val="single" w:sz="2" w:space="0" w:color="CCCCCC"/>
-              <w:start w:val="single" w:sz="2" w:space="0" w:color="CCCCCC"/>
-              <w:bottom w:val="single" w:sz="2" w:space="0" w:color="CCCCCC"/>
-              <w:end w:val="single" w:sz="2" w:space="0" w:color="CCCCCC"/>
+              <w:left w:val="single" w:sz="2" w:space="0" w:color="CCCCCC"/>
+              <w:bottom w:val="single" w:sz="2" w:space="0" w:color="CCCCCC"/>
+              <w:right w:val="single" w:sz="2" w:space="0" w:color="CCCCCC"/>
             </w:tcBorders>
             <w:shd w:fill="FFFFFF" w:val="clear"/>
           </w:tcPr>
@@ -439,18 +470,18 @@
     <w:tbl>
       <w:tblPr>
         <w:tblW w:w="9360" w:type="dxa"/>
-        <w:jc w:val="start"/>
+        <w:jc w:val="left"/>
         <w:tblInd w:w="0" w:type="dxa"/>
         <w:tblLayout w:type="fixed"/>
         <w:tblCellMar>
           <w:top w:w="80" w:type="dxa"/>
-          <w:start w:w="120" w:type="dxa"/>
+          <w:left w:w="120" w:type="dxa"/>
           <w:bottom w:w="80" w:type="dxa"/>
-          <w:end w:w="120" w:type="dxa"/>
+          <w:right w:w="120" w:type="dxa"/>
         </w:tblCellMar>
       </w:tblPr>
       <w:tblGrid>
-        <w:gridCol w:w="2999"/>
+        <w:gridCol w:w="2998"/>
         <w:gridCol w:w="6361"/>
       </w:tblGrid>
       <w:tr>
@@ -459,12 +490,12 @@
         </w:trPr>
         <w:tc>
           <w:tcPr>
-            <w:tcW w:w="2999" w:type="dxa"/>
-            <w:tcBorders>
-              <w:top w:val="single" w:sz="2" w:space="0" w:color="CCCCCC"/>
-              <w:start w:val="single" w:sz="2" w:space="0" w:color="CCCCCC"/>
-              <w:bottom w:val="single" w:sz="2" w:space="0" w:color="CCCCCC"/>
-              <w:end w:val="single" w:sz="2" w:space="0" w:color="CCCCCC"/>
+            <w:tcW w:w="2998" w:type="dxa"/>
+            <w:tcBorders>
+              <w:top w:val="single" w:sz="2" w:space="0" w:color="CCCCCC"/>
+              <w:left w:val="single" w:sz="2" w:space="0" w:color="CCCCCC"/>
+              <w:bottom w:val="single" w:sz="2" w:space="0" w:color="CCCCCC"/>
+              <w:right w:val="single" w:sz="2" w:space="0" w:color="CCCCCC"/>
             </w:tcBorders>
             <w:shd w:fill="2E5090" w:val="clear"/>
           </w:tcPr>
@@ -491,9 +522,9 @@
             <w:tcW w:w="6361" w:type="dxa"/>
             <w:tcBorders>
               <w:top w:val="single" w:sz="2" w:space="0" w:color="CCCCCC"/>
-              <w:start w:val="single" w:sz="2" w:space="0" w:color="CCCCCC"/>
-              <w:bottom w:val="single" w:sz="2" w:space="0" w:color="CCCCCC"/>
-              <w:end w:val="single" w:sz="2" w:space="0" w:color="CCCCCC"/>
+              <w:left w:val="single" w:sz="2" w:space="0" w:color="CCCCCC"/>
+              <w:bottom w:val="single" w:sz="2" w:space="0" w:color="CCCCCC"/>
+              <w:right w:val="single" w:sz="2" w:space="0" w:color="CCCCCC"/>
             </w:tcBorders>
             <w:shd w:fill="2E5090" w:val="clear"/>
           </w:tcPr>
@@ -520,12 +551,12 @@
         <w:trPr/>
         <w:tc>
           <w:tcPr>
-            <w:tcW w:w="2999" w:type="dxa"/>
-            <w:tcBorders>
-              <w:top w:val="single" w:sz="2" w:space="0" w:color="CCCCCC"/>
-              <w:start w:val="single" w:sz="2" w:space="0" w:color="CCCCCC"/>
-              <w:bottom w:val="single" w:sz="2" w:space="0" w:color="CCCCCC"/>
-              <w:end w:val="single" w:sz="2" w:space="0" w:color="CCCCCC"/>
+            <w:tcW w:w="2998" w:type="dxa"/>
+            <w:tcBorders>
+              <w:top w:val="single" w:sz="2" w:space="0" w:color="CCCCCC"/>
+              <w:left w:val="single" w:sz="2" w:space="0" w:color="CCCCCC"/>
+              <w:bottom w:val="single" w:sz="2" w:space="0" w:color="CCCCCC"/>
+              <w:right w:val="single" w:sz="2" w:space="0" w:color="CCCCCC"/>
             </w:tcBorders>
             <w:shd w:fill="F0F0F0" w:val="clear"/>
           </w:tcPr>
@@ -551,9 +582,9 @@
             <w:tcW w:w="6361" w:type="dxa"/>
             <w:tcBorders>
               <w:top w:val="single" w:sz="2" w:space="0" w:color="CCCCCC"/>
-              <w:start w:val="single" w:sz="2" w:space="0" w:color="CCCCCC"/>
-              <w:bottom w:val="single" w:sz="2" w:space="0" w:color="CCCCCC"/>
-              <w:end w:val="single" w:sz="2" w:space="0" w:color="CCCCCC"/>
+              <w:left w:val="single" w:sz="2" w:space="0" w:color="CCCCCC"/>
+              <w:bottom w:val="single" w:sz="2" w:space="0" w:color="CCCCCC"/>
+              <w:right w:val="single" w:sz="2" w:space="0" w:color="CCCCCC"/>
             </w:tcBorders>
             <w:shd w:fill="FFFFFF" w:val="clear"/>
           </w:tcPr>
@@ -579,12 +610,12 @@
         <w:trPr/>
         <w:tc>
           <w:tcPr>
-            <w:tcW w:w="2999" w:type="dxa"/>
-            <w:tcBorders>
-              <w:top w:val="single" w:sz="2" w:space="0" w:color="CCCCCC"/>
-              <w:start w:val="single" w:sz="2" w:space="0" w:color="CCCCCC"/>
-              <w:bottom w:val="single" w:sz="2" w:space="0" w:color="CCCCCC"/>
-              <w:end w:val="single" w:sz="2" w:space="0" w:color="CCCCCC"/>
+            <w:tcW w:w="2998" w:type="dxa"/>
+            <w:tcBorders>
+              <w:top w:val="single" w:sz="2" w:space="0" w:color="CCCCCC"/>
+              <w:left w:val="single" w:sz="2" w:space="0" w:color="CCCCCC"/>
+              <w:bottom w:val="single" w:sz="2" w:space="0" w:color="CCCCCC"/>
+              <w:right w:val="single" w:sz="2" w:space="0" w:color="CCCCCC"/>
             </w:tcBorders>
             <w:shd w:fill="F0F0F0" w:val="clear"/>
           </w:tcPr>
@@ -610,9 +641,9 @@
             <w:tcW w:w="6361" w:type="dxa"/>
             <w:tcBorders>
               <w:top w:val="single" w:sz="2" w:space="0" w:color="CCCCCC"/>
-              <w:start w:val="single" w:sz="2" w:space="0" w:color="CCCCCC"/>
-              <w:bottom w:val="single" w:sz="2" w:space="0" w:color="CCCCCC"/>
-              <w:end w:val="single" w:sz="2" w:space="0" w:color="CCCCCC"/>
+              <w:left w:val="single" w:sz="2" w:space="0" w:color="CCCCCC"/>
+              <w:bottom w:val="single" w:sz="2" w:space="0" w:color="CCCCCC"/>
+              <w:right w:val="single" w:sz="2" w:space="0" w:color="CCCCCC"/>
             </w:tcBorders>
             <w:shd w:fill="FFFFFF" w:val="clear"/>
           </w:tcPr>
@@ -638,12 +669,12 @@
         <w:trPr/>
         <w:tc>
           <w:tcPr>
-            <w:tcW w:w="2999" w:type="dxa"/>
-            <w:tcBorders>
-              <w:top w:val="single" w:sz="2" w:space="0" w:color="CCCCCC"/>
-              <w:start w:val="single" w:sz="2" w:space="0" w:color="CCCCCC"/>
-              <w:bottom w:val="single" w:sz="2" w:space="0" w:color="CCCCCC"/>
-              <w:end w:val="single" w:sz="2" w:space="0" w:color="CCCCCC"/>
+            <w:tcW w:w="2998" w:type="dxa"/>
+            <w:tcBorders>
+              <w:top w:val="single" w:sz="2" w:space="0" w:color="CCCCCC"/>
+              <w:left w:val="single" w:sz="2" w:space="0" w:color="CCCCCC"/>
+              <w:bottom w:val="single" w:sz="2" w:space="0" w:color="CCCCCC"/>
+              <w:right w:val="single" w:sz="2" w:space="0" w:color="CCCCCC"/>
             </w:tcBorders>
             <w:shd w:fill="F0F0F0" w:val="clear"/>
           </w:tcPr>
@@ -669,9 +700,9 @@
             <w:tcW w:w="6361" w:type="dxa"/>
             <w:tcBorders>
               <w:top w:val="single" w:sz="2" w:space="0" w:color="CCCCCC"/>
-              <w:start w:val="single" w:sz="2" w:space="0" w:color="CCCCCC"/>
-              <w:bottom w:val="single" w:sz="2" w:space="0" w:color="CCCCCC"/>
-              <w:end w:val="single" w:sz="2" w:space="0" w:color="CCCCCC"/>
+              <w:left w:val="single" w:sz="2" w:space="0" w:color="CCCCCC"/>
+              <w:bottom w:val="single" w:sz="2" w:space="0" w:color="CCCCCC"/>
+              <w:right w:val="single" w:sz="2" w:space="0" w:color="CCCCCC"/>
             </w:tcBorders>
             <w:shd w:fill="FFFFFF" w:val="clear"/>
           </w:tcPr>
@@ -717,6 +748,23 @@
           <w:szCs w:val="20"/>
         </w:rPr>
         <w:t>There is no binary prefix. Use hex for bit patterns: #0F instead of %00001111.</w:t>
+      </w:r>
+    </w:p>
+    <w:p>
+      <w:pPr>
+        <w:pStyle w:val="Normal"/>
+        <w:spacing w:before="0" w:after="80"/>
+        <w:rPr>
+          <w:rFonts w:eastAsia="Arial" w:cs="Arial"/>
+          <w:sz w:val="20"/>
+          <w:szCs w:val="20"/>
+        </w:rPr>
+      </w:pPr>
+      <w:r>
+        <w:rPr/>
+      </w:r>
+      <w:r>
+        <w:br w:type="page"/>
       </w:r>
     </w:p>
     <w:p>
@@ -756,7 +804,7 @@
       <w:pPr>
         <w:pStyle w:val="Normal"/>
         <w:spacing w:before="40" w:after="40"/>
-        <w:ind w:start="720"/>
+        <w:ind w:left="720"/>
         <w:rPr/>
       </w:pPr>
       <w:r>
@@ -773,7 +821,7 @@
       <w:pPr>
         <w:pStyle w:val="Normal"/>
         <w:spacing w:before="40" w:after="40"/>
-        <w:ind w:start="720"/>
+        <w:ind w:left="720"/>
         <w:rPr/>
       </w:pPr>
       <w:r>
@@ -799,7 +847,7 @@
       <w:pPr>
         <w:pStyle w:val="Normal"/>
         <w:spacing w:before="40" w:after="40"/>
-        <w:ind w:start="720"/>
+        <w:ind w:left="720"/>
         <w:rPr/>
       </w:pPr>
       <w:r>
@@ -825,7 +873,7 @@
       <w:pPr>
         <w:pStyle w:val="Normal"/>
         <w:spacing w:before="40" w:after="40"/>
-        <w:ind w:start="720"/>
+        <w:ind w:left="720"/>
         <w:rPr/>
       </w:pPr>
       <w:r>
@@ -851,7 +899,7 @@
       <w:pPr>
         <w:pStyle w:val="Normal"/>
         <w:spacing w:before="80" w:after="80"/>
-        <w:ind w:start="360"/>
+        <w:ind w:left="360"/>
         <w:rPr/>
       </w:pPr>
       <w:r>
@@ -894,7 +942,7 @@
       <w:pPr>
         <w:pStyle w:val="Normal"/>
         <w:spacing w:before="40" w:after="40"/>
-        <w:ind w:start="720"/>
+        <w:ind w:left="720"/>
         <w:rPr/>
       </w:pPr>
       <w:r>
@@ -958,18 +1006,18 @@
     <w:tbl>
       <w:tblPr>
         <w:tblW w:w="9360" w:type="dxa"/>
-        <w:jc w:val="start"/>
+        <w:jc w:val="left"/>
         <w:tblInd w:w="0" w:type="dxa"/>
         <w:tblLayout w:type="fixed"/>
         <w:tblCellMar>
           <w:top w:w="80" w:type="dxa"/>
-          <w:start w:w="120" w:type="dxa"/>
+          <w:left w:w="120" w:type="dxa"/>
           <w:bottom w:w="80" w:type="dxa"/>
-          <w:end w:w="120" w:type="dxa"/>
+          <w:right w:w="120" w:type="dxa"/>
         </w:tblCellMar>
       </w:tblPr>
       <w:tblGrid>
-        <w:gridCol w:w="2999"/>
+        <w:gridCol w:w="2998"/>
         <w:gridCol w:w="6361"/>
       </w:tblGrid>
       <w:tr>
@@ -978,12 +1026,12 @@
         </w:trPr>
         <w:tc>
           <w:tcPr>
-            <w:tcW w:w="2999" w:type="dxa"/>
-            <w:tcBorders>
-              <w:top w:val="single" w:sz="2" w:space="0" w:color="CCCCCC"/>
-              <w:start w:val="single" w:sz="2" w:space="0" w:color="CCCCCC"/>
-              <w:bottom w:val="single" w:sz="2" w:space="0" w:color="CCCCCC"/>
-              <w:end w:val="single" w:sz="2" w:space="0" w:color="CCCCCC"/>
+            <w:tcW w:w="2998" w:type="dxa"/>
+            <w:tcBorders>
+              <w:top w:val="single" w:sz="2" w:space="0" w:color="CCCCCC"/>
+              <w:left w:val="single" w:sz="2" w:space="0" w:color="CCCCCC"/>
+              <w:bottom w:val="single" w:sz="2" w:space="0" w:color="CCCCCC"/>
+              <w:right w:val="single" w:sz="2" w:space="0" w:color="CCCCCC"/>
             </w:tcBorders>
             <w:shd w:fill="2E5090" w:val="clear"/>
           </w:tcPr>
@@ -1010,9 +1058,9 @@
             <w:tcW w:w="6361" w:type="dxa"/>
             <w:tcBorders>
               <w:top w:val="single" w:sz="2" w:space="0" w:color="CCCCCC"/>
-              <w:start w:val="single" w:sz="2" w:space="0" w:color="CCCCCC"/>
-              <w:bottom w:val="single" w:sz="2" w:space="0" w:color="CCCCCC"/>
-              <w:end w:val="single" w:sz="2" w:space="0" w:color="CCCCCC"/>
+              <w:left w:val="single" w:sz="2" w:space="0" w:color="CCCCCC"/>
+              <w:bottom w:val="single" w:sz="2" w:space="0" w:color="CCCCCC"/>
+              <w:right w:val="single" w:sz="2" w:space="0" w:color="CCCCCC"/>
             </w:tcBorders>
             <w:shd w:fill="2E5090" w:val="clear"/>
           </w:tcPr>
@@ -1039,12 +1087,12 @@
         <w:trPr/>
         <w:tc>
           <w:tcPr>
-            <w:tcW w:w="2999" w:type="dxa"/>
-            <w:tcBorders>
-              <w:top w:val="single" w:sz="2" w:space="0" w:color="CCCCCC"/>
-              <w:start w:val="single" w:sz="2" w:space="0" w:color="CCCCCC"/>
-              <w:bottom w:val="single" w:sz="2" w:space="0" w:color="CCCCCC"/>
-              <w:end w:val="single" w:sz="2" w:space="0" w:color="CCCCCC"/>
+            <w:tcW w:w="2998" w:type="dxa"/>
+            <w:tcBorders>
+              <w:top w:val="single" w:sz="2" w:space="0" w:color="CCCCCC"/>
+              <w:left w:val="single" w:sz="2" w:space="0" w:color="CCCCCC"/>
+              <w:bottom w:val="single" w:sz="2" w:space="0" w:color="CCCCCC"/>
+              <w:right w:val="single" w:sz="2" w:space="0" w:color="CCCCCC"/>
             </w:tcBorders>
             <w:shd w:fill="F0F0F0" w:val="clear"/>
           </w:tcPr>
@@ -1070,9 +1118,9 @@
             <w:tcW w:w="6361" w:type="dxa"/>
             <w:tcBorders>
               <w:top w:val="single" w:sz="2" w:space="0" w:color="CCCCCC"/>
-              <w:start w:val="single" w:sz="2" w:space="0" w:color="CCCCCC"/>
-              <w:bottom w:val="single" w:sz="2" w:space="0" w:color="CCCCCC"/>
-              <w:end w:val="single" w:sz="2" w:space="0" w:color="CCCCCC"/>
+              <w:left w:val="single" w:sz="2" w:space="0" w:color="CCCCCC"/>
+              <w:bottom w:val="single" w:sz="2" w:space="0" w:color="CCCCCC"/>
+              <w:right w:val="single" w:sz="2" w:space="0" w:color="CCCCCC"/>
             </w:tcBorders>
             <w:shd w:fill="FFFFFF" w:val="clear"/>
           </w:tcPr>
@@ -1098,12 +1146,12 @@
         <w:trPr/>
         <w:tc>
           <w:tcPr>
-            <w:tcW w:w="2999" w:type="dxa"/>
-            <w:tcBorders>
-              <w:top w:val="single" w:sz="2" w:space="0" w:color="CCCCCC"/>
-              <w:start w:val="single" w:sz="2" w:space="0" w:color="CCCCCC"/>
-              <w:bottom w:val="single" w:sz="2" w:space="0" w:color="CCCCCC"/>
-              <w:end w:val="single" w:sz="2" w:space="0" w:color="CCCCCC"/>
+            <w:tcW w:w="2998" w:type="dxa"/>
+            <w:tcBorders>
+              <w:top w:val="single" w:sz="2" w:space="0" w:color="CCCCCC"/>
+              <w:left w:val="single" w:sz="2" w:space="0" w:color="CCCCCC"/>
+              <w:bottom w:val="single" w:sz="2" w:space="0" w:color="CCCCCC"/>
+              <w:right w:val="single" w:sz="2" w:space="0" w:color="CCCCCC"/>
             </w:tcBorders>
             <w:shd w:fill="F0F0F0" w:val="clear"/>
           </w:tcPr>
@@ -1129,9 +1177,9 @@
             <w:tcW w:w="6361" w:type="dxa"/>
             <w:tcBorders>
               <w:top w:val="single" w:sz="2" w:space="0" w:color="CCCCCC"/>
-              <w:start w:val="single" w:sz="2" w:space="0" w:color="CCCCCC"/>
-              <w:bottom w:val="single" w:sz="2" w:space="0" w:color="CCCCCC"/>
-              <w:end w:val="single" w:sz="2" w:space="0" w:color="CCCCCC"/>
+              <w:left w:val="single" w:sz="2" w:space="0" w:color="CCCCCC"/>
+              <w:bottom w:val="single" w:sz="2" w:space="0" w:color="CCCCCC"/>
+              <w:right w:val="single" w:sz="2" w:space="0" w:color="CCCCCC"/>
             </w:tcBorders>
             <w:shd w:fill="FFFFFF" w:val="clear"/>
           </w:tcPr>
@@ -1162,6 +1210,114 @@
       </w:pPr>
       <w:r>
         <w:rPr/>
+      </w:r>
+    </w:p>
+    <w:p>
+      <w:pPr>
+        <w:pStyle w:val="Heading2"/>
+        <w:rPr/>
+      </w:pPr>
+      <w:r>
+        <w:rPr/>
+        <w:t>Fluidity of type:</w:t>
+      </w:r>
+    </w:p>
+    <w:p>
+      <w:pPr>
+        <w:pStyle w:val="Normal"/>
+        <w:rPr/>
+      </w:pPr>
+      <w:r>
+        <w:rPr/>
+        <w:t xml:space="preserve">Type is fluid depending on reference context.  This means that the programmer has to keep track of the type manually as all operations complete in their proper context.  For example (but not limited by) </w:t>
+      </w:r>
+      <w:r>
+        <w:rPr>
+          <w:b/>
+          <w:bCs/>
+        </w:rPr>
+        <w:t xml:space="preserve">&gt;,&lt;,+,*,/,% </w:t>
+      </w:r>
+      <w:r>
+        <w:rPr>
+          <w:b w:val="false"/>
+          <w:bCs w:val="false"/>
+        </w:rPr>
+        <w:t xml:space="preserve">and </w:t>
+      </w:r>
+      <w:r>
+        <w:rPr>
+          <w:b/>
+          <w:bCs/>
+        </w:rPr>
+        <w:t>-</w:t>
+      </w:r>
+      <w:r>
+        <w:rPr/>
+        <w:t xml:space="preserve"> are all going to output a result which is 2’s compliment.  There is no specific way to peek at operational overflow, or sign after a calculation like assembly – as such look ahead mechanics with logic are required to detect these states.  </w:t>
+      </w:r>
+    </w:p>
+    <w:p>
+      <w:pPr>
+        <w:pStyle w:val="Normal"/>
+        <w:rPr/>
+      </w:pPr>
+      <w:r>
+        <w:rPr/>
+      </w:r>
+    </w:p>
+    <w:p>
+      <w:pPr>
+        <w:pStyle w:val="Normal"/>
+        <w:rPr/>
+      </w:pPr>
+      <w:r>
+        <w:rPr/>
+        <w:t xml:space="preserve">By contrast bitwise </w:t>
+      </w:r>
+      <w:r>
+        <w:rPr>
+          <w:b/>
+          <w:bCs/>
+        </w:rPr>
+        <w:t>&amp;, |, !</w:t>
+      </w:r>
+      <w:r>
+        <w:rPr/>
+        <w:t xml:space="preserve"> and </w:t>
+      </w:r>
+      <w:r>
+        <w:rPr>
+          <w:b/>
+          <w:bCs/>
+        </w:rPr>
+        <w:t xml:space="preserve">^ </w:t>
+      </w:r>
+      <w:r>
+        <w:rPr/>
+        <w:t xml:space="preserve">are all unsigned context, along with bit shift operation </w:t>
+      </w:r>
+      <w:r>
+        <w:rPr>
+          <w:b/>
+          <w:bCs/>
+        </w:rPr>
+        <w:t>&lt;&lt;</w:t>
+      </w:r>
+      <w:r>
+        <w:rPr/>
+        <w:t xml:space="preserve"> and</w:t>
+      </w:r>
+      <w:r>
+        <w:rPr>
+          <w:b/>
+          <w:bCs/>
+        </w:rPr>
+        <w:t xml:space="preserve"> &gt;&gt;</w:t>
+      </w:r>
+      <w:r>
+        <w:rPr/>
+        <w:t>.  These specifically will quite obviously modify the signed value of a number based on bit position within the number and therefor the resulting value of any operational overflow must be determined before hand using look ahead logic if needed.  For the programmers benefit the highly useful UGT() and ULT() will perform a check on a unsigned number to determine if it is greater or less than another unsigned value.</w:t>
       </w:r>
     </w:p>
     <w:p>
@@ -1184,6 +1340,258 @@
     </w:p>
     <w:p>
       <w:pPr>
+        <w:pStyle w:val="Normal"/>
+        <w:rPr/>
+      </w:pPr>
+      <w:r>
+        <w:rPr/>
+        <w:t>Traditional program flow: GOTO, GOSUB, IF.. THEN can be used with line numbers or through relative or segmented offset.</w:t>
+      </w:r>
+    </w:p>
+    <w:p>
+      <w:pPr>
+        <w:pStyle w:val="Heading2"/>
+        <w:rPr/>
+      </w:pPr>
+      <w:r>
+        <w:rPr/>
+        <w:t>Relative</w:t>
+      </w:r>
+    </w:p>
+    <w:p>
+      <w:pPr>
+        <w:pStyle w:val="Normal"/>
+        <w:rPr/>
+      </w:pPr>
+      <w:r>
+        <w:rPr/>
+        <w:t xml:space="preserve">Relative offset is the fastest and can be performed in 1 line segments using the ‘+’ notation, relative offsets increase the line counter by the offset but are limited to short forward jumps between 1 and 127 lines.  A reverse offset is not possible and requires a full segment slot, or through scanning with line numbers.  </w:t>
+      </w:r>
+    </w:p>
+    <w:p>
+      <w:pPr>
+        <w:pStyle w:val="Normal"/>
+        <w:rPr/>
+      </w:pPr>
+      <w:r>
+        <w:rPr/>
+      </w:r>
+    </w:p>
+    <w:p>
+      <w:pPr>
+        <w:pStyle w:val="Normal"/>
+        <w:rPr/>
+      </w:pPr>
+      <w:r>
+        <w:rPr/>
+        <w:t xml:space="preserve">A relative offset is useful for things like </w:t>
+      </w:r>
+      <w:r>
+        <w:rPr>
+          <w:b/>
+          <w:bCs/>
+        </w:rPr>
+        <w:t>WHILE .. DO</w:t>
+      </w:r>
+      <w:r>
+        <w:rPr/>
+        <w:t xml:space="preserve"> or </w:t>
+      </w:r>
+      <w:r>
+        <w:rPr>
+          <w:b/>
+          <w:bCs/>
+        </w:rPr>
+        <w:t>IF … THEN … ELSE</w:t>
+      </w:r>
+      <w:r>
+        <w:rPr/>
+        <w:t xml:space="preserve"> flow, using Flow control primitives to build these more complex structures.</w:t>
+      </w:r>
+      <w:r>
+        <w:rPr/>
+        <w:t xml:space="preserve"> </w:t>
+      </w:r>
+    </w:p>
+    <w:p>
+      <w:pPr>
+        <w:pStyle w:val="Normal"/>
+        <w:rPr/>
+      </w:pPr>
+      <w:r>
+        <w:rPr/>
+      </w:r>
+    </w:p>
+    <w:p>
+      <w:pPr>
+        <w:pStyle w:val="Heading2"/>
+        <w:rPr/>
+      </w:pPr>
+      <w:r>
+        <w:rPr/>
+        <w:t>Segmented</w:t>
+      </w:r>
+    </w:p>
+    <w:p>
+      <w:pPr>
+        <w:pStyle w:val="Normal"/>
+        <w:rPr/>
+      </w:pPr>
+      <w:r>
+        <w:rPr/>
+        <w:t xml:space="preserve">Segmented offset gives the programmer the opportunity to flexibly assign a value to a segment “slot” which can be swapped or statically defined as the program flow dictates.  An offset slot is defined by square brackets </w:t>
+      </w:r>
+      <w:r>
+        <w:rPr>
+          <w:b/>
+          <w:bCs/>
+        </w:rPr>
+        <w:t xml:space="preserve">“[]” </w:t>
+      </w:r>
+      <w:r>
+        <w:rPr>
+          <w:b w:val="false"/>
+          <w:bCs w:val="false"/>
+        </w:rPr>
+        <w:t xml:space="preserve">and is limited to 16 slots per program.  The programmer uses </w:t>
+      </w:r>
+      <w:r>
+        <w:rPr>
+          <w:b/>
+          <w:bCs/>
+        </w:rPr>
+        <w:t>SEG</w:t>
+      </w:r>
+      <w:r>
+        <w:rPr>
+          <w:b w:val="false"/>
+          <w:bCs w:val="false"/>
+        </w:rPr>
+        <w:t xml:space="preserve"> </w:t>
+      </w:r>
+      <w:r>
+        <w:rPr>
+          <w:b/>
+          <w:bCs/>
+        </w:rPr>
+        <w:t>[</w:t>
+      </w:r>
+      <w:r>
+        <w:rPr>
+          <w:b/>
+          <w:bCs/>
+          <w:i/>
+          <w:iCs/>
+        </w:rPr>
+        <w:t>slot number</w:t>
+      </w:r>
+      <w:r>
+        <w:rPr>
+          <w:b/>
+          <w:bCs/>
+        </w:rPr>
+        <w:t xml:space="preserve">] = </w:t>
+      </w:r>
+      <w:r>
+        <w:rPr>
+          <w:b/>
+          <w:bCs/>
+          <w:i/>
+          <w:iCs/>
+        </w:rPr>
+        <w:t>line number</w:t>
+      </w:r>
+      <w:r>
+        <w:rPr>
+          <w:b w:val="false"/>
+          <w:bCs w:val="false"/>
+        </w:rPr>
+        <w:t xml:space="preserve"> to set the slot value before it’s used.  Keep in mind, this will trigger a full scan to set the pointer, and so the most efficient way to use this feature is to call this early in the program to define the slot list, before any execution happens. </w:t>
+      </w:r>
+      <w:r>
+        <w:rPr>
+          <w:b w:val="false"/>
+          <w:bCs w:val="false"/>
+        </w:rPr>
+        <w:t xml:space="preserve">Once set basic checks the jump cache to find the line number link position, and can be adjusted by a forward offset as well using a </w:t>
+      </w:r>
+      <w:r>
+        <w:rPr>
+          <w:b/>
+          <w:bCs/>
+        </w:rPr>
+        <w:t xml:space="preserve">+ </w:t>
+      </w:r>
+      <w:r>
+        <w:rPr>
+          <w:b w:val="false"/>
+          <w:bCs w:val="false"/>
+        </w:rPr>
+        <w:t>operation.</w:t>
+      </w:r>
+    </w:p>
+    <w:p>
+      <w:pPr>
+        <w:pStyle w:val="Normal"/>
+        <w:rPr>
+          <w:b w:val="false"/>
+          <w:bCs w:val="false"/>
+        </w:rPr>
+      </w:pPr>
+      <w:r>
+        <w:rPr/>
+      </w:r>
+    </w:p>
+    <w:p>
+      <w:pPr>
+        <w:pStyle w:val="Normal"/>
+        <w:rPr/>
+      </w:pPr>
+      <w:r>
+        <w:rPr>
+          <w:b w:val="false"/>
+          <w:bCs w:val="false"/>
+        </w:rPr>
+        <w:t xml:space="preserve">This is useful with setting common jumps in a program like </w:t>
+      </w:r>
+      <w:r>
+        <w:rPr>
+          <w:b/>
+          <w:bCs/>
+        </w:rPr>
+        <w:t xml:space="preserve">GOSUB </w:t>
+      </w:r>
+      <w:r>
+        <w:rPr>
+          <w:b w:val="false"/>
+          <w:bCs w:val="false"/>
+        </w:rPr>
+        <w:t xml:space="preserve">routines or backwards jump reference in complex relative flow control. Another example is in building jump table logic to replace multiple If .. then statements, or creating a switch case statement, by way of the </w:t>
+      </w:r>
+      <w:r>
+        <w:rPr>
+          <w:b/>
+          <w:bCs/>
+        </w:rPr>
+        <w:t xml:space="preserve">+ </w:t>
+      </w:r>
+      <w:r>
+        <w:rPr>
+          <w:b w:val="false"/>
+          <w:bCs w:val="false"/>
+        </w:rPr>
+        <w:t>offset.</w:t>
+      </w:r>
+      <w:r>
+        <w:rPr>
+          <w:b w:val="false"/>
+          <w:bCs w:val="false"/>
+        </w:rPr>
+        <w:t xml:space="preserve">  Offsets can be defined by a regular variable value, meaning these offsets can be combined with complex logic for building precise table selection logic without a lookup.</w:t>
+      </w:r>
+    </w:p>
+    <w:p>
+      <w:pPr>
         <w:pStyle w:val="Heading2"/>
         <w:spacing w:before="280" w:after="80"/>
         <w:rPr/>
@@ -1219,34 +1627,86 @@
       <w:pPr>
         <w:pStyle w:val="Normal"/>
         <w:spacing w:before="40" w:after="40"/>
-        <w:ind w:start="720"/>
-        <w:rPr/>
-      </w:pPr>
-      <w:r>
-        <w:rPr>
-          <w:rFonts w:eastAsia="Courier New" w:cs="Courier New" w:ascii="Courier New" w:hAnsi="Courier New"/>
-          <w:color w:val="333333"/>
-          <w:sz w:val="20"/>
-          <w:szCs w:val="20"/>
-        </w:rPr>
-        <w:t>GOTO 100</w:t>
+        <w:ind w:left="720"/>
+        <w:rPr/>
+      </w:pPr>
+      <w:r>
+        <w:rPr>
+          <w:rFonts w:eastAsia="Courier New" w:cs="Courier New" w:ascii="Courier New" w:hAnsi="Courier New"/>
+          <w:color w:val="333333"/>
+          <w:sz w:val="20"/>
+          <w:szCs w:val="20"/>
+        </w:rPr>
+        <w:t xml:space="preserve">GOTO 100   </w:t>
+      </w:r>
+      <w:r>
+        <w:rPr>
+          <w:rFonts w:eastAsia="Courier New" w:cs="Courier New" w:ascii="Courier New" w:hAnsi="Courier New"/>
+          <w:color w:val="333333"/>
+          <w:sz w:val="20"/>
+          <w:szCs w:val="20"/>
+        </w:rPr>
+        <w:t>(Line Seek)</w:t>
       </w:r>
     </w:p>
     <w:p>
       <w:pPr>
         <w:pStyle w:val="Normal"/>
         <w:spacing w:before="40" w:after="40"/>
-        <w:ind w:start="720"/>
-        <w:rPr/>
-      </w:pPr>
-      <w:r>
-        <w:rPr>
-          <w:rFonts w:eastAsia="Courier New" w:cs="Courier New" w:ascii="Courier New" w:hAnsi="Courier New"/>
-          <w:color w:val="333333"/>
-          <w:sz w:val="20"/>
-          <w:szCs w:val="20"/>
-        </w:rPr>
-        <w:t>GOTO +3</w:t>
+        <w:ind w:left="720"/>
+        <w:rPr/>
+      </w:pPr>
+      <w:r>
+        <w:rPr>
+          <w:rFonts w:eastAsia="Courier New" w:cs="Courier New" w:ascii="Courier New" w:hAnsi="Courier New"/>
+          <w:color w:val="333333"/>
+          <w:sz w:val="20"/>
+          <w:szCs w:val="20"/>
+        </w:rPr>
+        <w:t xml:space="preserve">GOTO +3    </w:t>
+      </w:r>
+      <w:r>
+        <w:rPr>
+          <w:rFonts w:eastAsia="Courier New" w:cs="Courier New" w:ascii="Courier New" w:hAnsi="Courier New"/>
+          <w:color w:val="333333"/>
+          <w:sz w:val="20"/>
+          <w:szCs w:val="20"/>
+        </w:rPr>
+        <w:t>(Relative)</w:t>
+      </w:r>
+    </w:p>
+    <w:p>
+      <w:pPr>
+        <w:pStyle w:val="Normal"/>
+        <w:spacing w:before="40" w:after="40"/>
+        <w:ind w:left="720"/>
+        <w:rPr/>
+      </w:pPr>
+      <w:r>
+        <w:rPr>
+          <w:rFonts w:eastAsia="Courier New" w:cs="Courier New" w:ascii="Courier New" w:hAnsi="Courier New"/>
+          <w:color w:val="333333"/>
+          <w:sz w:val="20"/>
+          <w:szCs w:val="20"/>
+        </w:rPr>
+        <w:t>GOTO [1]   (Segmented)</w:t>
+      </w:r>
+    </w:p>
+    <w:p>
+      <w:pPr>
+        <w:pStyle w:val="Normal"/>
+        <w:spacing w:before="40" w:after="40"/>
+        <w:ind w:left="720"/>
+        <w:rPr/>
+      </w:pPr>
+      <w:r>
+        <w:rPr>
+          <w:rFonts w:eastAsia="Courier New" w:cs="Courier New" w:ascii="Courier New" w:hAnsi="Courier New"/>
+          <w:color w:val="333333"/>
+          <w:sz w:val="20"/>
+          <w:szCs w:val="20"/>
+        </w:rPr>
+        <w:t>GOTO [2]+2 (Segmented offset)</w:t>
       </w:r>
     </w:p>
     <w:p>
@@ -1286,41 +1746,93 @@
       <w:pPr>
         <w:pStyle w:val="Normal"/>
         <w:spacing w:before="40" w:after="40"/>
-        <w:ind w:start="720"/>
-        <w:rPr/>
-      </w:pPr>
-      <w:r>
-        <w:rPr>
-          <w:rFonts w:eastAsia="Courier New" w:cs="Courier New" w:ascii="Courier New" w:hAnsi="Courier New"/>
-          <w:color w:val="333333"/>
-          <w:sz w:val="20"/>
-          <w:szCs w:val="20"/>
-        </w:rPr>
-        <w:t>GOSUB 500</w:t>
+        <w:ind w:left="720"/>
+        <w:rPr/>
+      </w:pPr>
+      <w:r>
+        <w:rPr>
+          <w:rFonts w:eastAsia="Courier New" w:cs="Courier New" w:ascii="Courier New" w:hAnsi="Courier New"/>
+          <w:color w:val="333333"/>
+          <w:sz w:val="20"/>
+          <w:szCs w:val="20"/>
+        </w:rPr>
+        <w:t xml:space="preserve">GOSUB 500    </w:t>
+      </w:r>
+      <w:r>
+        <w:rPr>
+          <w:rFonts w:eastAsia="Courier New" w:cs="Courier New" w:ascii="Courier New" w:hAnsi="Courier New"/>
+          <w:color w:val="333333"/>
+          <w:sz w:val="20"/>
+          <w:szCs w:val="20"/>
+        </w:rPr>
+        <w:t>(Line Seek)</w:t>
       </w:r>
     </w:p>
     <w:p>
       <w:pPr>
         <w:pStyle w:val="Normal"/>
         <w:spacing w:before="40" w:after="40"/>
-        <w:ind w:start="720"/>
-        <w:rPr/>
-      </w:pPr>
-      <w:r>
-        <w:rPr>
-          <w:rFonts w:eastAsia="Courier New" w:cs="Courier New" w:ascii="Courier New" w:hAnsi="Courier New"/>
-          <w:color w:val="333333"/>
-          <w:sz w:val="20"/>
-          <w:szCs w:val="20"/>
-        </w:rPr>
-        <w:t>GOSUB +2</w:t>
+        <w:ind w:left="720"/>
+        <w:rPr/>
+      </w:pPr>
+      <w:r>
+        <w:rPr>
+          <w:rFonts w:eastAsia="Courier New" w:cs="Courier New" w:ascii="Courier New" w:hAnsi="Courier New"/>
+          <w:color w:val="333333"/>
+          <w:sz w:val="20"/>
+          <w:szCs w:val="20"/>
+        </w:rPr>
+        <w:t xml:space="preserve">GOSUB +2     </w:t>
+      </w:r>
+      <w:r>
+        <w:rPr>
+          <w:rFonts w:eastAsia="Courier New" w:cs="Courier New" w:ascii="Courier New" w:hAnsi="Courier New"/>
+          <w:color w:val="333333"/>
+          <w:sz w:val="20"/>
+          <w:szCs w:val="20"/>
+        </w:rPr>
+        <w:t>(Relative)</w:t>
       </w:r>
     </w:p>
     <w:p>
       <w:pPr>
         <w:pStyle w:val="Normal"/>
         <w:spacing w:before="40" w:after="40"/>
-        <w:ind w:start="720"/>
+        <w:ind w:left="720"/>
+        <w:rPr/>
+      </w:pPr>
+      <w:r>
+        <w:rPr>
+          <w:rFonts w:eastAsia="Courier New" w:cs="Courier New" w:ascii="Courier New" w:hAnsi="Courier New"/>
+          <w:color w:val="333333"/>
+          <w:sz w:val="20"/>
+          <w:szCs w:val="20"/>
+        </w:rPr>
+        <w:t>GOSUB [4]    (Segmented)</w:t>
+      </w:r>
+    </w:p>
+    <w:p>
+      <w:pPr>
+        <w:pStyle w:val="Normal"/>
+        <w:spacing w:before="40" w:after="40"/>
+        <w:ind w:left="720"/>
+        <w:rPr/>
+      </w:pPr>
+      <w:r>
+        <w:rPr>
+          <w:rFonts w:eastAsia="Courier New" w:cs="Courier New" w:ascii="Courier New" w:hAnsi="Courier New"/>
+          <w:color w:val="333333"/>
+          <w:sz w:val="20"/>
+          <w:szCs w:val="20"/>
+        </w:rPr>
+        <w:t>GOSUB [10]+5 (Segmented offset)</w:t>
+      </w:r>
+    </w:p>
+    <w:p>
+      <w:pPr>
+        <w:pStyle w:val="Normal"/>
+        <w:spacing w:before="40" w:after="40"/>
+        <w:ind w:left="720"/>
         <w:rPr/>
       </w:pPr>
       <w:r>
@@ -1370,7 +1882,7 @@
       <w:pPr>
         <w:pStyle w:val="Normal"/>
         <w:spacing w:before="40" w:after="40"/>
-        <w:ind w:start="720"/>
+        <w:ind w:left="720"/>
         <w:rPr/>
       </w:pPr>
       <w:r>
@@ -1387,7 +1899,7 @@
       <w:pPr>
         <w:pStyle w:val="Normal"/>
         <w:spacing w:before="40" w:after="40"/>
-        <w:ind w:start="720"/>
+        <w:ind w:left="720"/>
         <w:rPr/>
       </w:pPr>
       <w:r>
@@ -1404,7 +1916,41 @@
       <w:pPr>
         <w:pStyle w:val="Normal"/>
         <w:spacing w:before="40" w:after="40"/>
-        <w:ind w:start="720"/>
+        <w:ind w:left="720"/>
+        <w:rPr/>
+      </w:pPr>
+      <w:r>
+        <w:rPr>
+          <w:rFonts w:eastAsia="Courier New" w:cs="Courier New" w:ascii="Courier New" w:hAnsi="Courier New"/>
+          <w:color w:val="333333"/>
+          <w:sz w:val="20"/>
+          <w:szCs w:val="20"/>
+        </w:rPr>
+        <w:t>IF expr THEN [n]             : REM segmented jump</w:t>
+      </w:r>
+    </w:p>
+    <w:p>
+      <w:pPr>
+        <w:pStyle w:val="Normal"/>
+        <w:spacing w:before="40" w:after="40"/>
+        <w:ind w:left="720"/>
+        <w:rPr/>
+      </w:pPr>
+      <w:r>
+        <w:rPr>
+          <w:rFonts w:eastAsia="Courier New" w:cs="Courier New" w:ascii="Courier New" w:hAnsi="Courier New"/>
+          <w:color w:val="333333"/>
+          <w:sz w:val="20"/>
+          <w:szCs w:val="20"/>
+        </w:rPr>
+        <w:t>IF expr THEN [n]+offset      : REM segmented jump with forward offset</w:t>
+      </w:r>
+    </w:p>
+    <w:p>
+      <w:pPr>
+        <w:pStyle w:val="Normal"/>
+        <w:spacing w:before="40" w:after="40"/>
+        <w:ind w:left="720"/>
         <w:rPr/>
       </w:pPr>
       <w:r>
@@ -1454,7 +2000,7 @@
       <w:pPr>
         <w:pStyle w:val="Normal"/>
         <w:spacing w:before="40" w:after="40"/>
-        <w:ind w:start="720"/>
+        <w:ind w:left="720"/>
         <w:rPr/>
       </w:pPr>
       <w:r>
@@ -1465,6 +2011,42 @@
           <w:szCs w:val="20"/>
         </w:rPr>
         <w:t>LIF A &gt; 10 THEN PRINT "big" : GOSUB 900 : A = 0</w:t>
+      </w:r>
+    </w:p>
+    <w:p>
+      <w:pPr>
+        <w:pStyle w:val="Normal"/>
+        <w:spacing w:before="40" w:after="40"/>
+        <w:ind w:left="720"/>
+        <w:rPr>
+          <w:rFonts w:ascii="Courier New" w:hAnsi="Courier New" w:eastAsia="Courier New" w:cs="Courier New"/>
+          <w:color w:val="333333"/>
+          <w:sz w:val="20"/>
+          <w:szCs w:val="20"/>
+        </w:rPr>
+      </w:pPr>
+      <w:r>
+        <w:rPr/>
+      </w:r>
+    </w:p>
+    <w:p>
+      <w:pPr>
+        <w:pStyle w:val="Heading2"/>
+        <w:spacing w:before="280" w:after="80"/>
+        <w:rPr>
+          <w:rFonts w:ascii="Arial" w:hAnsi="Arial" w:eastAsia="Arial" w:cs="Arial"/>
+          <w:b/>
+          <w:bCs/>
+          <w:color w:val="1F3864"/>
+          <w:sz w:val="26"/>
+          <w:szCs w:val="26"/>
+        </w:rPr>
+      </w:pPr>
+      <w:r>
+        <w:rPr/>
+      </w:r>
+      <w:r>
+        <w:br w:type="page"/>
       </w:r>
     </w:p>
     <w:p>
@@ -1504,7 +2086,7 @@
       <w:pPr>
         <w:pStyle w:val="Normal"/>
         <w:spacing w:before="40" w:after="40"/>
-        <w:ind w:start="720"/>
+        <w:ind w:left="720"/>
         <w:rPr/>
       </w:pPr>
       <w:r>
@@ -1521,7 +2103,7 @@
       <w:pPr>
         <w:pStyle w:val="Normal"/>
         <w:spacing w:before="40" w:after="40"/>
-        <w:ind w:start="720"/>
+        <w:ind w:left="720"/>
         <w:rPr/>
       </w:pPr>
       <w:r>
@@ -1547,7 +2129,7 @@
       <w:pPr>
         <w:pStyle w:val="Normal"/>
         <w:spacing w:before="40" w:after="40"/>
-        <w:ind w:start="720"/>
+        <w:ind w:left="720"/>
         <w:rPr/>
       </w:pPr>
       <w:r>
@@ -1564,7 +2146,7 @@
       <w:pPr>
         <w:pStyle w:val="Normal"/>
         <w:spacing w:before="40" w:after="40"/>
-        <w:ind w:start="720"/>
+        <w:ind w:left="720"/>
         <w:rPr/>
       </w:pPr>
       <w:r>
@@ -1575,7 +2157,7 @@
       <w:pPr>
         <w:pStyle w:val="Normal"/>
         <w:spacing w:before="40" w:after="40"/>
-        <w:ind w:start="720"/>
+        <w:ind w:left="720"/>
         <w:rPr/>
       </w:pPr>
       <w:r>
@@ -1592,7 +2174,7 @@
       <w:pPr>
         <w:pStyle w:val="Normal"/>
         <w:spacing w:before="40" w:after="40"/>
-        <w:ind w:start="720"/>
+        <w:ind w:left="720"/>
         <w:rPr/>
       </w:pPr>
       <w:r>
@@ -1618,7 +2200,7 @@
       <w:pPr>
         <w:pStyle w:val="Normal"/>
         <w:spacing w:before="40" w:after="40"/>
-        <w:ind w:start="720"/>
+        <w:ind w:left="720"/>
         <w:rPr/>
       </w:pPr>
       <w:r>
@@ -1629,6 +2211,51 @@
           <w:szCs w:val="20"/>
         </w:rPr>
         <w:t>NEXT</w:t>
+      </w:r>
+    </w:p>
+    <w:p>
+      <w:pPr>
+        <w:pStyle w:val="Heading2"/>
+        <w:rPr/>
+      </w:pPr>
+      <w:r>
+        <w:rPr/>
+        <w:t>Nesting:</w:t>
+      </w:r>
+    </w:p>
+    <w:p>
+      <w:pPr>
+        <w:pStyle w:val="BodyText"/>
+        <w:rPr/>
+      </w:pPr>
+      <w:r>
+        <w:rPr/>
+        <w:t xml:space="preserve">There is a limit to the number of nested </w:t>
+      </w:r>
+      <w:r>
+        <w:rPr>
+          <w:b/>
+          <w:bCs/>
+        </w:rPr>
+        <w:t>FOR</w:t>
+      </w:r>
+      <w:r>
+        <w:rPr/>
+        <w:t xml:space="preserve"> and </w:t>
+      </w:r>
+      <w:r>
+        <w:rPr>
+          <w:b/>
+          <w:bCs/>
+        </w:rPr>
+        <w:t>GOSUB</w:t>
+      </w:r>
+      <w:r>
+        <w:rPr/>
+        <w:t xml:space="preserve"> statements</w:t>
+      </w:r>
+      <w:r>
+        <w:br w:type="page"/>
       </w:r>
     </w:p>
     <w:p>
@@ -1646,7 +2273,18 @@
           <w:sz w:val="32"/>
           <w:szCs w:val="32"/>
         </w:rPr>
-        <w:t>Relative Jumps</w:t>
+        <w:t xml:space="preserve">Relative Jump </w:t>
+      </w:r>
+      <w:r>
+        <w:rPr>
+          <w:rFonts w:eastAsia="Arial" w:cs="Arial" w:ascii="Arial" w:hAnsi="Arial"/>
+          <w:b/>
+          <w:bCs/>
+          <w:color w:val="1F3864"/>
+          <w:sz w:val="32"/>
+          <w:szCs w:val="32"/>
+        </w:rPr>
+        <w:t>examples</w:t>
       </w:r>
     </w:p>
     <w:p>
@@ -1667,18 +2305,18 @@
     <w:tbl>
       <w:tblPr>
         <w:tblW w:w="9360" w:type="dxa"/>
-        <w:jc w:val="start"/>
+        <w:jc w:val="left"/>
         <w:tblInd w:w="0" w:type="dxa"/>
         <w:tblLayout w:type="fixed"/>
         <w:tblCellMar>
           <w:top w:w="80" w:type="dxa"/>
-          <w:start w:w="120" w:type="dxa"/>
+          <w:left w:w="120" w:type="dxa"/>
           <w:bottom w:w="80" w:type="dxa"/>
-          <w:end w:w="120" w:type="dxa"/>
+          <w:right w:w="120" w:type="dxa"/>
         </w:tblCellMar>
       </w:tblPr>
       <w:tblGrid>
-        <w:gridCol w:w="2999"/>
+        <w:gridCol w:w="2998"/>
         <w:gridCol w:w="6361"/>
       </w:tblGrid>
       <w:tr>
@@ -1687,12 +2325,12 @@
         </w:trPr>
         <w:tc>
           <w:tcPr>
-            <w:tcW w:w="2999" w:type="dxa"/>
-            <w:tcBorders>
-              <w:top w:val="single" w:sz="2" w:space="0" w:color="CCCCCC"/>
-              <w:start w:val="single" w:sz="2" w:space="0" w:color="CCCCCC"/>
-              <w:bottom w:val="single" w:sz="2" w:space="0" w:color="CCCCCC"/>
-              <w:end w:val="single" w:sz="2" w:space="0" w:color="CCCCCC"/>
+            <w:tcW w:w="2998" w:type="dxa"/>
+            <w:tcBorders>
+              <w:top w:val="single" w:sz="2" w:space="0" w:color="CCCCCC"/>
+              <w:left w:val="single" w:sz="2" w:space="0" w:color="CCCCCC"/>
+              <w:bottom w:val="single" w:sz="2" w:space="0" w:color="CCCCCC"/>
+              <w:right w:val="single" w:sz="2" w:space="0" w:color="CCCCCC"/>
             </w:tcBorders>
             <w:shd w:fill="2E5090" w:val="clear"/>
           </w:tcPr>
@@ -1719,9 +2357,9 @@
             <w:tcW w:w="6361" w:type="dxa"/>
             <w:tcBorders>
               <w:top w:val="single" w:sz="2" w:space="0" w:color="CCCCCC"/>
-              <w:start w:val="single" w:sz="2" w:space="0" w:color="CCCCCC"/>
-              <w:bottom w:val="single" w:sz="2" w:space="0" w:color="CCCCCC"/>
-              <w:end w:val="single" w:sz="2" w:space="0" w:color="CCCCCC"/>
+              <w:left w:val="single" w:sz="2" w:space="0" w:color="CCCCCC"/>
+              <w:bottom w:val="single" w:sz="2" w:space="0" w:color="CCCCCC"/>
+              <w:right w:val="single" w:sz="2" w:space="0" w:color="CCCCCC"/>
             </w:tcBorders>
             <w:shd w:fill="2E5090" w:val="clear"/>
           </w:tcPr>
@@ -1748,12 +2386,12 @@
         <w:trPr/>
         <w:tc>
           <w:tcPr>
-            <w:tcW w:w="2999" w:type="dxa"/>
-            <w:tcBorders>
-              <w:top w:val="single" w:sz="2" w:space="0" w:color="CCCCCC"/>
-              <w:start w:val="single" w:sz="2" w:space="0" w:color="CCCCCC"/>
-              <w:bottom w:val="single" w:sz="2" w:space="0" w:color="CCCCCC"/>
-              <w:end w:val="single" w:sz="2" w:space="0" w:color="CCCCCC"/>
+            <w:tcW w:w="2998" w:type="dxa"/>
+            <w:tcBorders>
+              <w:top w:val="single" w:sz="2" w:space="0" w:color="CCCCCC"/>
+              <w:left w:val="single" w:sz="2" w:space="0" w:color="CCCCCC"/>
+              <w:bottom w:val="single" w:sz="2" w:space="0" w:color="CCCCCC"/>
+              <w:right w:val="single" w:sz="2" w:space="0" w:color="CCCCCC"/>
             </w:tcBorders>
             <w:shd w:fill="F0F0F0" w:val="clear"/>
           </w:tcPr>
@@ -1779,9 +2417,9 @@
             <w:tcW w:w="6361" w:type="dxa"/>
             <w:tcBorders>
               <w:top w:val="single" w:sz="2" w:space="0" w:color="CCCCCC"/>
-              <w:start w:val="single" w:sz="2" w:space="0" w:color="CCCCCC"/>
-              <w:bottom w:val="single" w:sz="2" w:space="0" w:color="CCCCCC"/>
-              <w:end w:val="single" w:sz="2" w:space="0" w:color="CCCCCC"/>
+              <w:left w:val="single" w:sz="2" w:space="0" w:color="CCCCCC"/>
+              <w:bottom w:val="single" w:sz="2" w:space="0" w:color="CCCCCC"/>
+              <w:right w:val="single" w:sz="2" w:space="0" w:color="CCCCCC"/>
             </w:tcBorders>
             <w:shd w:fill="FFFFFF" w:val="clear"/>
           </w:tcPr>
@@ -1807,12 +2445,12 @@
         <w:trPr/>
         <w:tc>
           <w:tcPr>
-            <w:tcW w:w="2999" w:type="dxa"/>
-            <w:tcBorders>
-              <w:top w:val="single" w:sz="2" w:space="0" w:color="CCCCCC"/>
-              <w:start w:val="single" w:sz="2" w:space="0" w:color="CCCCCC"/>
-              <w:bottom w:val="single" w:sz="2" w:space="0" w:color="CCCCCC"/>
-              <w:end w:val="single" w:sz="2" w:space="0" w:color="CCCCCC"/>
+            <w:tcW w:w="2998" w:type="dxa"/>
+            <w:tcBorders>
+              <w:top w:val="single" w:sz="2" w:space="0" w:color="CCCCCC"/>
+              <w:left w:val="single" w:sz="2" w:space="0" w:color="CCCCCC"/>
+              <w:bottom w:val="single" w:sz="2" w:space="0" w:color="CCCCCC"/>
+              <w:right w:val="single" w:sz="2" w:space="0" w:color="CCCCCC"/>
             </w:tcBorders>
             <w:shd w:fill="F0F0F0" w:val="clear"/>
           </w:tcPr>
@@ -1838,9 +2476,9 @@
             <w:tcW w:w="6361" w:type="dxa"/>
             <w:tcBorders>
               <w:top w:val="single" w:sz="2" w:space="0" w:color="CCCCCC"/>
-              <w:start w:val="single" w:sz="2" w:space="0" w:color="CCCCCC"/>
-              <w:bottom w:val="single" w:sz="2" w:space="0" w:color="CCCCCC"/>
-              <w:end w:val="single" w:sz="2" w:space="0" w:color="CCCCCC"/>
+              <w:left w:val="single" w:sz="2" w:space="0" w:color="CCCCCC"/>
+              <w:bottom w:val="single" w:sz="2" w:space="0" w:color="CCCCCC"/>
+              <w:right w:val="single" w:sz="2" w:space="0" w:color="CCCCCC"/>
             </w:tcBorders>
             <w:shd w:fill="FFFFFF" w:val="clear"/>
           </w:tcPr>
@@ -1866,12 +2504,12 @@
         <w:trPr/>
         <w:tc>
           <w:tcPr>
-            <w:tcW w:w="2999" w:type="dxa"/>
-            <w:tcBorders>
-              <w:top w:val="single" w:sz="2" w:space="0" w:color="CCCCCC"/>
-              <w:start w:val="single" w:sz="2" w:space="0" w:color="CCCCCC"/>
-              <w:bottom w:val="single" w:sz="2" w:space="0" w:color="CCCCCC"/>
-              <w:end w:val="single" w:sz="2" w:space="0" w:color="CCCCCC"/>
+            <w:tcW w:w="2998" w:type="dxa"/>
+            <w:tcBorders>
+              <w:top w:val="single" w:sz="2" w:space="0" w:color="CCCCCC"/>
+              <w:left w:val="single" w:sz="2" w:space="0" w:color="CCCCCC"/>
+              <w:bottom w:val="single" w:sz="2" w:space="0" w:color="CCCCCC"/>
+              <w:right w:val="single" w:sz="2" w:space="0" w:color="CCCCCC"/>
             </w:tcBorders>
             <w:shd w:fill="F0F0F0" w:val="clear"/>
           </w:tcPr>
@@ -1897,9 +2535,9 @@
             <w:tcW w:w="6361" w:type="dxa"/>
             <w:tcBorders>
               <w:top w:val="single" w:sz="2" w:space="0" w:color="CCCCCC"/>
-              <w:start w:val="single" w:sz="2" w:space="0" w:color="CCCCCC"/>
-              <w:bottom w:val="single" w:sz="2" w:space="0" w:color="CCCCCC"/>
-              <w:end w:val="single" w:sz="2" w:space="0" w:color="CCCCCC"/>
+              <w:left w:val="single" w:sz="2" w:space="0" w:color="CCCCCC"/>
+              <w:bottom w:val="single" w:sz="2" w:space="0" w:color="CCCCCC"/>
+              <w:right w:val="single" w:sz="2" w:space="0" w:color="CCCCCC"/>
             </w:tcBorders>
             <w:shd w:fill="FFFFFF" w:val="clear"/>
           </w:tcPr>
@@ -1951,7 +2589,7 @@
       <w:pPr>
         <w:pStyle w:val="Normal"/>
         <w:spacing w:before="40" w:after="40"/>
-        <w:ind w:start="720"/>
+        <w:ind w:left="720"/>
         <w:rPr/>
       </w:pPr>
       <w:r>
@@ -1968,7 +2606,7 @@
       <w:pPr>
         <w:pStyle w:val="Normal"/>
         <w:spacing w:before="40" w:after="40"/>
-        <w:ind w:start="720"/>
+        <w:ind w:left="720"/>
         <w:rPr/>
       </w:pPr>
       <w:r>
@@ -1985,7 +2623,7 @@
       <w:pPr>
         <w:pStyle w:val="Normal"/>
         <w:spacing w:before="40" w:after="40"/>
-        <w:ind w:start="720"/>
+        <w:ind w:left="720"/>
         <w:rPr/>
       </w:pPr>
       <w:r>
@@ -2010,15 +2648,7 @@
           <w:sz w:val="20"/>
           <w:szCs w:val="20"/>
         </w:rPr>
-        <w:t xml:space="preserve">In the example above, if A equals zero line 110 is skipped and execution resumes at line 120. </w:t>
-      </w:r>
-      <w:r>
-        <w:rPr>
-          <w:rFonts w:eastAsia="Arial" w:cs="Arial"/>
-          <w:sz w:val="20"/>
-          <w:szCs w:val="20"/>
-        </w:rPr>
-        <w:t xml:space="preserve">Relative jumps are faster than a line number jump, and take fewer operations to complete. </w:t>
+        <w:t xml:space="preserve">In the example above, if A equals zero line 110 is skipped and execution resumes at line 120. Relative jumps are faster than a line number jump, and take fewer operations to complete. </w:t>
       </w:r>
     </w:p>
     <w:p>
@@ -2044,7 +2674,7 @@
         <w:pStyle w:val="ListParagraph"/>
         <w:numPr>
           <w:ilvl w:val="0"/>
-          <w:numId w:val="3"/>
+          <w:numId w:val="4"/>
         </w:numPr>
         <w:spacing w:before="0" w:after="60"/>
         <w:rPr/>
@@ -2063,7 +2693,7 @@
         <w:pStyle w:val="ListParagraph"/>
         <w:numPr>
           <w:ilvl w:val="0"/>
-          <w:numId w:val="1"/>
+          <w:numId w:val="5"/>
         </w:numPr>
         <w:spacing w:before="0" w:after="60"/>
         <w:rPr/>
@@ -2082,7 +2712,7 @@
         <w:pStyle w:val="ListParagraph"/>
         <w:numPr>
           <w:ilvl w:val="0"/>
-          <w:numId w:val="1"/>
+          <w:numId w:val="6"/>
         </w:numPr>
         <w:spacing w:before="0" w:after="60"/>
         <w:rPr/>
@@ -2101,7 +2731,7 @@
         <w:pStyle w:val="ListParagraph"/>
         <w:numPr>
           <w:ilvl w:val="0"/>
-          <w:numId w:val="1"/>
+          <w:numId w:val="7"/>
         </w:numPr>
         <w:spacing w:before="0" w:after="60"/>
         <w:rPr/>
@@ -2120,7 +2750,7 @@
         <w:pStyle w:val="ListParagraph"/>
         <w:numPr>
           <w:ilvl w:val="0"/>
-          <w:numId w:val="1"/>
+          <w:numId w:val="8"/>
         </w:numPr>
         <w:spacing w:before="0" w:after="60"/>
         <w:rPr/>
@@ -2131,7 +2761,34 @@
           <w:sz w:val="20"/>
           <w:szCs w:val="20"/>
         </w:rPr>
-        <w:t>When used with GOSUB +n, RETURN brings execution back to the statement immediately following the GOSUB.</w:t>
+        <w:t xml:space="preserve">When used with GOSUB +n, RETURN brings execution back to the statement immediately following </w:t>
+      </w:r>
+      <w:r>
+        <w:rPr>
+          <w:rFonts w:eastAsia="Arial" w:cs="Arial"/>
+          <w:sz w:val="20"/>
+          <w:szCs w:val="20"/>
+        </w:rPr>
+        <w:t>GOSUB.</w:t>
+      </w:r>
+    </w:p>
+    <w:p>
+      <w:pPr>
+        <w:pStyle w:val="ListParagraph"/>
+        <w:numPr>
+          <w:ilvl w:val="0"/>
+          <w:numId w:val="9"/>
+        </w:numPr>
+        <w:spacing w:before="0" w:after="60"/>
+        <w:rPr/>
+      </w:pPr>
+      <w:r>
+        <w:rPr>
+          <w:rFonts w:eastAsia="Arial" w:cs="Arial"/>
+          <w:sz w:val="20"/>
+          <w:szCs w:val="20"/>
+        </w:rPr>
+        <w:t>GOSUB and FOR loops share the nesting limits.  FOR loops take a larger space in the stack than a GOSUB.  Limited nesting is allowed but may generate an error if nested too deeply, especially on a large target.</w:t>
       </w:r>
     </w:p>
     <w:p>
@@ -2156,7 +2813,7 @@
       <w:pPr>
         <w:pStyle w:val="Normal"/>
         <w:spacing w:before="40" w:after="40"/>
-        <w:ind w:start="720"/>
+        <w:ind w:left="720"/>
         <w:rPr/>
       </w:pPr>
       <w:r>
@@ -2173,7 +2830,7 @@
       <w:pPr>
         <w:pStyle w:val="Normal"/>
         <w:spacing w:before="40" w:after="40"/>
-        <w:ind w:start="720"/>
+        <w:ind w:left="720"/>
         <w:rPr/>
       </w:pPr>
       <w:r>
@@ -2190,7 +2847,7 @@
       <w:pPr>
         <w:pStyle w:val="Normal"/>
         <w:spacing w:before="40" w:after="40"/>
-        <w:ind w:start="720"/>
+        <w:ind w:left="720"/>
         <w:rPr/>
       </w:pPr>
       <w:r>
@@ -2207,7 +2864,7 @@
       <w:pPr>
         <w:pStyle w:val="Normal"/>
         <w:spacing w:before="40" w:after="40"/>
-        <w:ind w:start="720"/>
+        <w:ind w:left="720"/>
         <w:rPr/>
       </w:pPr>
       <w:r>
@@ -2224,7 +2881,7 @@
       <w:pPr>
         <w:pStyle w:val="Normal"/>
         <w:spacing w:before="40" w:after="40"/>
-        <w:ind w:start="720"/>
+        <w:ind w:left="720"/>
         <w:rPr/>
       </w:pPr>
       <w:r>
@@ -2241,7 +2898,7 @@
       <w:pPr>
         <w:pStyle w:val="Normal"/>
         <w:spacing w:before="40" w:after="40"/>
-        <w:ind w:start="720"/>
+        <w:ind w:left="720"/>
         <w:rPr/>
       </w:pPr>
       <w:r>
@@ -2258,7 +2915,7 @@
       <w:pPr>
         <w:pStyle w:val="Normal"/>
         <w:spacing w:before="40" w:after="40"/>
-        <w:ind w:start="720"/>
+        <w:ind w:left="720"/>
         <w:rPr/>
       </w:pPr>
       <w:r>
@@ -2275,7 +2932,7 @@
       <w:pPr>
         <w:pStyle w:val="Normal"/>
         <w:spacing w:before="40" w:after="40"/>
-        <w:ind w:start="720"/>
+        <w:ind w:left="720"/>
         <w:rPr/>
       </w:pPr>
       <w:r>
@@ -2292,7 +2949,7 @@
       <w:pPr>
         <w:pStyle w:val="Normal"/>
         <w:spacing w:before="40" w:after="40"/>
-        <w:ind w:start="720"/>
+        <w:ind w:left="720"/>
         <w:rPr/>
       </w:pPr>
       <w:r>
@@ -2370,7 +3027,7 @@
       <w:pPr>
         <w:pStyle w:val="Normal"/>
         <w:spacing w:before="40" w:after="40"/>
-        <w:ind w:start="720"/>
+        <w:ind w:left="720"/>
         <w:rPr/>
       </w:pPr>
       <w:r>
@@ -2420,7 +3077,7 @@
       <w:pPr>
         <w:pStyle w:val="Normal"/>
         <w:spacing w:before="40" w:after="40"/>
-        <w:ind w:start="720"/>
+        <w:ind w:left="720"/>
         <w:rPr/>
       </w:pPr>
       <w:r>
@@ -2470,7 +3127,7 @@
       <w:pPr>
         <w:pStyle w:val="Normal"/>
         <w:spacing w:before="40" w:after="40"/>
-        <w:ind w:start="720"/>
+        <w:ind w:left="720"/>
         <w:rPr/>
       </w:pPr>
       <w:r>
@@ -2520,7 +3177,7 @@
       <w:pPr>
         <w:pStyle w:val="Normal"/>
         <w:spacing w:before="40" w:after="40"/>
-        <w:ind w:start="720"/>
+        <w:ind w:left="720"/>
         <w:rPr/>
       </w:pPr>
       <w:r>
@@ -2570,7 +3227,7 @@
       <w:pPr>
         <w:pStyle w:val="Normal"/>
         <w:spacing w:before="40" w:after="40"/>
-        <w:ind w:start="720"/>
+        <w:ind w:left="720"/>
         <w:rPr/>
       </w:pPr>
       <w:r>
@@ -2620,7 +3277,7 @@
       <w:pPr>
         <w:pStyle w:val="Normal"/>
         <w:spacing w:before="40" w:after="40"/>
-        <w:ind w:start="720"/>
+        <w:ind w:left="720"/>
         <w:rPr/>
       </w:pPr>
       <w:r>
@@ -2670,7 +3327,7 @@
       <w:pPr>
         <w:pStyle w:val="Normal"/>
         <w:spacing w:before="40" w:after="40"/>
-        <w:ind w:start="720"/>
+        <w:ind w:left="720"/>
         <w:rPr/>
       </w:pPr>
       <w:r>
@@ -2720,7 +3377,7 @@
       <w:pPr>
         <w:pStyle w:val="Normal"/>
         <w:spacing w:before="40" w:after="40"/>
-        <w:ind w:start="720"/>
+        <w:ind w:left="720"/>
         <w:rPr/>
       </w:pPr>
       <w:r>
@@ -2770,7 +3427,7 @@
       <w:pPr>
         <w:pStyle w:val="Normal"/>
         <w:spacing w:before="40" w:after="40"/>
-        <w:ind w:start="720"/>
+        <w:ind w:left="720"/>
         <w:rPr/>
       </w:pPr>
       <w:r>
@@ -2952,7 +3609,7 @@
       <w:pPr>
         <w:pStyle w:val="Normal"/>
         <w:spacing w:before="40" w:after="40"/>
-        <w:ind w:start="720"/>
+        <w:ind w:left="720"/>
         <w:rPr/>
       </w:pPr>
       <w:r>
@@ -2969,7 +3626,7 @@
       <w:pPr>
         <w:pStyle w:val="Normal"/>
         <w:spacing w:before="40" w:after="40"/>
-        <w:ind w:start="720"/>
+        <w:ind w:left="720"/>
         <w:rPr/>
       </w:pPr>
       <w:r>
@@ -2986,7 +3643,7 @@
       <w:pPr>
         <w:pStyle w:val="Normal"/>
         <w:spacing w:before="40" w:after="40"/>
-        <w:ind w:start="720"/>
+        <w:ind w:left="720"/>
         <w:rPr/>
       </w:pPr>
       <w:r>
@@ -3036,7 +3693,7 @@
       <w:pPr>
         <w:pStyle w:val="Normal"/>
         <w:spacing w:before="40" w:after="40"/>
-        <w:ind w:start="720"/>
+        <w:ind w:left="720"/>
         <w:rPr/>
       </w:pPr>
       <w:r>
@@ -3053,7 +3710,7 @@
       <w:pPr>
         <w:pStyle w:val="Normal"/>
         <w:spacing w:before="40" w:after="40"/>
-        <w:ind w:start="720"/>
+        <w:ind w:left="720"/>
         <w:rPr/>
       </w:pPr>
       <w:r>
@@ -3070,7 +3727,7 @@
       <w:pPr>
         <w:pStyle w:val="Normal"/>
         <w:spacing w:before="40" w:after="40"/>
-        <w:ind w:start="720"/>
+        <w:ind w:left="720"/>
         <w:rPr/>
       </w:pPr>
       <w:r>
@@ -3153,7 +3810,7 @@
       <w:pPr>
         <w:pStyle w:val="Normal"/>
         <w:spacing w:before="40" w:after="40"/>
-        <w:ind w:start="720"/>
+        <w:ind w:left="720"/>
         <w:rPr/>
       </w:pPr>
       <w:r>
@@ -3170,7 +3827,7 @@
       <w:pPr>
         <w:pStyle w:val="Normal"/>
         <w:spacing w:before="40" w:after="40"/>
-        <w:ind w:start="720"/>
+        <w:ind w:left="720"/>
         <w:rPr/>
       </w:pPr>
       <w:r>
@@ -3187,7 +3844,7 @@
       <w:pPr>
         <w:pStyle w:val="Normal"/>
         <w:spacing w:before="40" w:after="40"/>
-        <w:ind w:start="720"/>
+        <w:ind w:left="720"/>
         <w:rPr/>
       </w:pPr>
       <w:r>
@@ -3204,7 +3861,7 @@
       <w:pPr>
         <w:pStyle w:val="Normal"/>
         <w:spacing w:before="40" w:after="40"/>
-        <w:ind w:start="720"/>
+        <w:ind w:left="720"/>
         <w:rPr/>
       </w:pPr>
       <w:r>
@@ -3254,7 +3911,7 @@
       <w:pPr>
         <w:pStyle w:val="Normal"/>
         <w:spacing w:before="40" w:after="40"/>
-        <w:ind w:start="720"/>
+        <w:ind w:left="720"/>
         <w:rPr/>
       </w:pPr>
       <w:r>
@@ -3304,7 +3961,7 @@
       <w:pPr>
         <w:pStyle w:val="Normal"/>
         <w:spacing w:before="40" w:after="40"/>
-        <w:ind w:start="720"/>
+        <w:ind w:left="720"/>
         <w:rPr/>
       </w:pPr>
       <w:r>
@@ -3387,7 +4044,7 @@
       <w:pPr>
         <w:pStyle w:val="Normal"/>
         <w:spacing w:before="40" w:after="40"/>
-        <w:ind w:start="720"/>
+        <w:ind w:left="720"/>
         <w:rPr/>
       </w:pPr>
       <w:r>
@@ -3437,7 +4094,7 @@
       <w:pPr>
         <w:pStyle w:val="Normal"/>
         <w:spacing w:before="40" w:after="40"/>
-        <w:ind w:start="720"/>
+        <w:ind w:left="720"/>
         <w:rPr/>
       </w:pPr>
       <w:r>
@@ -3487,7 +4144,7 @@
       <w:pPr>
         <w:pStyle w:val="Normal"/>
         <w:spacing w:before="40" w:after="40"/>
-        <w:ind w:start="720"/>
+        <w:ind w:left="720"/>
         <w:rPr/>
       </w:pPr>
       <w:r>
@@ -3537,7 +4194,7 @@
       <w:pPr>
         <w:pStyle w:val="Normal"/>
         <w:spacing w:before="40" w:after="40"/>
-        <w:ind w:start="720"/>
+        <w:ind w:left="720"/>
         <w:rPr/>
       </w:pPr>
       <w:r>
@@ -3554,7 +4211,7 @@
       <w:pPr>
         <w:pStyle w:val="Normal"/>
         <w:spacing w:before="40" w:after="40"/>
-        <w:ind w:start="720"/>
+        <w:ind w:left="720"/>
         <w:rPr/>
       </w:pPr>
       <w:r>
@@ -3571,7 +4228,7 @@
       <w:pPr>
         <w:pStyle w:val="Normal"/>
         <w:spacing w:before="40" w:after="40"/>
-        <w:ind w:start="720"/>
+        <w:ind w:left="720"/>
         <w:rPr/>
       </w:pPr>
       <w:r>
@@ -3621,7 +4278,7 @@
       <w:pPr>
         <w:pStyle w:val="Normal"/>
         <w:spacing w:before="40" w:after="40"/>
-        <w:ind w:start="720"/>
+        <w:ind w:left="720"/>
         <w:rPr/>
       </w:pPr>
       <w:r>
@@ -3671,7 +4328,7 @@
       <w:pPr>
         <w:pStyle w:val="Normal"/>
         <w:spacing w:before="40" w:after="40"/>
-        <w:ind w:start="720"/>
+        <w:ind w:left="720"/>
         <w:rPr/>
       </w:pPr>
       <w:r>
@@ -3787,7 +4444,7 @@
       <w:pPr>
         <w:pStyle w:val="Normal"/>
         <w:spacing w:before="40" w:after="40"/>
-        <w:ind w:start="720"/>
+        <w:ind w:left="720"/>
         <w:rPr/>
       </w:pPr>
       <w:r>
@@ -3837,7 +4494,7 @@
       <w:pPr>
         <w:pStyle w:val="Normal"/>
         <w:spacing w:before="40" w:after="40"/>
-        <w:ind w:start="720"/>
+        <w:ind w:left="720"/>
         <w:rPr/>
       </w:pPr>
       <w:r>
@@ -3889,18 +4546,18 @@
     <w:tbl>
       <w:tblPr>
         <w:tblW w:w="9360" w:type="dxa"/>
-        <w:jc w:val="start"/>
+        <w:jc w:val="left"/>
         <w:tblInd w:w="0" w:type="dxa"/>
         <w:tblLayout w:type="fixed"/>
         <w:tblCellMar>
           <w:top w:w="80" w:type="dxa"/>
-          <w:start w:w="120" w:type="dxa"/>
+          <w:left w:w="120" w:type="dxa"/>
           <w:bottom w:w="80" w:type="dxa"/>
-          <w:end w:w="120" w:type="dxa"/>
+          <w:right w:w="120" w:type="dxa"/>
         </w:tblCellMar>
       </w:tblPr>
       <w:tblGrid>
-        <w:gridCol w:w="2999"/>
+        <w:gridCol w:w="2998"/>
         <w:gridCol w:w="6361"/>
       </w:tblGrid>
       <w:tr>
@@ -3909,12 +4566,12 @@
         </w:trPr>
         <w:tc>
           <w:tcPr>
-            <w:tcW w:w="2999" w:type="dxa"/>
-            <w:tcBorders>
-              <w:top w:val="single" w:sz="2" w:space="0" w:color="CCCCCC"/>
-              <w:start w:val="single" w:sz="2" w:space="0" w:color="CCCCCC"/>
-              <w:bottom w:val="single" w:sz="2" w:space="0" w:color="CCCCCC"/>
-              <w:end w:val="single" w:sz="2" w:space="0" w:color="CCCCCC"/>
+            <w:tcW w:w="2998" w:type="dxa"/>
+            <w:tcBorders>
+              <w:top w:val="single" w:sz="2" w:space="0" w:color="CCCCCC"/>
+              <w:left w:val="single" w:sz="2" w:space="0" w:color="CCCCCC"/>
+              <w:bottom w:val="single" w:sz="2" w:space="0" w:color="CCCCCC"/>
+              <w:right w:val="single" w:sz="2" w:space="0" w:color="CCCCCC"/>
             </w:tcBorders>
             <w:shd w:fill="2E5090" w:val="clear"/>
           </w:tcPr>
@@ -3941,9 +4598,9 @@
             <w:tcW w:w="6361" w:type="dxa"/>
             <w:tcBorders>
               <w:top w:val="single" w:sz="2" w:space="0" w:color="CCCCCC"/>
-              <w:start w:val="single" w:sz="2" w:space="0" w:color="CCCCCC"/>
-              <w:bottom w:val="single" w:sz="2" w:space="0" w:color="CCCCCC"/>
-              <w:end w:val="single" w:sz="2" w:space="0" w:color="CCCCCC"/>
+              <w:left w:val="single" w:sz="2" w:space="0" w:color="CCCCCC"/>
+              <w:bottom w:val="single" w:sz="2" w:space="0" w:color="CCCCCC"/>
+              <w:right w:val="single" w:sz="2" w:space="0" w:color="CCCCCC"/>
             </w:tcBorders>
             <w:shd w:fill="2E5090" w:val="clear"/>
           </w:tcPr>
@@ -3970,12 +4627,12 @@
         <w:trPr/>
         <w:tc>
           <w:tcPr>
-            <w:tcW w:w="2999" w:type="dxa"/>
-            <w:tcBorders>
-              <w:top w:val="single" w:sz="2" w:space="0" w:color="CCCCCC"/>
-              <w:start w:val="single" w:sz="2" w:space="0" w:color="CCCCCC"/>
-              <w:bottom w:val="single" w:sz="2" w:space="0" w:color="CCCCCC"/>
-              <w:end w:val="single" w:sz="2" w:space="0" w:color="CCCCCC"/>
+            <w:tcW w:w="2998" w:type="dxa"/>
+            <w:tcBorders>
+              <w:top w:val="single" w:sz="2" w:space="0" w:color="CCCCCC"/>
+              <w:left w:val="single" w:sz="2" w:space="0" w:color="CCCCCC"/>
+              <w:bottom w:val="single" w:sz="2" w:space="0" w:color="CCCCCC"/>
+              <w:right w:val="single" w:sz="2" w:space="0" w:color="CCCCCC"/>
             </w:tcBorders>
             <w:shd w:fill="F0F0F0" w:val="clear"/>
           </w:tcPr>
@@ -4001,9 +4658,9 @@
             <w:tcW w:w="6361" w:type="dxa"/>
             <w:tcBorders>
               <w:top w:val="single" w:sz="2" w:space="0" w:color="CCCCCC"/>
-              <w:start w:val="single" w:sz="2" w:space="0" w:color="CCCCCC"/>
-              <w:bottom w:val="single" w:sz="2" w:space="0" w:color="CCCCCC"/>
-              <w:end w:val="single" w:sz="2" w:space="0" w:color="CCCCCC"/>
+              <w:left w:val="single" w:sz="2" w:space="0" w:color="CCCCCC"/>
+              <w:bottom w:val="single" w:sz="2" w:space="0" w:color="CCCCCC"/>
+              <w:right w:val="single" w:sz="2" w:space="0" w:color="CCCCCC"/>
             </w:tcBorders>
             <w:shd w:fill="FFFFFF" w:val="clear"/>
           </w:tcPr>
@@ -4029,12 +4686,12 @@
         <w:trPr/>
         <w:tc>
           <w:tcPr>
-            <w:tcW w:w="2999" w:type="dxa"/>
-            <w:tcBorders>
-              <w:top w:val="single" w:sz="2" w:space="0" w:color="CCCCCC"/>
-              <w:start w:val="single" w:sz="2" w:space="0" w:color="CCCCCC"/>
-              <w:bottom w:val="single" w:sz="2" w:space="0" w:color="CCCCCC"/>
-              <w:end w:val="single" w:sz="2" w:space="0" w:color="CCCCCC"/>
+            <w:tcW w:w="2998" w:type="dxa"/>
+            <w:tcBorders>
+              <w:top w:val="single" w:sz="2" w:space="0" w:color="CCCCCC"/>
+              <w:left w:val="single" w:sz="2" w:space="0" w:color="CCCCCC"/>
+              <w:bottom w:val="single" w:sz="2" w:space="0" w:color="CCCCCC"/>
+              <w:right w:val="single" w:sz="2" w:space="0" w:color="CCCCCC"/>
             </w:tcBorders>
             <w:shd w:fill="F0F0F0" w:val="clear"/>
           </w:tcPr>
@@ -4060,9 +4717,9 @@
             <w:tcW w:w="6361" w:type="dxa"/>
             <w:tcBorders>
               <w:top w:val="single" w:sz="2" w:space="0" w:color="CCCCCC"/>
-              <w:start w:val="single" w:sz="2" w:space="0" w:color="CCCCCC"/>
-              <w:bottom w:val="single" w:sz="2" w:space="0" w:color="CCCCCC"/>
-              <w:end w:val="single" w:sz="2" w:space="0" w:color="CCCCCC"/>
+              <w:left w:val="single" w:sz="2" w:space="0" w:color="CCCCCC"/>
+              <w:bottom w:val="single" w:sz="2" w:space="0" w:color="CCCCCC"/>
+              <w:right w:val="single" w:sz="2" w:space="0" w:color="CCCCCC"/>
             </w:tcBorders>
             <w:shd w:fill="FFFFFF" w:val="clear"/>
           </w:tcPr>
@@ -4088,12 +4745,12 @@
         <w:trPr/>
         <w:tc>
           <w:tcPr>
-            <w:tcW w:w="2999" w:type="dxa"/>
-            <w:tcBorders>
-              <w:top w:val="single" w:sz="2" w:space="0" w:color="CCCCCC"/>
-              <w:start w:val="single" w:sz="2" w:space="0" w:color="CCCCCC"/>
-              <w:bottom w:val="single" w:sz="2" w:space="0" w:color="CCCCCC"/>
-              <w:end w:val="single" w:sz="2" w:space="0" w:color="CCCCCC"/>
+            <w:tcW w:w="2998" w:type="dxa"/>
+            <w:tcBorders>
+              <w:top w:val="single" w:sz="2" w:space="0" w:color="CCCCCC"/>
+              <w:left w:val="single" w:sz="2" w:space="0" w:color="CCCCCC"/>
+              <w:bottom w:val="single" w:sz="2" w:space="0" w:color="CCCCCC"/>
+              <w:right w:val="single" w:sz="2" w:space="0" w:color="CCCCCC"/>
             </w:tcBorders>
             <w:shd w:fill="F0F0F0" w:val="clear"/>
           </w:tcPr>
@@ -4119,9 +4776,9 @@
             <w:tcW w:w="6361" w:type="dxa"/>
             <w:tcBorders>
               <w:top w:val="single" w:sz="2" w:space="0" w:color="CCCCCC"/>
-              <w:start w:val="single" w:sz="2" w:space="0" w:color="CCCCCC"/>
-              <w:bottom w:val="single" w:sz="2" w:space="0" w:color="CCCCCC"/>
-              <w:end w:val="single" w:sz="2" w:space="0" w:color="CCCCCC"/>
+              <w:left w:val="single" w:sz="2" w:space="0" w:color="CCCCCC"/>
+              <w:bottom w:val="single" w:sz="2" w:space="0" w:color="CCCCCC"/>
+              <w:right w:val="single" w:sz="2" w:space="0" w:color="CCCCCC"/>
             </w:tcBorders>
             <w:shd w:fill="FFFFFF" w:val="clear"/>
           </w:tcPr>
@@ -4147,12 +4804,12 @@
         <w:trPr/>
         <w:tc>
           <w:tcPr>
-            <w:tcW w:w="2999" w:type="dxa"/>
-            <w:tcBorders>
-              <w:top w:val="single" w:sz="2" w:space="0" w:color="CCCCCC"/>
-              <w:start w:val="single" w:sz="2" w:space="0" w:color="CCCCCC"/>
-              <w:bottom w:val="single" w:sz="2" w:space="0" w:color="CCCCCC"/>
-              <w:end w:val="single" w:sz="2" w:space="0" w:color="CCCCCC"/>
+            <w:tcW w:w="2998" w:type="dxa"/>
+            <w:tcBorders>
+              <w:top w:val="single" w:sz="2" w:space="0" w:color="CCCCCC"/>
+              <w:left w:val="single" w:sz="2" w:space="0" w:color="CCCCCC"/>
+              <w:bottom w:val="single" w:sz="2" w:space="0" w:color="CCCCCC"/>
+              <w:right w:val="single" w:sz="2" w:space="0" w:color="CCCCCC"/>
             </w:tcBorders>
             <w:shd w:fill="F0F0F0" w:val="clear"/>
           </w:tcPr>
@@ -4178,9 +4835,9 @@
             <w:tcW w:w="6361" w:type="dxa"/>
             <w:tcBorders>
               <w:top w:val="single" w:sz="2" w:space="0" w:color="CCCCCC"/>
-              <w:start w:val="single" w:sz="2" w:space="0" w:color="CCCCCC"/>
-              <w:bottom w:val="single" w:sz="2" w:space="0" w:color="CCCCCC"/>
-              <w:end w:val="single" w:sz="2" w:space="0" w:color="CCCCCC"/>
+              <w:left w:val="single" w:sz="2" w:space="0" w:color="CCCCCC"/>
+              <w:bottom w:val="single" w:sz="2" w:space="0" w:color="CCCCCC"/>
+              <w:right w:val="single" w:sz="2" w:space="0" w:color="CCCCCC"/>
             </w:tcBorders>
             <w:shd w:fill="FFFFFF" w:val="clear"/>
           </w:tcPr>
@@ -4206,12 +4863,12 @@
         <w:trPr/>
         <w:tc>
           <w:tcPr>
-            <w:tcW w:w="2999" w:type="dxa"/>
-            <w:tcBorders>
-              <w:top w:val="single" w:sz="2" w:space="0" w:color="CCCCCC"/>
-              <w:start w:val="single" w:sz="2" w:space="0" w:color="CCCCCC"/>
-              <w:bottom w:val="single" w:sz="2" w:space="0" w:color="CCCCCC"/>
-              <w:end w:val="single" w:sz="2" w:space="0" w:color="CCCCCC"/>
+            <w:tcW w:w="2998" w:type="dxa"/>
+            <w:tcBorders>
+              <w:top w:val="single" w:sz="2" w:space="0" w:color="CCCCCC"/>
+              <w:left w:val="single" w:sz="2" w:space="0" w:color="CCCCCC"/>
+              <w:bottom w:val="single" w:sz="2" w:space="0" w:color="CCCCCC"/>
+              <w:right w:val="single" w:sz="2" w:space="0" w:color="CCCCCC"/>
             </w:tcBorders>
             <w:shd w:fill="F0F0F0" w:val="clear"/>
           </w:tcPr>
@@ -4237,9 +4894,9 @@
             <w:tcW w:w="6361" w:type="dxa"/>
             <w:tcBorders>
               <w:top w:val="single" w:sz="2" w:space="0" w:color="CCCCCC"/>
-              <w:start w:val="single" w:sz="2" w:space="0" w:color="CCCCCC"/>
-              <w:bottom w:val="single" w:sz="2" w:space="0" w:color="CCCCCC"/>
-              <w:end w:val="single" w:sz="2" w:space="0" w:color="CCCCCC"/>
+              <w:left w:val="single" w:sz="2" w:space="0" w:color="CCCCCC"/>
+              <w:bottom w:val="single" w:sz="2" w:space="0" w:color="CCCCCC"/>
+              <w:right w:val="single" w:sz="2" w:space="0" w:color="CCCCCC"/>
             </w:tcBorders>
             <w:shd w:fill="FFFFFF" w:val="clear"/>
           </w:tcPr>
@@ -4265,12 +4922,12 @@
         <w:trPr/>
         <w:tc>
           <w:tcPr>
-            <w:tcW w:w="2999" w:type="dxa"/>
-            <w:tcBorders>
-              <w:top w:val="single" w:sz="2" w:space="0" w:color="CCCCCC"/>
-              <w:start w:val="single" w:sz="2" w:space="0" w:color="CCCCCC"/>
-              <w:bottom w:val="single" w:sz="2" w:space="0" w:color="CCCCCC"/>
-              <w:end w:val="single" w:sz="2" w:space="0" w:color="CCCCCC"/>
+            <w:tcW w:w="2998" w:type="dxa"/>
+            <w:tcBorders>
+              <w:top w:val="single" w:sz="2" w:space="0" w:color="CCCCCC"/>
+              <w:left w:val="single" w:sz="2" w:space="0" w:color="CCCCCC"/>
+              <w:bottom w:val="single" w:sz="2" w:space="0" w:color="CCCCCC"/>
+              <w:right w:val="single" w:sz="2" w:space="0" w:color="CCCCCC"/>
             </w:tcBorders>
             <w:shd w:fill="F0F0F0" w:val="clear"/>
           </w:tcPr>
@@ -4296,9 +4953,9 @@
             <w:tcW w:w="6361" w:type="dxa"/>
             <w:tcBorders>
               <w:top w:val="single" w:sz="2" w:space="0" w:color="CCCCCC"/>
-              <w:start w:val="single" w:sz="2" w:space="0" w:color="CCCCCC"/>
-              <w:bottom w:val="single" w:sz="2" w:space="0" w:color="CCCCCC"/>
-              <w:end w:val="single" w:sz="2" w:space="0" w:color="CCCCCC"/>
+              <w:left w:val="single" w:sz="2" w:space="0" w:color="CCCCCC"/>
+              <w:bottom w:val="single" w:sz="2" w:space="0" w:color="CCCCCC"/>
+              <w:right w:val="single" w:sz="2" w:space="0" w:color="CCCCCC"/>
             </w:tcBorders>
             <w:shd w:fill="FFFFFF" w:val="clear"/>
           </w:tcPr>
@@ -4324,12 +4981,12 @@
         <w:trPr/>
         <w:tc>
           <w:tcPr>
-            <w:tcW w:w="2999" w:type="dxa"/>
-            <w:tcBorders>
-              <w:top w:val="single" w:sz="2" w:space="0" w:color="CCCCCC"/>
-              <w:start w:val="single" w:sz="2" w:space="0" w:color="CCCCCC"/>
-              <w:bottom w:val="single" w:sz="2" w:space="0" w:color="CCCCCC"/>
-              <w:end w:val="single" w:sz="2" w:space="0" w:color="CCCCCC"/>
+            <w:tcW w:w="2998" w:type="dxa"/>
+            <w:tcBorders>
+              <w:top w:val="single" w:sz="2" w:space="0" w:color="CCCCCC"/>
+              <w:left w:val="single" w:sz="2" w:space="0" w:color="CCCCCC"/>
+              <w:bottom w:val="single" w:sz="2" w:space="0" w:color="CCCCCC"/>
+              <w:right w:val="single" w:sz="2" w:space="0" w:color="CCCCCC"/>
             </w:tcBorders>
             <w:shd w:fill="F0F0F0" w:val="clear"/>
           </w:tcPr>
@@ -4355,9 +5012,9 @@
             <w:tcW w:w="6361" w:type="dxa"/>
             <w:tcBorders>
               <w:top w:val="single" w:sz="2" w:space="0" w:color="CCCCCC"/>
-              <w:start w:val="single" w:sz="2" w:space="0" w:color="CCCCCC"/>
-              <w:bottom w:val="single" w:sz="2" w:space="0" w:color="CCCCCC"/>
-              <w:end w:val="single" w:sz="2" w:space="0" w:color="CCCCCC"/>
+              <w:left w:val="single" w:sz="2" w:space="0" w:color="CCCCCC"/>
+              <w:bottom w:val="single" w:sz="2" w:space="0" w:color="CCCCCC"/>
+              <w:right w:val="single" w:sz="2" w:space="0" w:color="CCCCCC"/>
             </w:tcBorders>
             <w:shd w:fill="FFFFFF" w:val="clear"/>
           </w:tcPr>
@@ -4383,12 +5040,12 @@
         <w:trPr/>
         <w:tc>
           <w:tcPr>
-            <w:tcW w:w="2999" w:type="dxa"/>
-            <w:tcBorders>
-              <w:top w:val="single" w:sz="2" w:space="0" w:color="CCCCCC"/>
-              <w:start w:val="single" w:sz="2" w:space="0" w:color="CCCCCC"/>
-              <w:bottom w:val="single" w:sz="2" w:space="0" w:color="CCCCCC"/>
-              <w:end w:val="single" w:sz="2" w:space="0" w:color="CCCCCC"/>
+            <w:tcW w:w="2998" w:type="dxa"/>
+            <w:tcBorders>
+              <w:top w:val="single" w:sz="2" w:space="0" w:color="CCCCCC"/>
+              <w:left w:val="single" w:sz="2" w:space="0" w:color="CCCCCC"/>
+              <w:bottom w:val="single" w:sz="2" w:space="0" w:color="CCCCCC"/>
+              <w:right w:val="single" w:sz="2" w:space="0" w:color="CCCCCC"/>
             </w:tcBorders>
             <w:shd w:fill="F0F0F0" w:val="clear"/>
           </w:tcPr>
@@ -4414,9 +5071,9 @@
             <w:tcW w:w="6361" w:type="dxa"/>
             <w:tcBorders>
               <w:top w:val="single" w:sz="2" w:space="0" w:color="CCCCCC"/>
-              <w:start w:val="single" w:sz="2" w:space="0" w:color="CCCCCC"/>
-              <w:bottom w:val="single" w:sz="2" w:space="0" w:color="CCCCCC"/>
-              <w:end w:val="single" w:sz="2" w:space="0" w:color="CCCCCC"/>
+              <w:left w:val="single" w:sz="2" w:space="0" w:color="CCCCCC"/>
+              <w:bottom w:val="single" w:sz="2" w:space="0" w:color="CCCCCC"/>
+              <w:right w:val="single" w:sz="2" w:space="0" w:color="CCCCCC"/>
             </w:tcBorders>
             <w:shd w:fill="FFFFFF" w:val="clear"/>
           </w:tcPr>
@@ -4470,18 +5127,18 @@
     <w:tbl>
       <w:tblPr>
         <w:tblW w:w="9360" w:type="dxa"/>
-        <w:jc w:val="start"/>
+        <w:jc w:val="left"/>
         <w:tblInd w:w="0" w:type="dxa"/>
         <w:tblLayout w:type="fixed"/>
         <w:tblCellMar>
           <w:top w:w="80" w:type="dxa"/>
-          <w:start w:w="120" w:type="dxa"/>
+          <w:left w:w="120" w:type="dxa"/>
           <w:bottom w:w="80" w:type="dxa"/>
-          <w:end w:w="120" w:type="dxa"/>
+          <w:right w:w="120" w:type="dxa"/>
         </w:tblCellMar>
       </w:tblPr>
       <w:tblGrid>
-        <w:gridCol w:w="2999"/>
+        <w:gridCol w:w="2998"/>
         <w:gridCol w:w="6361"/>
       </w:tblGrid>
       <w:tr>
@@ -4490,12 +5147,12 @@
         </w:trPr>
         <w:tc>
           <w:tcPr>
-            <w:tcW w:w="2999" w:type="dxa"/>
-            <w:tcBorders>
-              <w:top w:val="single" w:sz="2" w:space="0" w:color="CCCCCC"/>
-              <w:start w:val="single" w:sz="2" w:space="0" w:color="CCCCCC"/>
-              <w:bottom w:val="single" w:sz="2" w:space="0" w:color="CCCCCC"/>
-              <w:end w:val="single" w:sz="2" w:space="0" w:color="CCCCCC"/>
+            <w:tcW w:w="2998" w:type="dxa"/>
+            <w:tcBorders>
+              <w:top w:val="single" w:sz="2" w:space="0" w:color="CCCCCC"/>
+              <w:left w:val="single" w:sz="2" w:space="0" w:color="CCCCCC"/>
+              <w:bottom w:val="single" w:sz="2" w:space="0" w:color="CCCCCC"/>
+              <w:right w:val="single" w:sz="2" w:space="0" w:color="CCCCCC"/>
             </w:tcBorders>
             <w:shd w:fill="2E5090" w:val="clear"/>
           </w:tcPr>
@@ -4522,9 +5179,9 @@
             <w:tcW w:w="6361" w:type="dxa"/>
             <w:tcBorders>
               <w:top w:val="single" w:sz="2" w:space="0" w:color="CCCCCC"/>
-              <w:start w:val="single" w:sz="2" w:space="0" w:color="CCCCCC"/>
-              <w:bottom w:val="single" w:sz="2" w:space="0" w:color="CCCCCC"/>
-              <w:end w:val="single" w:sz="2" w:space="0" w:color="CCCCCC"/>
+              <w:left w:val="single" w:sz="2" w:space="0" w:color="CCCCCC"/>
+              <w:bottom w:val="single" w:sz="2" w:space="0" w:color="CCCCCC"/>
+              <w:right w:val="single" w:sz="2" w:space="0" w:color="CCCCCC"/>
             </w:tcBorders>
             <w:shd w:fill="2E5090" w:val="clear"/>
           </w:tcPr>
@@ -4551,12 +5208,12 @@
         <w:trPr/>
         <w:tc>
           <w:tcPr>
-            <w:tcW w:w="2999" w:type="dxa"/>
-            <w:tcBorders>
-              <w:top w:val="single" w:sz="2" w:space="0" w:color="CCCCCC"/>
-              <w:start w:val="single" w:sz="2" w:space="0" w:color="CCCCCC"/>
-              <w:bottom w:val="single" w:sz="2" w:space="0" w:color="CCCCCC"/>
-              <w:end w:val="single" w:sz="2" w:space="0" w:color="CCCCCC"/>
+            <w:tcW w:w="2998" w:type="dxa"/>
+            <w:tcBorders>
+              <w:top w:val="single" w:sz="2" w:space="0" w:color="CCCCCC"/>
+              <w:left w:val="single" w:sz="2" w:space="0" w:color="CCCCCC"/>
+              <w:bottom w:val="single" w:sz="2" w:space="0" w:color="CCCCCC"/>
+              <w:right w:val="single" w:sz="2" w:space="0" w:color="CCCCCC"/>
             </w:tcBorders>
             <w:shd w:fill="F0F0F0" w:val="clear"/>
           </w:tcPr>
@@ -4582,9 +5239,9 @@
             <w:tcW w:w="6361" w:type="dxa"/>
             <w:tcBorders>
               <w:top w:val="single" w:sz="2" w:space="0" w:color="CCCCCC"/>
-              <w:start w:val="single" w:sz="2" w:space="0" w:color="CCCCCC"/>
-              <w:bottom w:val="single" w:sz="2" w:space="0" w:color="CCCCCC"/>
-              <w:end w:val="single" w:sz="2" w:space="0" w:color="CCCCCC"/>
+              <w:left w:val="single" w:sz="2" w:space="0" w:color="CCCCCC"/>
+              <w:bottom w:val="single" w:sz="2" w:space="0" w:color="CCCCCC"/>
+              <w:right w:val="single" w:sz="2" w:space="0" w:color="CCCCCC"/>
             </w:tcBorders>
             <w:shd w:fill="FFFFFF" w:val="clear"/>
           </w:tcPr>
@@ -4610,12 +5267,12 @@
         <w:trPr/>
         <w:tc>
           <w:tcPr>
-            <w:tcW w:w="2999" w:type="dxa"/>
-            <w:tcBorders>
-              <w:top w:val="single" w:sz="2" w:space="0" w:color="CCCCCC"/>
-              <w:start w:val="single" w:sz="2" w:space="0" w:color="CCCCCC"/>
-              <w:bottom w:val="single" w:sz="2" w:space="0" w:color="CCCCCC"/>
-              <w:end w:val="single" w:sz="2" w:space="0" w:color="CCCCCC"/>
+            <w:tcW w:w="2998" w:type="dxa"/>
+            <w:tcBorders>
+              <w:top w:val="single" w:sz="2" w:space="0" w:color="CCCCCC"/>
+              <w:left w:val="single" w:sz="2" w:space="0" w:color="CCCCCC"/>
+              <w:bottom w:val="single" w:sz="2" w:space="0" w:color="CCCCCC"/>
+              <w:right w:val="single" w:sz="2" w:space="0" w:color="CCCCCC"/>
             </w:tcBorders>
             <w:shd w:fill="F0F0F0" w:val="clear"/>
           </w:tcPr>
@@ -4641,9 +5298,9 @@
             <w:tcW w:w="6361" w:type="dxa"/>
             <w:tcBorders>
               <w:top w:val="single" w:sz="2" w:space="0" w:color="CCCCCC"/>
-              <w:start w:val="single" w:sz="2" w:space="0" w:color="CCCCCC"/>
-              <w:bottom w:val="single" w:sz="2" w:space="0" w:color="CCCCCC"/>
-              <w:end w:val="single" w:sz="2" w:space="0" w:color="CCCCCC"/>
+              <w:left w:val="single" w:sz="2" w:space="0" w:color="CCCCCC"/>
+              <w:bottom w:val="single" w:sz="2" w:space="0" w:color="CCCCCC"/>
+              <w:right w:val="single" w:sz="2" w:space="0" w:color="CCCCCC"/>
             </w:tcBorders>
             <w:shd w:fill="FFFFFF" w:val="clear"/>
           </w:tcPr>
@@ -4669,12 +5326,12 @@
         <w:trPr/>
         <w:tc>
           <w:tcPr>
-            <w:tcW w:w="2999" w:type="dxa"/>
-            <w:tcBorders>
-              <w:top w:val="single" w:sz="2" w:space="0" w:color="CCCCCC"/>
-              <w:start w:val="single" w:sz="2" w:space="0" w:color="CCCCCC"/>
-              <w:bottom w:val="single" w:sz="2" w:space="0" w:color="CCCCCC"/>
-              <w:end w:val="single" w:sz="2" w:space="0" w:color="CCCCCC"/>
+            <w:tcW w:w="2998" w:type="dxa"/>
+            <w:tcBorders>
+              <w:top w:val="single" w:sz="2" w:space="0" w:color="CCCCCC"/>
+              <w:left w:val="single" w:sz="2" w:space="0" w:color="CCCCCC"/>
+              <w:bottom w:val="single" w:sz="2" w:space="0" w:color="CCCCCC"/>
+              <w:right w:val="single" w:sz="2" w:space="0" w:color="CCCCCC"/>
             </w:tcBorders>
             <w:shd w:fill="F0F0F0" w:val="clear"/>
           </w:tcPr>
@@ -4700,9 +5357,9 @@
             <w:tcW w:w="6361" w:type="dxa"/>
             <w:tcBorders>
               <w:top w:val="single" w:sz="2" w:space="0" w:color="CCCCCC"/>
-              <w:start w:val="single" w:sz="2" w:space="0" w:color="CCCCCC"/>
-              <w:bottom w:val="single" w:sz="2" w:space="0" w:color="CCCCCC"/>
-              <w:end w:val="single" w:sz="2" w:space="0" w:color="CCCCCC"/>
+              <w:left w:val="single" w:sz="2" w:space="0" w:color="CCCCCC"/>
+              <w:bottom w:val="single" w:sz="2" w:space="0" w:color="CCCCCC"/>
+              <w:right w:val="single" w:sz="2" w:space="0" w:color="CCCCCC"/>
             </w:tcBorders>
             <w:shd w:fill="FFFFFF" w:val="clear"/>
           </w:tcPr>
@@ -4728,12 +5385,12 @@
         <w:trPr/>
         <w:tc>
           <w:tcPr>
-            <w:tcW w:w="2999" w:type="dxa"/>
-            <w:tcBorders>
-              <w:top w:val="single" w:sz="2" w:space="0" w:color="CCCCCC"/>
-              <w:start w:val="single" w:sz="2" w:space="0" w:color="CCCCCC"/>
-              <w:bottom w:val="single" w:sz="2" w:space="0" w:color="CCCCCC"/>
-              <w:end w:val="single" w:sz="2" w:space="0" w:color="CCCCCC"/>
+            <w:tcW w:w="2998" w:type="dxa"/>
+            <w:tcBorders>
+              <w:top w:val="single" w:sz="2" w:space="0" w:color="CCCCCC"/>
+              <w:left w:val="single" w:sz="2" w:space="0" w:color="CCCCCC"/>
+              <w:bottom w:val="single" w:sz="2" w:space="0" w:color="CCCCCC"/>
+              <w:right w:val="single" w:sz="2" w:space="0" w:color="CCCCCC"/>
             </w:tcBorders>
             <w:shd w:fill="F0F0F0" w:val="clear"/>
           </w:tcPr>
@@ -4759,9 +5416,9 @@
             <w:tcW w:w="6361" w:type="dxa"/>
             <w:tcBorders>
               <w:top w:val="single" w:sz="2" w:space="0" w:color="CCCCCC"/>
-              <w:start w:val="single" w:sz="2" w:space="0" w:color="CCCCCC"/>
-              <w:bottom w:val="single" w:sz="2" w:space="0" w:color="CCCCCC"/>
-              <w:end w:val="single" w:sz="2" w:space="0" w:color="CCCCCC"/>
+              <w:left w:val="single" w:sz="2" w:space="0" w:color="CCCCCC"/>
+              <w:bottom w:val="single" w:sz="2" w:space="0" w:color="CCCCCC"/>
+              <w:right w:val="single" w:sz="2" w:space="0" w:color="CCCCCC"/>
             </w:tcBorders>
             <w:shd w:fill="FFFFFF" w:val="clear"/>
           </w:tcPr>
@@ -4798,7 +5455,7 @@
       <w:pPr>
         <w:pStyle w:val="Normal"/>
         <w:spacing w:before="40" w:after="40"/>
-        <w:ind w:start="720"/>
+        <w:ind w:left="720"/>
         <w:rPr/>
       </w:pPr>
       <w:r>
@@ -4815,7 +5472,7 @@
       <w:pPr>
         <w:pStyle w:val="Normal"/>
         <w:spacing w:before="40" w:after="40"/>
-        <w:ind w:start="720"/>
+        <w:ind w:left="720"/>
         <w:rPr/>
       </w:pPr>
       <w:r>
@@ -4832,7 +5489,7 @@
       <w:pPr>
         <w:pStyle w:val="Normal"/>
         <w:spacing w:before="40" w:after="40"/>
-        <w:ind w:start="720"/>
+        <w:ind w:left="720"/>
         <w:rPr/>
       </w:pPr>
       <w:r>
@@ -4849,7 +5506,7 @@
       <w:pPr>
         <w:pStyle w:val="Normal"/>
         <w:spacing w:before="40" w:after="40"/>
-        <w:ind w:start="720"/>
+        <w:ind w:left="720"/>
         <w:rPr/>
       </w:pPr>
       <w:r>
@@ -4899,7 +5556,7 @@
       <w:pPr>
         <w:pStyle w:val="Normal"/>
         <w:spacing w:before="40" w:after="40"/>
-        <w:ind w:start="720"/>
+        <w:ind w:left="720"/>
         <w:rPr/>
       </w:pPr>
       <w:r>
@@ -4916,7 +5573,7 @@
       <w:pPr>
         <w:pStyle w:val="Normal"/>
         <w:spacing w:before="40" w:after="40"/>
-        <w:ind w:start="720"/>
+        <w:ind w:left="720"/>
         <w:rPr/>
       </w:pPr>
       <w:r>
@@ -4966,7 +5623,7 @@
       <w:pPr>
         <w:pStyle w:val="Normal"/>
         <w:spacing w:before="40" w:after="40"/>
-        <w:ind w:start="720"/>
+        <w:ind w:left="720"/>
         <w:rPr/>
       </w:pPr>
       <w:r>
@@ -4983,7 +5640,7 @@
       <w:pPr>
         <w:pStyle w:val="Normal"/>
         <w:spacing w:before="40" w:after="40"/>
-        <w:ind w:start="720"/>
+        <w:ind w:left="720"/>
         <w:rPr/>
       </w:pPr>
       <w:r>
@@ -5000,7 +5657,7 @@
       <w:pPr>
         <w:pStyle w:val="Normal"/>
         <w:spacing w:before="40" w:after="40"/>
-        <w:ind w:start="720"/>
+        <w:ind w:left="720"/>
         <w:rPr/>
       </w:pPr>
       <w:r>
@@ -5017,7 +5674,7 @@
       <w:pPr>
         <w:pStyle w:val="Normal"/>
         <w:spacing w:before="40" w:after="40"/>
-        <w:ind w:start="720"/>
+        <w:ind w:left="720"/>
         <w:rPr/>
       </w:pPr>
       <w:r>
@@ -5034,7 +5691,7 @@
       <w:pPr>
         <w:pStyle w:val="Normal"/>
         <w:spacing w:before="40" w:after="40"/>
-        <w:ind w:start="720"/>
+        <w:ind w:left="720"/>
         <w:rPr/>
       </w:pPr>
       <w:r>
@@ -5083,18 +5740,18 @@
     <w:tbl>
       <w:tblPr>
         <w:tblW w:w="9360" w:type="dxa"/>
-        <w:jc w:val="start"/>
+        <w:jc w:val="left"/>
         <w:tblInd w:w="0" w:type="dxa"/>
         <w:tblLayout w:type="fixed"/>
         <w:tblCellMar>
           <w:top w:w="80" w:type="dxa"/>
-          <w:start w:w="120" w:type="dxa"/>
+          <w:left w:w="120" w:type="dxa"/>
           <w:bottom w:w="80" w:type="dxa"/>
-          <w:end w:w="120" w:type="dxa"/>
+          <w:right w:w="120" w:type="dxa"/>
         </w:tblCellMar>
       </w:tblPr>
       <w:tblGrid>
-        <w:gridCol w:w="2999"/>
+        <w:gridCol w:w="2998"/>
         <w:gridCol w:w="6361"/>
       </w:tblGrid>
       <w:tr>
@@ -5103,12 +5760,12 @@
         </w:trPr>
         <w:tc>
           <w:tcPr>
-            <w:tcW w:w="2999" w:type="dxa"/>
-            <w:tcBorders>
-              <w:top w:val="single" w:sz="2" w:space="0" w:color="CCCCCC"/>
-              <w:start w:val="single" w:sz="2" w:space="0" w:color="CCCCCC"/>
-              <w:bottom w:val="single" w:sz="2" w:space="0" w:color="CCCCCC"/>
-              <w:end w:val="single" w:sz="2" w:space="0" w:color="CCCCCC"/>
+            <w:tcW w:w="2998" w:type="dxa"/>
+            <w:tcBorders>
+              <w:top w:val="single" w:sz="2" w:space="0" w:color="CCCCCC"/>
+              <w:left w:val="single" w:sz="2" w:space="0" w:color="CCCCCC"/>
+              <w:bottom w:val="single" w:sz="2" w:space="0" w:color="CCCCCC"/>
+              <w:right w:val="single" w:sz="2" w:space="0" w:color="CCCCCC"/>
             </w:tcBorders>
             <w:shd w:fill="2E5090" w:val="clear"/>
           </w:tcPr>
@@ -5135,9 +5792,9 @@
             <w:tcW w:w="6361" w:type="dxa"/>
             <w:tcBorders>
               <w:top w:val="single" w:sz="2" w:space="0" w:color="CCCCCC"/>
-              <w:start w:val="single" w:sz="2" w:space="0" w:color="CCCCCC"/>
-              <w:bottom w:val="single" w:sz="2" w:space="0" w:color="CCCCCC"/>
-              <w:end w:val="single" w:sz="2" w:space="0" w:color="CCCCCC"/>
+              <w:left w:val="single" w:sz="2" w:space="0" w:color="CCCCCC"/>
+              <w:bottom w:val="single" w:sz="2" w:space="0" w:color="CCCCCC"/>
+              <w:right w:val="single" w:sz="2" w:space="0" w:color="CCCCCC"/>
             </w:tcBorders>
             <w:shd w:fill="2E5090" w:val="clear"/>
           </w:tcPr>
@@ -5164,12 +5821,12 @@
         <w:trPr/>
         <w:tc>
           <w:tcPr>
-            <w:tcW w:w="2999" w:type="dxa"/>
-            <w:tcBorders>
-              <w:top w:val="single" w:sz="2" w:space="0" w:color="CCCCCC"/>
-              <w:start w:val="single" w:sz="2" w:space="0" w:color="CCCCCC"/>
-              <w:bottom w:val="single" w:sz="2" w:space="0" w:color="CCCCCC"/>
-              <w:end w:val="single" w:sz="2" w:space="0" w:color="CCCCCC"/>
+            <w:tcW w:w="2998" w:type="dxa"/>
+            <w:tcBorders>
+              <w:top w:val="single" w:sz="2" w:space="0" w:color="CCCCCC"/>
+              <w:left w:val="single" w:sz="2" w:space="0" w:color="CCCCCC"/>
+              <w:bottom w:val="single" w:sz="2" w:space="0" w:color="CCCCCC"/>
+              <w:right w:val="single" w:sz="2" w:space="0" w:color="CCCCCC"/>
             </w:tcBorders>
             <w:shd w:fill="F0F0F0" w:val="clear"/>
           </w:tcPr>
@@ -5195,9 +5852,9 @@
             <w:tcW w:w="6361" w:type="dxa"/>
             <w:tcBorders>
               <w:top w:val="single" w:sz="2" w:space="0" w:color="CCCCCC"/>
-              <w:start w:val="single" w:sz="2" w:space="0" w:color="CCCCCC"/>
-              <w:bottom w:val="single" w:sz="2" w:space="0" w:color="CCCCCC"/>
-              <w:end w:val="single" w:sz="2" w:space="0" w:color="CCCCCC"/>
+              <w:left w:val="single" w:sz="2" w:space="0" w:color="CCCCCC"/>
+              <w:bottom w:val="single" w:sz="2" w:space="0" w:color="CCCCCC"/>
+              <w:right w:val="single" w:sz="2" w:space="0" w:color="CCCCCC"/>
             </w:tcBorders>
             <w:shd w:fill="FFFFFF" w:val="clear"/>
           </w:tcPr>
@@ -5223,12 +5880,12 @@
         <w:trPr/>
         <w:tc>
           <w:tcPr>
-            <w:tcW w:w="2999" w:type="dxa"/>
-            <w:tcBorders>
-              <w:top w:val="single" w:sz="2" w:space="0" w:color="CCCCCC"/>
-              <w:start w:val="single" w:sz="2" w:space="0" w:color="CCCCCC"/>
-              <w:bottom w:val="single" w:sz="2" w:space="0" w:color="CCCCCC"/>
-              <w:end w:val="single" w:sz="2" w:space="0" w:color="CCCCCC"/>
+            <w:tcW w:w="2998" w:type="dxa"/>
+            <w:tcBorders>
+              <w:top w:val="single" w:sz="2" w:space="0" w:color="CCCCCC"/>
+              <w:left w:val="single" w:sz="2" w:space="0" w:color="CCCCCC"/>
+              <w:bottom w:val="single" w:sz="2" w:space="0" w:color="CCCCCC"/>
+              <w:right w:val="single" w:sz="2" w:space="0" w:color="CCCCCC"/>
             </w:tcBorders>
             <w:shd w:fill="F0F0F0" w:val="clear"/>
           </w:tcPr>
@@ -5254,9 +5911,9 @@
             <w:tcW w:w="6361" w:type="dxa"/>
             <w:tcBorders>
               <w:top w:val="single" w:sz="2" w:space="0" w:color="CCCCCC"/>
-              <w:start w:val="single" w:sz="2" w:space="0" w:color="CCCCCC"/>
-              <w:bottom w:val="single" w:sz="2" w:space="0" w:color="CCCCCC"/>
-              <w:end w:val="single" w:sz="2" w:space="0" w:color="CCCCCC"/>
+              <w:left w:val="single" w:sz="2" w:space="0" w:color="CCCCCC"/>
+              <w:bottom w:val="single" w:sz="2" w:space="0" w:color="CCCCCC"/>
+              <w:right w:val="single" w:sz="2" w:space="0" w:color="CCCCCC"/>
             </w:tcBorders>
             <w:shd w:fill="FFFFFF" w:val="clear"/>
           </w:tcPr>
@@ -5282,12 +5939,12 @@
         <w:trPr/>
         <w:tc>
           <w:tcPr>
-            <w:tcW w:w="2999" w:type="dxa"/>
-            <w:tcBorders>
-              <w:top w:val="single" w:sz="2" w:space="0" w:color="CCCCCC"/>
-              <w:start w:val="single" w:sz="2" w:space="0" w:color="CCCCCC"/>
-              <w:bottom w:val="single" w:sz="2" w:space="0" w:color="CCCCCC"/>
-              <w:end w:val="single" w:sz="2" w:space="0" w:color="CCCCCC"/>
+            <w:tcW w:w="2998" w:type="dxa"/>
+            <w:tcBorders>
+              <w:top w:val="single" w:sz="2" w:space="0" w:color="CCCCCC"/>
+              <w:left w:val="single" w:sz="2" w:space="0" w:color="CCCCCC"/>
+              <w:bottom w:val="single" w:sz="2" w:space="0" w:color="CCCCCC"/>
+              <w:right w:val="single" w:sz="2" w:space="0" w:color="CCCCCC"/>
             </w:tcBorders>
             <w:shd w:fill="F0F0F0" w:val="clear"/>
           </w:tcPr>
@@ -5313,9 +5970,9 @@
             <w:tcW w:w="6361" w:type="dxa"/>
             <w:tcBorders>
               <w:top w:val="single" w:sz="2" w:space="0" w:color="CCCCCC"/>
-              <w:start w:val="single" w:sz="2" w:space="0" w:color="CCCCCC"/>
-              <w:bottom w:val="single" w:sz="2" w:space="0" w:color="CCCCCC"/>
-              <w:end w:val="single" w:sz="2" w:space="0" w:color="CCCCCC"/>
+              <w:left w:val="single" w:sz="2" w:space="0" w:color="CCCCCC"/>
+              <w:bottom w:val="single" w:sz="2" w:space="0" w:color="CCCCCC"/>
+              <w:right w:val="single" w:sz="2" w:space="0" w:color="CCCCCC"/>
             </w:tcBorders>
             <w:shd w:fill="FFFFFF" w:val="clear"/>
           </w:tcPr>
@@ -5341,12 +5998,12 @@
         <w:trPr/>
         <w:tc>
           <w:tcPr>
-            <w:tcW w:w="2999" w:type="dxa"/>
-            <w:tcBorders>
-              <w:top w:val="single" w:sz="2" w:space="0" w:color="CCCCCC"/>
-              <w:start w:val="single" w:sz="2" w:space="0" w:color="CCCCCC"/>
-              <w:bottom w:val="single" w:sz="2" w:space="0" w:color="CCCCCC"/>
-              <w:end w:val="single" w:sz="2" w:space="0" w:color="CCCCCC"/>
+            <w:tcW w:w="2998" w:type="dxa"/>
+            <w:tcBorders>
+              <w:top w:val="single" w:sz="2" w:space="0" w:color="CCCCCC"/>
+              <w:left w:val="single" w:sz="2" w:space="0" w:color="CCCCCC"/>
+              <w:bottom w:val="single" w:sz="2" w:space="0" w:color="CCCCCC"/>
+              <w:right w:val="single" w:sz="2" w:space="0" w:color="CCCCCC"/>
             </w:tcBorders>
             <w:shd w:fill="F0F0F0" w:val="clear"/>
           </w:tcPr>
@@ -5372,9 +6029,9 @@
             <w:tcW w:w="6361" w:type="dxa"/>
             <w:tcBorders>
               <w:top w:val="single" w:sz="2" w:space="0" w:color="CCCCCC"/>
-              <w:start w:val="single" w:sz="2" w:space="0" w:color="CCCCCC"/>
-              <w:bottom w:val="single" w:sz="2" w:space="0" w:color="CCCCCC"/>
-              <w:end w:val="single" w:sz="2" w:space="0" w:color="CCCCCC"/>
+              <w:left w:val="single" w:sz="2" w:space="0" w:color="CCCCCC"/>
+              <w:bottom w:val="single" w:sz="2" w:space="0" w:color="CCCCCC"/>
+              <w:right w:val="single" w:sz="2" w:space="0" w:color="CCCCCC"/>
             </w:tcBorders>
             <w:shd w:fill="FFFFFF" w:val="clear"/>
           </w:tcPr>
@@ -5400,12 +6057,12 @@
         <w:trPr/>
         <w:tc>
           <w:tcPr>
-            <w:tcW w:w="2999" w:type="dxa"/>
-            <w:tcBorders>
-              <w:top w:val="single" w:sz="2" w:space="0" w:color="CCCCCC"/>
-              <w:start w:val="single" w:sz="2" w:space="0" w:color="CCCCCC"/>
-              <w:bottom w:val="single" w:sz="2" w:space="0" w:color="CCCCCC"/>
-              <w:end w:val="single" w:sz="2" w:space="0" w:color="CCCCCC"/>
+            <w:tcW w:w="2998" w:type="dxa"/>
+            <w:tcBorders>
+              <w:top w:val="single" w:sz="2" w:space="0" w:color="CCCCCC"/>
+              <w:left w:val="single" w:sz="2" w:space="0" w:color="CCCCCC"/>
+              <w:bottom w:val="single" w:sz="2" w:space="0" w:color="CCCCCC"/>
+              <w:right w:val="single" w:sz="2" w:space="0" w:color="CCCCCC"/>
             </w:tcBorders>
             <w:shd w:fill="F0F0F0" w:val="clear"/>
           </w:tcPr>
@@ -5431,9 +6088,9 @@
             <w:tcW w:w="6361" w:type="dxa"/>
             <w:tcBorders>
               <w:top w:val="single" w:sz="2" w:space="0" w:color="CCCCCC"/>
-              <w:start w:val="single" w:sz="2" w:space="0" w:color="CCCCCC"/>
-              <w:bottom w:val="single" w:sz="2" w:space="0" w:color="CCCCCC"/>
-              <w:end w:val="single" w:sz="2" w:space="0" w:color="CCCCCC"/>
+              <w:left w:val="single" w:sz="2" w:space="0" w:color="CCCCCC"/>
+              <w:bottom w:val="single" w:sz="2" w:space="0" w:color="CCCCCC"/>
+              <w:right w:val="single" w:sz="2" w:space="0" w:color="CCCCCC"/>
             </w:tcBorders>
             <w:shd w:fill="FFFFFF" w:val="clear"/>
           </w:tcPr>
@@ -5459,12 +6116,12 @@
         <w:trPr/>
         <w:tc>
           <w:tcPr>
-            <w:tcW w:w="2999" w:type="dxa"/>
-            <w:tcBorders>
-              <w:top w:val="single" w:sz="2" w:space="0" w:color="CCCCCC"/>
-              <w:start w:val="single" w:sz="2" w:space="0" w:color="CCCCCC"/>
-              <w:bottom w:val="single" w:sz="2" w:space="0" w:color="CCCCCC"/>
-              <w:end w:val="single" w:sz="2" w:space="0" w:color="CCCCCC"/>
+            <w:tcW w:w="2998" w:type="dxa"/>
+            <w:tcBorders>
+              <w:top w:val="single" w:sz="2" w:space="0" w:color="CCCCCC"/>
+              <w:left w:val="single" w:sz="2" w:space="0" w:color="CCCCCC"/>
+              <w:bottom w:val="single" w:sz="2" w:space="0" w:color="CCCCCC"/>
+              <w:right w:val="single" w:sz="2" w:space="0" w:color="CCCCCC"/>
             </w:tcBorders>
             <w:shd w:fill="F0F0F0" w:val="clear"/>
           </w:tcPr>
@@ -5490,9 +6147,9 @@
             <w:tcW w:w="6361" w:type="dxa"/>
             <w:tcBorders>
               <w:top w:val="single" w:sz="2" w:space="0" w:color="CCCCCC"/>
-              <w:start w:val="single" w:sz="2" w:space="0" w:color="CCCCCC"/>
-              <w:bottom w:val="single" w:sz="2" w:space="0" w:color="CCCCCC"/>
-              <w:end w:val="single" w:sz="2" w:space="0" w:color="CCCCCC"/>
+              <w:left w:val="single" w:sz="2" w:space="0" w:color="CCCCCC"/>
+              <w:bottom w:val="single" w:sz="2" w:space="0" w:color="CCCCCC"/>
+              <w:right w:val="single" w:sz="2" w:space="0" w:color="CCCCCC"/>
             </w:tcBorders>
             <w:shd w:fill="FFFFFF" w:val="clear"/>
           </w:tcPr>
@@ -5518,12 +6175,12 @@
         <w:trPr/>
         <w:tc>
           <w:tcPr>
-            <w:tcW w:w="2999" w:type="dxa"/>
-            <w:tcBorders>
-              <w:top w:val="single" w:sz="2" w:space="0" w:color="CCCCCC"/>
-              <w:start w:val="single" w:sz="2" w:space="0" w:color="CCCCCC"/>
-              <w:bottom w:val="single" w:sz="2" w:space="0" w:color="CCCCCC"/>
-              <w:end w:val="single" w:sz="2" w:space="0" w:color="CCCCCC"/>
+            <w:tcW w:w="2998" w:type="dxa"/>
+            <w:tcBorders>
+              <w:top w:val="single" w:sz="2" w:space="0" w:color="CCCCCC"/>
+              <w:left w:val="single" w:sz="2" w:space="0" w:color="CCCCCC"/>
+              <w:bottom w:val="single" w:sz="2" w:space="0" w:color="CCCCCC"/>
+              <w:right w:val="single" w:sz="2" w:space="0" w:color="CCCCCC"/>
             </w:tcBorders>
             <w:shd w:fill="F0F0F0" w:val="clear"/>
           </w:tcPr>
@@ -5549,9 +6206,9 @@
             <w:tcW w:w="6361" w:type="dxa"/>
             <w:tcBorders>
               <w:top w:val="single" w:sz="2" w:space="0" w:color="CCCCCC"/>
-              <w:start w:val="single" w:sz="2" w:space="0" w:color="CCCCCC"/>
-              <w:bottom w:val="single" w:sz="2" w:space="0" w:color="CCCCCC"/>
-              <w:end w:val="single" w:sz="2" w:space="0" w:color="CCCCCC"/>
+              <w:left w:val="single" w:sz="2" w:space="0" w:color="CCCCCC"/>
+              <w:bottom w:val="single" w:sz="2" w:space="0" w:color="CCCCCC"/>
+              <w:right w:val="single" w:sz="2" w:space="0" w:color="CCCCCC"/>
             </w:tcBorders>
             <w:shd w:fill="FFFFFF" w:val="clear"/>
           </w:tcPr>
@@ -5577,12 +6234,12 @@
         <w:trPr/>
         <w:tc>
           <w:tcPr>
-            <w:tcW w:w="2999" w:type="dxa"/>
-            <w:tcBorders>
-              <w:top w:val="single" w:sz="2" w:space="0" w:color="CCCCCC"/>
-              <w:start w:val="single" w:sz="2" w:space="0" w:color="CCCCCC"/>
-              <w:bottom w:val="single" w:sz="2" w:space="0" w:color="CCCCCC"/>
-              <w:end w:val="single" w:sz="2" w:space="0" w:color="CCCCCC"/>
+            <w:tcW w:w="2998" w:type="dxa"/>
+            <w:tcBorders>
+              <w:top w:val="single" w:sz="2" w:space="0" w:color="CCCCCC"/>
+              <w:left w:val="single" w:sz="2" w:space="0" w:color="CCCCCC"/>
+              <w:bottom w:val="single" w:sz="2" w:space="0" w:color="CCCCCC"/>
+              <w:right w:val="single" w:sz="2" w:space="0" w:color="CCCCCC"/>
             </w:tcBorders>
             <w:shd w:fill="F0F0F0" w:val="clear"/>
           </w:tcPr>
@@ -5608,9 +6265,9 @@
             <w:tcW w:w="6361" w:type="dxa"/>
             <w:tcBorders>
               <w:top w:val="single" w:sz="2" w:space="0" w:color="CCCCCC"/>
-              <w:start w:val="single" w:sz="2" w:space="0" w:color="CCCCCC"/>
-              <w:bottom w:val="single" w:sz="2" w:space="0" w:color="CCCCCC"/>
-              <w:end w:val="single" w:sz="2" w:space="0" w:color="CCCCCC"/>
+              <w:left w:val="single" w:sz="2" w:space="0" w:color="CCCCCC"/>
+              <w:bottom w:val="single" w:sz="2" w:space="0" w:color="CCCCCC"/>
+              <w:right w:val="single" w:sz="2" w:space="0" w:color="CCCCCC"/>
             </w:tcBorders>
             <w:shd w:fill="FFFFFF" w:val="clear"/>
           </w:tcPr>
@@ -5636,12 +6293,12 @@
         <w:trPr/>
         <w:tc>
           <w:tcPr>
-            <w:tcW w:w="2999" w:type="dxa"/>
-            <w:tcBorders>
-              <w:top w:val="single" w:sz="2" w:space="0" w:color="CCCCCC"/>
-              <w:start w:val="single" w:sz="2" w:space="0" w:color="CCCCCC"/>
-              <w:bottom w:val="single" w:sz="2" w:space="0" w:color="CCCCCC"/>
-              <w:end w:val="single" w:sz="2" w:space="0" w:color="CCCCCC"/>
+            <w:tcW w:w="2998" w:type="dxa"/>
+            <w:tcBorders>
+              <w:top w:val="single" w:sz="2" w:space="0" w:color="CCCCCC"/>
+              <w:left w:val="single" w:sz="2" w:space="0" w:color="CCCCCC"/>
+              <w:bottom w:val="single" w:sz="2" w:space="0" w:color="CCCCCC"/>
+              <w:right w:val="single" w:sz="2" w:space="0" w:color="CCCCCC"/>
             </w:tcBorders>
             <w:shd w:fill="F0F0F0" w:val="clear"/>
           </w:tcPr>
@@ -5667,9 +6324,9 @@
             <w:tcW w:w="6361" w:type="dxa"/>
             <w:tcBorders>
               <w:top w:val="single" w:sz="2" w:space="0" w:color="CCCCCC"/>
-              <w:start w:val="single" w:sz="2" w:space="0" w:color="CCCCCC"/>
-              <w:bottom w:val="single" w:sz="2" w:space="0" w:color="CCCCCC"/>
-              <w:end w:val="single" w:sz="2" w:space="0" w:color="CCCCCC"/>
+              <w:left w:val="single" w:sz="2" w:space="0" w:color="CCCCCC"/>
+              <w:bottom w:val="single" w:sz="2" w:space="0" w:color="CCCCCC"/>
+              <w:right w:val="single" w:sz="2" w:space="0" w:color="CCCCCC"/>
             </w:tcBorders>
             <w:shd w:fill="FFFFFF" w:val="clear"/>
           </w:tcPr>
@@ -5695,12 +6352,12 @@
         <w:trPr/>
         <w:tc>
           <w:tcPr>
-            <w:tcW w:w="2999" w:type="dxa"/>
-            <w:tcBorders>
-              <w:top w:val="single" w:sz="2" w:space="0" w:color="CCCCCC"/>
-              <w:start w:val="single" w:sz="2" w:space="0" w:color="CCCCCC"/>
-              <w:bottom w:val="single" w:sz="2" w:space="0" w:color="CCCCCC"/>
-              <w:end w:val="single" w:sz="2" w:space="0" w:color="CCCCCC"/>
+            <w:tcW w:w="2998" w:type="dxa"/>
+            <w:tcBorders>
+              <w:top w:val="single" w:sz="2" w:space="0" w:color="CCCCCC"/>
+              <w:left w:val="single" w:sz="2" w:space="0" w:color="CCCCCC"/>
+              <w:bottom w:val="single" w:sz="2" w:space="0" w:color="CCCCCC"/>
+              <w:right w:val="single" w:sz="2" w:space="0" w:color="CCCCCC"/>
             </w:tcBorders>
             <w:shd w:fill="F0F0F0" w:val="clear"/>
           </w:tcPr>
@@ -5726,9 +6383,9 @@
             <w:tcW w:w="6361" w:type="dxa"/>
             <w:tcBorders>
               <w:top w:val="single" w:sz="2" w:space="0" w:color="CCCCCC"/>
-              <w:start w:val="single" w:sz="2" w:space="0" w:color="CCCCCC"/>
-              <w:bottom w:val="single" w:sz="2" w:space="0" w:color="CCCCCC"/>
-              <w:end w:val="single" w:sz="2" w:space="0" w:color="CCCCCC"/>
+              <w:left w:val="single" w:sz="2" w:space="0" w:color="CCCCCC"/>
+              <w:bottom w:val="single" w:sz="2" w:space="0" w:color="CCCCCC"/>
+              <w:right w:val="single" w:sz="2" w:space="0" w:color="CCCCCC"/>
             </w:tcBorders>
             <w:shd w:fill="FFFFFF" w:val="clear"/>
           </w:tcPr>
@@ -5754,12 +6411,12 @@
         <w:trPr/>
         <w:tc>
           <w:tcPr>
-            <w:tcW w:w="2999" w:type="dxa"/>
-            <w:tcBorders>
-              <w:top w:val="single" w:sz="2" w:space="0" w:color="CCCCCC"/>
-              <w:start w:val="single" w:sz="2" w:space="0" w:color="CCCCCC"/>
-              <w:bottom w:val="single" w:sz="2" w:space="0" w:color="CCCCCC"/>
-              <w:end w:val="single" w:sz="2" w:space="0" w:color="CCCCCC"/>
+            <w:tcW w:w="2998" w:type="dxa"/>
+            <w:tcBorders>
+              <w:top w:val="single" w:sz="2" w:space="0" w:color="CCCCCC"/>
+              <w:left w:val="single" w:sz="2" w:space="0" w:color="CCCCCC"/>
+              <w:bottom w:val="single" w:sz="2" w:space="0" w:color="CCCCCC"/>
+              <w:right w:val="single" w:sz="2" w:space="0" w:color="CCCCCC"/>
             </w:tcBorders>
             <w:shd w:fill="F0F0F0" w:val="clear"/>
           </w:tcPr>
@@ -5785,9 +6442,9 @@
             <w:tcW w:w="6361" w:type="dxa"/>
             <w:tcBorders>
               <w:top w:val="single" w:sz="2" w:space="0" w:color="CCCCCC"/>
-              <w:start w:val="single" w:sz="2" w:space="0" w:color="CCCCCC"/>
-              <w:bottom w:val="single" w:sz="2" w:space="0" w:color="CCCCCC"/>
-              <w:end w:val="single" w:sz="2" w:space="0" w:color="CCCCCC"/>
+              <w:left w:val="single" w:sz="2" w:space="0" w:color="CCCCCC"/>
+              <w:bottom w:val="single" w:sz="2" w:space="0" w:color="CCCCCC"/>
+              <w:right w:val="single" w:sz="2" w:space="0" w:color="CCCCCC"/>
             </w:tcBorders>
             <w:shd w:fill="FFFFFF" w:val="clear"/>
           </w:tcPr>
@@ -5813,12 +6470,12 @@
         <w:trPr/>
         <w:tc>
           <w:tcPr>
-            <w:tcW w:w="2999" w:type="dxa"/>
-            <w:tcBorders>
-              <w:top w:val="single" w:sz="2" w:space="0" w:color="CCCCCC"/>
-              <w:start w:val="single" w:sz="2" w:space="0" w:color="CCCCCC"/>
-              <w:bottom w:val="single" w:sz="2" w:space="0" w:color="CCCCCC"/>
-              <w:end w:val="single" w:sz="2" w:space="0" w:color="CCCCCC"/>
+            <w:tcW w:w="2998" w:type="dxa"/>
+            <w:tcBorders>
+              <w:top w:val="single" w:sz="2" w:space="0" w:color="CCCCCC"/>
+              <w:left w:val="single" w:sz="2" w:space="0" w:color="CCCCCC"/>
+              <w:bottom w:val="single" w:sz="2" w:space="0" w:color="CCCCCC"/>
+              <w:right w:val="single" w:sz="2" w:space="0" w:color="CCCCCC"/>
             </w:tcBorders>
             <w:shd w:fill="F0F0F0" w:val="clear"/>
           </w:tcPr>
@@ -5844,9 +6501,9 @@
             <w:tcW w:w="6361" w:type="dxa"/>
             <w:tcBorders>
               <w:top w:val="single" w:sz="2" w:space="0" w:color="CCCCCC"/>
-              <w:start w:val="single" w:sz="2" w:space="0" w:color="CCCCCC"/>
-              <w:bottom w:val="single" w:sz="2" w:space="0" w:color="CCCCCC"/>
-              <w:end w:val="single" w:sz="2" w:space="0" w:color="CCCCCC"/>
+              <w:left w:val="single" w:sz="2" w:space="0" w:color="CCCCCC"/>
+              <w:bottom w:val="single" w:sz="2" w:space="0" w:color="CCCCCC"/>
+              <w:right w:val="single" w:sz="2" w:space="0" w:color="CCCCCC"/>
             </w:tcBorders>
             <w:shd w:fill="FFFFFF" w:val="clear"/>
           </w:tcPr>
@@ -5872,12 +6529,12 @@
         <w:trPr/>
         <w:tc>
           <w:tcPr>
-            <w:tcW w:w="2999" w:type="dxa"/>
-            <w:tcBorders>
-              <w:top w:val="single" w:sz="2" w:space="0" w:color="CCCCCC"/>
-              <w:start w:val="single" w:sz="2" w:space="0" w:color="CCCCCC"/>
-              <w:bottom w:val="single" w:sz="2" w:space="0" w:color="CCCCCC"/>
-              <w:end w:val="single" w:sz="2" w:space="0" w:color="CCCCCC"/>
+            <w:tcW w:w="2998" w:type="dxa"/>
+            <w:tcBorders>
+              <w:top w:val="single" w:sz="2" w:space="0" w:color="CCCCCC"/>
+              <w:left w:val="single" w:sz="2" w:space="0" w:color="CCCCCC"/>
+              <w:bottom w:val="single" w:sz="2" w:space="0" w:color="CCCCCC"/>
+              <w:right w:val="single" w:sz="2" w:space="0" w:color="CCCCCC"/>
             </w:tcBorders>
             <w:shd w:fill="F0F0F0" w:val="clear"/>
           </w:tcPr>
@@ -5903,9 +6560,9 @@
             <w:tcW w:w="6361" w:type="dxa"/>
             <w:tcBorders>
               <w:top w:val="single" w:sz="2" w:space="0" w:color="CCCCCC"/>
-              <w:start w:val="single" w:sz="2" w:space="0" w:color="CCCCCC"/>
-              <w:bottom w:val="single" w:sz="2" w:space="0" w:color="CCCCCC"/>
-              <w:end w:val="single" w:sz="2" w:space="0" w:color="CCCCCC"/>
+              <w:left w:val="single" w:sz="2" w:space="0" w:color="CCCCCC"/>
+              <w:bottom w:val="single" w:sz="2" w:space="0" w:color="CCCCCC"/>
+              <w:right w:val="single" w:sz="2" w:space="0" w:color="CCCCCC"/>
             </w:tcBorders>
             <w:shd w:fill="FFFFFF" w:val="clear"/>
           </w:tcPr>
@@ -5931,12 +6588,12 @@
         <w:trPr/>
         <w:tc>
           <w:tcPr>
-            <w:tcW w:w="2999" w:type="dxa"/>
-            <w:tcBorders>
-              <w:top w:val="single" w:sz="2" w:space="0" w:color="CCCCCC"/>
-              <w:start w:val="single" w:sz="2" w:space="0" w:color="CCCCCC"/>
-              <w:bottom w:val="single" w:sz="2" w:space="0" w:color="CCCCCC"/>
-              <w:end w:val="single" w:sz="2" w:space="0" w:color="CCCCCC"/>
+            <w:tcW w:w="2998" w:type="dxa"/>
+            <w:tcBorders>
+              <w:top w:val="single" w:sz="2" w:space="0" w:color="CCCCCC"/>
+              <w:left w:val="single" w:sz="2" w:space="0" w:color="CCCCCC"/>
+              <w:bottom w:val="single" w:sz="2" w:space="0" w:color="CCCCCC"/>
+              <w:right w:val="single" w:sz="2" w:space="0" w:color="CCCCCC"/>
             </w:tcBorders>
             <w:shd w:fill="F0F0F0" w:val="clear"/>
           </w:tcPr>
@@ -5962,9 +6619,9 @@
             <w:tcW w:w="6361" w:type="dxa"/>
             <w:tcBorders>
               <w:top w:val="single" w:sz="2" w:space="0" w:color="CCCCCC"/>
-              <w:start w:val="single" w:sz="2" w:space="0" w:color="CCCCCC"/>
-              <w:bottom w:val="single" w:sz="2" w:space="0" w:color="CCCCCC"/>
-              <w:end w:val="single" w:sz="2" w:space="0" w:color="CCCCCC"/>
+              <w:left w:val="single" w:sz="2" w:space="0" w:color="CCCCCC"/>
+              <w:bottom w:val="single" w:sz="2" w:space="0" w:color="CCCCCC"/>
+              <w:right w:val="single" w:sz="2" w:space="0" w:color="CCCCCC"/>
             </w:tcBorders>
             <w:shd w:fill="FFFFFF" w:val="clear"/>
           </w:tcPr>
@@ -6018,18 +6675,467 @@
     <w:tbl>
       <w:tblPr>
         <w:tblW w:w="9360" w:type="dxa"/>
-        <w:jc w:val="start"/>
+        <w:jc w:val="left"/>
         <w:tblInd w:w="0" w:type="dxa"/>
         <w:tblLayout w:type="fixed"/>
         <w:tblCellMar>
           <w:top w:w="80" w:type="dxa"/>
-          <w:start w:w="120" w:type="dxa"/>
+          <w:left w:w="120" w:type="dxa"/>
           <w:bottom w:w="80" w:type="dxa"/>
-          <w:end w:w="120" w:type="dxa"/>
+          <w:right w:w="120" w:type="dxa"/>
         </w:tblCellMar>
       </w:tblPr>
       <w:tblGrid>
-        <w:gridCol w:w="2999"/>
+        <w:gridCol w:w="2998"/>
+        <w:gridCol w:w="6361"/>
+      </w:tblGrid>
+      <w:tr>
+        <w:trPr/>
+        <w:tc>
+          <w:tcPr>
+            <w:tcW w:w="2998" w:type="dxa"/>
+            <w:tcBorders>
+              <w:top w:val="single" w:sz="2" w:space="0" w:color="CCCCCC"/>
+              <w:left w:val="single" w:sz="2" w:space="0" w:color="CCCCCC"/>
+              <w:bottom w:val="single" w:sz="2" w:space="0" w:color="CCCCCC"/>
+              <w:right w:val="single" w:sz="2" w:space="0" w:color="CCCCCC"/>
+            </w:tcBorders>
+            <w:shd w:fill="2E5090" w:val="clear"/>
+          </w:tcPr>
+          <w:p>
+            <w:pPr>
+              <w:pStyle w:val="Normal"/>
+              <w:rPr/>
+            </w:pPr>
+            <w:r>
+              <w:rPr>
+                <w:rFonts w:eastAsia="Arial" w:cs="Arial"/>
+                <w:b/>
+                <w:bCs/>
+                <w:color w:val="FFFFFF"/>
+                <w:sz w:val="20"/>
+                <w:szCs w:val="20"/>
+              </w:rPr>
+              <w:t>Target</w:t>
+            </w:r>
+          </w:p>
+        </w:tc>
+        <w:tc>
+          <w:tcPr>
+            <w:tcW w:w="6361" w:type="dxa"/>
+            <w:tcBorders>
+              <w:top w:val="single" w:sz="2" w:space="0" w:color="CCCCCC"/>
+              <w:left w:val="single" w:sz="2" w:space="0" w:color="CCCCCC"/>
+              <w:bottom w:val="single" w:sz="2" w:space="0" w:color="CCCCCC"/>
+              <w:right w:val="single" w:sz="2" w:space="0" w:color="CCCCCC"/>
+            </w:tcBorders>
+            <w:shd w:fill="2E5090" w:val="clear"/>
+          </w:tcPr>
+          <w:p>
+            <w:pPr>
+              <w:pStyle w:val="Normal"/>
+              <w:rPr/>
+            </w:pPr>
+            <w:r>
+              <w:rPr>
+                <w:rFonts w:eastAsia="Arial" w:cs="Arial"/>
+                <w:b/>
+                <w:bCs/>
+                <w:color w:val="FFFFFF"/>
+                <w:sz w:val="20"/>
+                <w:szCs w:val="20"/>
+              </w:rPr>
+              <w:t>Toolchain</w:t>
+            </w:r>
+          </w:p>
+        </w:tc>
+      </w:tr>
+      <w:tr>
+        <w:trPr/>
+        <w:tc>
+          <w:tcPr>
+            <w:tcW w:w="2998" w:type="dxa"/>
+            <w:tcBorders>
+              <w:top w:val="single" w:sz="2" w:space="0" w:color="CCCCCC"/>
+              <w:left w:val="single" w:sz="2" w:space="0" w:color="CCCCCC"/>
+              <w:bottom w:val="single" w:sz="2" w:space="0" w:color="CCCCCC"/>
+              <w:right w:val="single" w:sz="2" w:space="0" w:color="CCCCCC"/>
+            </w:tcBorders>
+            <w:shd w:fill="F0F0F0" w:val="clear"/>
+          </w:tcPr>
+          <w:p>
+            <w:pPr>
+              <w:pStyle w:val="Normal"/>
+              <w:rPr/>
+            </w:pPr>
+            <w:r>
+              <w:rPr>
+                <w:rFonts w:eastAsia="Arial" w:cs="Arial"/>
+                <w:b w:val="false"/>
+                <w:bCs w:val="false"/>
+                <w:sz w:val="20"/>
+                <w:szCs w:val="20"/>
+              </w:rPr>
+              <w:t>make linux</w:t>
+            </w:r>
+          </w:p>
+        </w:tc>
+        <w:tc>
+          <w:tcPr>
+            <w:tcW w:w="6361" w:type="dxa"/>
+            <w:tcBorders>
+              <w:top w:val="single" w:sz="2" w:space="0" w:color="CCCCCC"/>
+              <w:left w:val="single" w:sz="2" w:space="0" w:color="CCCCCC"/>
+              <w:bottom w:val="single" w:sz="2" w:space="0" w:color="CCCCCC"/>
+              <w:right w:val="single" w:sz="2" w:space="0" w:color="CCCCCC"/>
+            </w:tcBorders>
+            <w:shd w:fill="FFFFFF" w:val="clear"/>
+          </w:tcPr>
+          <w:p>
+            <w:pPr>
+              <w:pStyle w:val="Normal"/>
+              <w:rPr/>
+            </w:pPr>
+            <w:r>
+              <w:rPr>
+                <w:rFonts w:eastAsia="Arial" w:cs="Arial"/>
+                <w:b w:val="false"/>
+                <w:bCs w:val="false"/>
+                <w:sz w:val="20"/>
+                <w:szCs w:val="20"/>
+              </w:rPr>
+              <w:t>GCC / Linux</w:t>
+            </w:r>
+          </w:p>
+        </w:tc>
+      </w:tr>
+      <w:tr>
+        <w:trPr/>
+        <w:tc>
+          <w:tcPr>
+            <w:tcW w:w="2998" w:type="dxa"/>
+            <w:tcBorders>
+              <w:top w:val="single" w:sz="2" w:space="0" w:color="CCCCCC"/>
+              <w:left w:val="single" w:sz="2" w:space="0" w:color="CCCCCC"/>
+              <w:bottom w:val="single" w:sz="2" w:space="0" w:color="CCCCCC"/>
+              <w:right w:val="single" w:sz="2" w:space="0" w:color="CCCCCC"/>
+            </w:tcBorders>
+            <w:shd w:fill="F0F0F0" w:val="clear"/>
+          </w:tcPr>
+          <w:p>
+            <w:pPr>
+              <w:pStyle w:val="Normal"/>
+              <w:rPr/>
+            </w:pPr>
+            <w:r>
+              <w:rPr>
+                <w:rFonts w:eastAsia="Arial" w:cs="Arial"/>
+                <w:b w:val="false"/>
+                <w:bCs w:val="false"/>
+                <w:sz w:val="20"/>
+                <w:szCs w:val="20"/>
+              </w:rPr>
+              <w:t>make windows</w:t>
+            </w:r>
+          </w:p>
+        </w:tc>
+        <w:tc>
+          <w:tcPr>
+            <w:tcW w:w="6361" w:type="dxa"/>
+            <w:tcBorders>
+              <w:top w:val="single" w:sz="2" w:space="0" w:color="CCCCCC"/>
+              <w:left w:val="single" w:sz="2" w:space="0" w:color="CCCCCC"/>
+              <w:bottom w:val="single" w:sz="2" w:space="0" w:color="CCCCCC"/>
+              <w:right w:val="single" w:sz="2" w:space="0" w:color="CCCCCC"/>
+            </w:tcBorders>
+            <w:shd w:fill="FFFFFF" w:val="clear"/>
+          </w:tcPr>
+          <w:p>
+            <w:pPr>
+              <w:pStyle w:val="Normal"/>
+              <w:rPr/>
+            </w:pPr>
+            <w:r>
+              <w:rPr>
+                <w:rFonts w:eastAsia="Arial" w:cs="Arial"/>
+                <w:b w:val="false"/>
+                <w:bCs w:val="false"/>
+                <w:sz w:val="20"/>
+                <w:szCs w:val="20"/>
+              </w:rPr>
+              <w:t>MinGW 32-bit cross</w:t>
+            </w:r>
+          </w:p>
+        </w:tc>
+      </w:tr>
+      <w:tr>
+        <w:trPr/>
+        <w:tc>
+          <w:tcPr>
+            <w:tcW w:w="2998" w:type="dxa"/>
+            <w:tcBorders>
+              <w:top w:val="single" w:sz="2" w:space="0" w:color="CCCCCC"/>
+              <w:left w:val="single" w:sz="2" w:space="0" w:color="CCCCCC"/>
+              <w:bottom w:val="single" w:sz="2" w:space="0" w:color="CCCCCC"/>
+              <w:right w:val="single" w:sz="2" w:space="0" w:color="CCCCCC"/>
+            </w:tcBorders>
+            <w:shd w:fill="F0F0F0" w:val="clear"/>
+          </w:tcPr>
+          <w:p>
+            <w:pPr>
+              <w:pStyle w:val="Normal"/>
+              <w:rPr/>
+            </w:pPr>
+            <w:r>
+              <w:rPr>
+                <w:rFonts w:eastAsia="Arial" w:cs="Arial"/>
+                <w:b w:val="false"/>
+                <w:bCs w:val="false"/>
+                <w:sz w:val="20"/>
+                <w:szCs w:val="20"/>
+              </w:rPr>
+              <w:t>make windows64</w:t>
+            </w:r>
+          </w:p>
+        </w:tc>
+        <w:tc>
+          <w:tcPr>
+            <w:tcW w:w="6361" w:type="dxa"/>
+            <w:tcBorders>
+              <w:top w:val="single" w:sz="2" w:space="0" w:color="CCCCCC"/>
+              <w:left w:val="single" w:sz="2" w:space="0" w:color="CCCCCC"/>
+              <w:bottom w:val="single" w:sz="2" w:space="0" w:color="CCCCCC"/>
+              <w:right w:val="single" w:sz="2" w:space="0" w:color="CCCCCC"/>
+            </w:tcBorders>
+            <w:shd w:fill="FFFFFF" w:val="clear"/>
+          </w:tcPr>
+          <w:p>
+            <w:pPr>
+              <w:pStyle w:val="Normal"/>
+              <w:rPr/>
+            </w:pPr>
+            <w:r>
+              <w:rPr>
+                <w:rFonts w:eastAsia="Arial" w:cs="Arial"/>
+                <w:b w:val="false"/>
+                <w:bCs w:val="false"/>
+                <w:sz w:val="20"/>
+                <w:szCs w:val="20"/>
+              </w:rPr>
+              <w:t>MinGW 64-bit cross</w:t>
+            </w:r>
+          </w:p>
+        </w:tc>
+      </w:tr>
+      <w:tr>
+        <w:trPr/>
+        <w:tc>
+          <w:tcPr>
+            <w:tcW w:w="2998" w:type="dxa"/>
+            <w:tcBorders>
+              <w:top w:val="single" w:sz="2" w:space="0" w:color="CCCCCC"/>
+              <w:left w:val="single" w:sz="2" w:space="0" w:color="CCCCCC"/>
+              <w:bottom w:val="single" w:sz="2" w:space="0" w:color="CCCCCC"/>
+              <w:right w:val="single" w:sz="2" w:space="0" w:color="CCCCCC"/>
+            </w:tcBorders>
+            <w:shd w:fill="F0F0F0" w:val="clear"/>
+          </w:tcPr>
+          <w:p>
+            <w:pPr>
+              <w:pStyle w:val="Normal"/>
+              <w:rPr/>
+            </w:pPr>
+            <w:r>
+              <w:rPr>
+                <w:rFonts w:eastAsia="Arial" w:cs="Arial"/>
+                <w:b w:val="false"/>
+                <w:bCs w:val="false"/>
+                <w:sz w:val="20"/>
+                <w:szCs w:val="20"/>
+              </w:rPr>
+              <w:t>make dos</w:t>
+            </w:r>
+          </w:p>
+        </w:tc>
+        <w:tc>
+          <w:tcPr>
+            <w:tcW w:w="6361" w:type="dxa"/>
+            <w:tcBorders>
+              <w:top w:val="single" w:sz="2" w:space="0" w:color="CCCCCC"/>
+              <w:left w:val="single" w:sz="2" w:space="0" w:color="CCCCCC"/>
+              <w:bottom w:val="single" w:sz="2" w:space="0" w:color="CCCCCC"/>
+              <w:right w:val="single" w:sz="2" w:space="0" w:color="CCCCCC"/>
+            </w:tcBorders>
+            <w:shd w:fill="FFFFFF" w:val="clear"/>
+          </w:tcPr>
+          <w:p>
+            <w:pPr>
+              <w:pStyle w:val="Normal"/>
+              <w:rPr/>
+            </w:pPr>
+            <w:r>
+              <w:rPr>
+                <w:rFonts w:eastAsia="Arial" w:cs="Arial"/>
+                <w:b w:val="false"/>
+                <w:bCs w:val="false"/>
+                <w:sz w:val="20"/>
+                <w:szCs w:val="20"/>
+              </w:rPr>
+              <w:t>ia16-elf-gcc, normal model</w:t>
+            </w:r>
+          </w:p>
+        </w:tc>
+      </w:tr>
+      <w:tr>
+        <w:trPr/>
+        <w:tc>
+          <w:tcPr>
+            <w:tcW w:w="2998" w:type="dxa"/>
+            <w:tcBorders>
+              <w:top w:val="single" w:sz="2" w:space="0" w:color="CCCCCC"/>
+              <w:left w:val="single" w:sz="2" w:space="0" w:color="CCCCCC"/>
+              <w:bottom w:val="single" w:sz="2" w:space="0" w:color="CCCCCC"/>
+              <w:right w:val="single" w:sz="2" w:space="0" w:color="CCCCCC"/>
+            </w:tcBorders>
+            <w:shd w:fill="F0F0F0" w:val="clear"/>
+          </w:tcPr>
+          <w:p>
+            <w:pPr>
+              <w:pStyle w:val="Normal"/>
+              <w:rPr/>
+            </w:pPr>
+            <w:r>
+              <w:rPr>
+                <w:rFonts w:eastAsia="Arial" w:cs="Arial"/>
+                <w:b w:val="false"/>
+                <w:bCs w:val="false"/>
+                <w:sz w:val="20"/>
+                <w:szCs w:val="20"/>
+              </w:rPr>
+              <w:t>make dos-small</w:t>
+            </w:r>
+          </w:p>
+        </w:tc>
+        <w:tc>
+          <w:tcPr>
+            <w:tcW w:w="6361" w:type="dxa"/>
+            <w:tcBorders>
+              <w:top w:val="single" w:sz="2" w:space="0" w:color="CCCCCC"/>
+              <w:left w:val="single" w:sz="2" w:space="0" w:color="CCCCCC"/>
+              <w:bottom w:val="single" w:sz="2" w:space="0" w:color="CCCCCC"/>
+              <w:right w:val="single" w:sz="2" w:space="0" w:color="CCCCCC"/>
+            </w:tcBorders>
+            <w:shd w:fill="FFFFFF" w:val="clear"/>
+          </w:tcPr>
+          <w:p>
+            <w:pPr>
+              <w:pStyle w:val="Normal"/>
+              <w:rPr/>
+            </w:pPr>
+            <w:r>
+              <w:rPr>
+                <w:rFonts w:eastAsia="Arial" w:cs="Arial"/>
+                <w:b w:val="false"/>
+                <w:bCs w:val="false"/>
+                <w:sz w:val="20"/>
+                <w:szCs w:val="20"/>
+              </w:rPr>
+              <w:t>ia16-elf-gcc, SMALL_TARGET (64 KB)</w:t>
+            </w:r>
+          </w:p>
+        </w:tc>
+      </w:tr>
+    </w:tbl>
+    <w:p>
+      <w:pPr>
+        <w:pStyle w:val="Normal"/>
+        <w:spacing w:before="0" w:after="80"/>
+        <w:rPr/>
+      </w:pPr>
+      <w:r>
+        <w:rPr/>
+      </w:r>
+    </w:p>
+    <w:p>
+      <w:pPr>
+        <w:pStyle w:val="Normal"/>
+        <w:spacing w:before="0" w:after="80"/>
+        <w:rPr/>
+      </w:pPr>
+      <w:r>
+        <w:rPr>
+          <w:rFonts w:eastAsia="Arial" w:cs="Arial"/>
+          <w:sz w:val="20"/>
+          <w:szCs w:val="20"/>
+        </w:rPr>
+        <w:t>To retarget to Z80, 6809, or AVR adjust only the typedef block at the top of BASIC.c (bint, ubint, bptr) and the platform HAL section. No other changes are needed for the numeric types.</w:t>
+      </w:r>
+    </w:p>
+    <w:p>
+      <w:pPr>
+        <w:pStyle w:val="Heading1"/>
+        <w:spacing w:before="360" w:after="120"/>
+        <w:rPr/>
+      </w:pPr>
+      <w:r>
+        <w:rPr>
+          <w:rFonts w:eastAsia="Arial" w:cs="Arial" w:ascii="Arial" w:hAnsi="Arial"/>
+          <w:b/>
+          <w:bCs/>
+          <w:color w:val="1F3864"/>
+          <w:sz w:val="32"/>
+          <w:szCs w:val="32"/>
+        </w:rPr>
+        <w:t>Small-Target Tuning</w:t>
+      </w:r>
+    </w:p>
+    <w:p>
+      <w:pPr>
+        <w:pStyle w:val="Normal"/>
+        <w:spacing w:before="0" w:after="80"/>
+        <w:rPr/>
+      </w:pPr>
+      <w:r>
+        <w:rPr>
+          <w:rFonts w:eastAsia="Arial" w:cs="Arial"/>
+          <w:sz w:val="20"/>
+          <w:szCs w:val="20"/>
+        </w:rPr>
+        <w:t>Compile with -DSMALL_TARGET to enable conservative defaults for 64 KB address spaces. Individual values can also be overridden on the command line:</w:t>
+      </w:r>
+    </w:p>
+    <w:p>
+      <w:pPr>
+        <w:pStyle w:val="Normal"/>
+        <w:spacing w:before="40" w:after="40"/>
+        <w:ind w:left="720"/>
+        <w:rPr/>
+      </w:pPr>
+      <w:r>
+        <w:rPr>
+          <w:rFonts w:eastAsia="Courier New" w:cs="Courier New" w:ascii="Courier New" w:hAnsi="Courier New"/>
+          <w:color w:val="333333"/>
+          <w:sz w:val="20"/>
+          <w:szCs w:val="20"/>
+        </w:rPr>
+        <w:t>gcc -DBUFFER_SIZE=80 -DNUM_VAR=130 -DCT_DEPTH=12 ...</w:t>
+      </w:r>
+    </w:p>
+    <w:tbl>
+      <w:tblPr>
+        <w:tblW w:w="9360" w:type="dxa"/>
+        <w:jc w:val="left"/>
+        <w:tblInd w:w="0" w:type="dxa"/>
+        <w:tblLayout w:type="fixed"/>
+        <w:tblCellMar>
+          <w:top w:w="80" w:type="dxa"/>
+          <w:left w:w="120" w:type="dxa"/>
+          <w:bottom w:w="80" w:type="dxa"/>
+          <w:right w:w="120" w:type="dxa"/>
+        </w:tblCellMar>
+      </w:tblPr>
+      <w:tblGrid>
+        <w:gridCol w:w="2998"/>
         <w:gridCol w:w="6361"/>
       </w:tblGrid>
       <w:tr>
@@ -6038,12 +7144,12 @@
         </w:trPr>
         <w:tc>
           <w:tcPr>
-            <w:tcW w:w="2999" w:type="dxa"/>
-            <w:tcBorders>
-              <w:top w:val="single" w:sz="2" w:space="0" w:color="CCCCCC"/>
-              <w:start w:val="single" w:sz="2" w:space="0" w:color="CCCCCC"/>
-              <w:bottom w:val="single" w:sz="2" w:space="0" w:color="CCCCCC"/>
-              <w:end w:val="single" w:sz="2" w:space="0" w:color="CCCCCC"/>
+            <w:tcW w:w="2998" w:type="dxa"/>
+            <w:tcBorders>
+              <w:top w:val="single" w:sz="2" w:space="0" w:color="CCCCCC"/>
+              <w:left w:val="single" w:sz="2" w:space="0" w:color="CCCCCC"/>
+              <w:bottom w:val="single" w:sz="2" w:space="0" w:color="CCCCCC"/>
+              <w:right w:val="single" w:sz="2" w:space="0" w:color="CCCCCC"/>
             </w:tcBorders>
             <w:shd w:fill="2E5090" w:val="clear"/>
           </w:tcPr>
@@ -6061,7 +7167,7 @@
                 <w:sz w:val="20"/>
                 <w:szCs w:val="20"/>
               </w:rPr>
-              <w:t>Target</w:t>
+              <w:t>Define</w:t>
             </w:r>
           </w:p>
         </w:tc>
@@ -6070,9 +7176,9 @@
             <w:tcW w:w="6361" w:type="dxa"/>
             <w:tcBorders>
               <w:top w:val="single" w:sz="2" w:space="0" w:color="CCCCCC"/>
-              <w:start w:val="single" w:sz="2" w:space="0" w:color="CCCCCC"/>
-              <w:bottom w:val="single" w:sz="2" w:space="0" w:color="CCCCCC"/>
-              <w:end w:val="single" w:sz="2" w:space="0" w:color="CCCCCC"/>
+              <w:left w:val="single" w:sz="2" w:space="0" w:color="CCCCCC"/>
+              <w:bottom w:val="single" w:sz="2" w:space="0" w:color="CCCCCC"/>
+              <w:right w:val="single" w:sz="2" w:space="0" w:color="CCCCCC"/>
             </w:tcBorders>
             <w:shd w:fill="2E5090" w:val="clear"/>
           </w:tcPr>
@@ -6090,7 +7196,7 @@
                 <w:sz w:val="20"/>
                 <w:szCs w:val="20"/>
               </w:rPr>
-              <w:t>Toolchain</w:t>
+              <w:t>Effect</w:t>
             </w:r>
           </w:p>
         </w:tc>
@@ -6099,12 +7205,12 @@
         <w:trPr/>
         <w:tc>
           <w:tcPr>
-            <w:tcW w:w="2999" w:type="dxa"/>
-            <w:tcBorders>
-              <w:top w:val="single" w:sz="2" w:space="0" w:color="CCCCCC"/>
-              <w:start w:val="single" w:sz="2" w:space="0" w:color="CCCCCC"/>
-              <w:bottom w:val="single" w:sz="2" w:space="0" w:color="CCCCCC"/>
-              <w:end w:val="single" w:sz="2" w:space="0" w:color="CCCCCC"/>
+            <w:tcW w:w="2998" w:type="dxa"/>
+            <w:tcBorders>
+              <w:top w:val="single" w:sz="2" w:space="0" w:color="CCCCCC"/>
+              <w:left w:val="single" w:sz="2" w:space="0" w:color="CCCCCC"/>
+              <w:bottom w:val="single" w:sz="2" w:space="0" w:color="CCCCCC"/>
+              <w:right w:val="single" w:sz="2" w:space="0" w:color="CCCCCC"/>
             </w:tcBorders>
             <w:shd w:fill="F0F0F0" w:val="clear"/>
           </w:tcPr>
@@ -6121,7 +7227,7 @@
                 <w:sz w:val="20"/>
                 <w:szCs w:val="20"/>
               </w:rPr>
-              <w:t>make linux</w:t>
+              <w:t>BUFFER_SIZE</w:t>
             </w:r>
           </w:p>
         </w:tc>
@@ -6130,9 +7236,9 @@
             <w:tcW w:w="6361" w:type="dxa"/>
             <w:tcBorders>
               <w:top w:val="single" w:sz="2" w:space="0" w:color="CCCCCC"/>
-              <w:start w:val="single" w:sz="2" w:space="0" w:color="CCCCCC"/>
-              <w:bottom w:val="single" w:sz="2" w:space="0" w:color="CCCCCC"/>
-              <w:end w:val="single" w:sz="2" w:space="0" w:color="CCCCCC"/>
+              <w:left w:val="single" w:sz="2" w:space="0" w:color="CCCCCC"/>
+              <w:bottom w:val="single" w:sz="2" w:space="0" w:color="CCCCCC"/>
+              <w:right w:val="single" w:sz="2" w:space="0" w:color="CCCCCC"/>
             </w:tcBorders>
             <w:shd w:fill="FFFFFF" w:val="clear"/>
           </w:tcPr>
@@ -6149,7 +7255,7 @@
                 <w:sz w:val="20"/>
                 <w:szCs w:val="20"/>
               </w:rPr>
-              <w:t>GCC / Linux</w:t>
+              <w:t>Input line buffer size in bytes (default 100, small 80)</w:t>
             </w:r>
           </w:p>
         </w:tc>
@@ -6158,12 +7264,12 @@
         <w:trPr/>
         <w:tc>
           <w:tcPr>
-            <w:tcW w:w="2999" w:type="dxa"/>
-            <w:tcBorders>
-              <w:top w:val="single" w:sz="2" w:space="0" w:color="CCCCCC"/>
-              <w:start w:val="single" w:sz="2" w:space="0" w:color="CCCCCC"/>
-              <w:bottom w:val="single" w:sz="2" w:space="0" w:color="CCCCCC"/>
-              <w:end w:val="single" w:sz="2" w:space="0" w:color="CCCCCC"/>
+            <w:tcW w:w="2998" w:type="dxa"/>
+            <w:tcBorders>
+              <w:top w:val="single" w:sz="2" w:space="0" w:color="CCCCCC"/>
+              <w:left w:val="single" w:sz="2" w:space="0" w:color="CCCCCC"/>
+              <w:bottom w:val="single" w:sz="2" w:space="0" w:color="CCCCCC"/>
+              <w:right w:val="single" w:sz="2" w:space="0" w:color="CCCCCC"/>
             </w:tcBorders>
             <w:shd w:fill="F0F0F0" w:val="clear"/>
           </w:tcPr>
@@ -6180,7 +7286,7 @@
                 <w:sz w:val="20"/>
                 <w:szCs w:val="20"/>
               </w:rPr>
-              <w:t>make windows</w:t>
+              <w:t>SA_SIZE</w:t>
             </w:r>
           </w:p>
         </w:tc>
@@ -6189,9 +7295,9 @@
             <w:tcW w:w="6361" w:type="dxa"/>
             <w:tcBorders>
               <w:top w:val="single" w:sz="2" w:space="0" w:color="CCCCCC"/>
-              <w:start w:val="single" w:sz="2" w:space="0" w:color="CCCCCC"/>
-              <w:bottom w:val="single" w:sz="2" w:space="0" w:color="CCCCCC"/>
-              <w:end w:val="single" w:sz="2" w:space="0" w:color="CCCCCC"/>
+              <w:left w:val="single" w:sz="2" w:space="0" w:color="CCCCCC"/>
+              <w:bottom w:val="single" w:sz="2" w:space="0" w:color="CCCCCC"/>
+              <w:right w:val="single" w:sz="2" w:space="0" w:color="CCCCCC"/>
             </w:tcBorders>
             <w:shd w:fill="FFFFFF" w:val="clear"/>
           </w:tcPr>
@@ -6208,7 +7314,7 @@
                 <w:sz w:val="20"/>
                 <w:szCs w:val="20"/>
               </w:rPr>
-              <w:t>MinGW 32-bit cross</w:t>
+              <w:t>String accumulator capacity in bytes (default 100, small 64)</w:t>
             </w:r>
           </w:p>
         </w:tc>
@@ -6217,12 +7323,12 @@
         <w:trPr/>
         <w:tc>
           <w:tcPr>
-            <w:tcW w:w="2999" w:type="dxa"/>
-            <w:tcBorders>
-              <w:top w:val="single" w:sz="2" w:space="0" w:color="CCCCCC"/>
-              <w:start w:val="single" w:sz="2" w:space="0" w:color="CCCCCC"/>
-              <w:bottom w:val="single" w:sz="2" w:space="0" w:color="CCCCCC"/>
-              <w:end w:val="single" w:sz="2" w:space="0" w:color="CCCCCC"/>
+            <w:tcW w:w="2998" w:type="dxa"/>
+            <w:tcBorders>
+              <w:top w:val="single" w:sz="2" w:space="0" w:color="CCCCCC"/>
+              <w:left w:val="single" w:sz="2" w:space="0" w:color="CCCCCC"/>
+              <w:bottom w:val="single" w:sz="2" w:space="0" w:color="CCCCCC"/>
+              <w:right w:val="single" w:sz="2" w:space="0" w:color="CCCCCC"/>
             </w:tcBorders>
             <w:shd w:fill="F0F0F0" w:val="clear"/>
           </w:tcPr>
@@ -6239,7 +7345,7 @@
                 <w:sz w:val="20"/>
                 <w:szCs w:val="20"/>
               </w:rPr>
-              <w:t>make windows64</w:t>
+              <w:t>NUM_VAR</w:t>
             </w:r>
           </w:p>
         </w:tc>
@@ -6248,9 +7354,9 @@
             <w:tcW w:w="6361" w:type="dxa"/>
             <w:tcBorders>
               <w:top w:val="single" w:sz="2" w:space="0" w:color="CCCCCC"/>
-              <w:start w:val="single" w:sz="2" w:space="0" w:color="CCCCCC"/>
-              <w:bottom w:val="single" w:sz="2" w:space="0" w:color="CCCCCC"/>
-              <w:end w:val="single" w:sz="2" w:space="0" w:color="CCCCCC"/>
+              <w:left w:val="single" w:sz="2" w:space="0" w:color="CCCCCC"/>
+              <w:bottom w:val="single" w:sz="2" w:space="0" w:color="CCCCCC"/>
+              <w:right w:val="single" w:sz="2" w:space="0" w:color="CCCCCC"/>
             </w:tcBorders>
             <w:shd w:fill="FFFFFF" w:val="clear"/>
           </w:tcPr>
@@ -6267,7 +7373,7 @@
                 <w:sz w:val="20"/>
                 <w:szCs w:val="20"/>
               </w:rPr>
-              <w:t>MinGW 64-bit cross</w:t>
+              <w:t>Variable slots: 260 full, 130 half, 52 minimal</w:t>
             </w:r>
           </w:p>
         </w:tc>
@@ -6276,12 +7382,12 @@
         <w:trPr/>
         <w:tc>
           <w:tcPr>
-            <w:tcW w:w="2999" w:type="dxa"/>
-            <w:tcBorders>
-              <w:top w:val="single" w:sz="2" w:space="0" w:color="CCCCCC"/>
-              <w:start w:val="single" w:sz="2" w:space="0" w:color="CCCCCC"/>
-              <w:bottom w:val="single" w:sz="2" w:space="0" w:color="CCCCCC"/>
-              <w:end w:val="single" w:sz="2" w:space="0" w:color="CCCCCC"/>
+            <w:tcW w:w="2998" w:type="dxa"/>
+            <w:tcBorders>
+              <w:top w:val="single" w:sz="2" w:space="0" w:color="CCCCCC"/>
+              <w:left w:val="single" w:sz="2" w:space="0" w:color="CCCCCC"/>
+              <w:bottom w:val="single" w:sz="2" w:space="0" w:color="CCCCCC"/>
+              <w:right w:val="single" w:sz="2" w:space="0" w:color="CCCCCC"/>
             </w:tcBorders>
             <w:shd w:fill="F0F0F0" w:val="clear"/>
           </w:tcPr>
@@ -6298,7 +7404,7 @@
                 <w:sz w:val="20"/>
                 <w:szCs w:val="20"/>
               </w:rPr>
-              <w:t>make dos</w:t>
+              <w:t>CTL_DEPTH</w:t>
             </w:r>
           </w:p>
         </w:tc>
@@ -6307,9 +7413,9 @@
             <w:tcW w:w="6361" w:type="dxa"/>
             <w:tcBorders>
               <w:top w:val="single" w:sz="2" w:space="0" w:color="CCCCCC"/>
-              <w:start w:val="single" w:sz="2" w:space="0" w:color="CCCCCC"/>
-              <w:bottom w:val="single" w:sz="2" w:space="0" w:color="CCCCCC"/>
-              <w:end w:val="single" w:sz="2" w:space="0" w:color="CCCCCC"/>
+              <w:left w:val="single" w:sz="2" w:space="0" w:color="CCCCCC"/>
+              <w:bottom w:val="single" w:sz="2" w:space="0" w:color="CCCCCC"/>
+              <w:right w:val="single" w:sz="2" w:space="0" w:color="CCCCCC"/>
             </w:tcBorders>
             <w:shd w:fill="FFFFFF" w:val="clear"/>
           </w:tcPr>
@@ -6326,7 +7432,7 @@
                 <w:sz w:val="20"/>
                 <w:szCs w:val="20"/>
               </w:rPr>
-              <w:t>ia16-elf-gcc, normal model</w:t>
+              <w:t>Control stack depth (default 50, small 24)</w:t>
             </w:r>
           </w:p>
         </w:tc>
@@ -6335,12 +7441,12 @@
         <w:trPr/>
         <w:tc>
           <w:tcPr>
-            <w:tcW w:w="2999" w:type="dxa"/>
-            <w:tcBorders>
-              <w:top w:val="single" w:sz="2" w:space="0" w:color="CCCCCC"/>
-              <w:start w:val="single" w:sz="2" w:space="0" w:color="CCCCCC"/>
-              <w:bottom w:val="single" w:sz="2" w:space="0" w:color="CCCCCC"/>
-              <w:end w:val="single" w:sz="2" w:space="0" w:color="CCCCCC"/>
+            <w:tcW w:w="2998" w:type="dxa"/>
+            <w:tcBorders>
+              <w:top w:val="single" w:sz="2" w:space="0" w:color="CCCCCC"/>
+              <w:left w:val="single" w:sz="2" w:space="0" w:color="CCCCCC"/>
+              <w:bottom w:val="single" w:sz="2" w:space="0" w:color="CCCCCC"/>
+              <w:right w:val="single" w:sz="2" w:space="0" w:color="CCCCCC"/>
             </w:tcBorders>
             <w:shd w:fill="F0F0F0" w:val="clear"/>
           </w:tcPr>
@@ -6357,7 +7463,7 @@
                 <w:sz w:val="20"/>
                 <w:szCs w:val="20"/>
               </w:rPr>
-              <w:t>make dos-small</w:t>
+              <w:t>MAX_FILES</w:t>
             </w:r>
           </w:p>
         </w:tc>
@@ -6366,460 +7472,9 @@
             <w:tcW w:w="6361" w:type="dxa"/>
             <w:tcBorders>
               <w:top w:val="single" w:sz="2" w:space="0" w:color="CCCCCC"/>
-              <w:start w:val="single" w:sz="2" w:space="0" w:color="CCCCCC"/>
-              <w:bottom w:val="single" w:sz="2" w:space="0" w:color="CCCCCC"/>
-              <w:end w:val="single" w:sz="2" w:space="0" w:color="CCCCCC"/>
-            </w:tcBorders>
-            <w:shd w:fill="FFFFFF" w:val="clear"/>
-          </w:tcPr>
-          <w:p>
-            <w:pPr>
-              <w:pStyle w:val="Normal"/>
-              <w:rPr/>
-            </w:pPr>
-            <w:r>
-              <w:rPr>
-                <w:rFonts w:eastAsia="Arial" w:cs="Arial"/>
-                <w:b w:val="false"/>
-                <w:bCs w:val="false"/>
-                <w:sz w:val="20"/>
-                <w:szCs w:val="20"/>
-              </w:rPr>
-              <w:t>ia16-elf-gcc, SMALL_TARGET (64 KB)</w:t>
-            </w:r>
-          </w:p>
-        </w:tc>
-      </w:tr>
-    </w:tbl>
-    <w:p>
-      <w:pPr>
-        <w:pStyle w:val="Normal"/>
-        <w:spacing w:before="0" w:after="80"/>
-        <w:rPr/>
-      </w:pPr>
-      <w:r>
-        <w:rPr/>
-      </w:r>
-    </w:p>
-    <w:p>
-      <w:pPr>
-        <w:pStyle w:val="Normal"/>
-        <w:spacing w:before="0" w:after="80"/>
-        <w:rPr/>
-      </w:pPr>
-      <w:r>
-        <w:rPr>
-          <w:rFonts w:eastAsia="Arial" w:cs="Arial"/>
-          <w:sz w:val="20"/>
-          <w:szCs w:val="20"/>
-        </w:rPr>
-        <w:t>To retarget to Z80, 6809, or AVR adjust only the typedef block at the top of BASIC.c (bint, ubint, bptr) and the platform HAL section. No other changes are needed for the numeric types.</w:t>
-      </w:r>
-    </w:p>
-    <w:p>
-      <w:pPr>
-        <w:pStyle w:val="Heading1"/>
-        <w:spacing w:before="360" w:after="120"/>
-        <w:rPr/>
-      </w:pPr>
-      <w:r>
-        <w:rPr>
-          <w:rFonts w:eastAsia="Arial" w:cs="Arial" w:ascii="Arial" w:hAnsi="Arial"/>
-          <w:b/>
-          <w:bCs/>
-          <w:color w:val="1F3864"/>
-          <w:sz w:val="32"/>
-          <w:szCs w:val="32"/>
-        </w:rPr>
-        <w:t>Small-Target Tuning</w:t>
-      </w:r>
-    </w:p>
-    <w:p>
-      <w:pPr>
-        <w:pStyle w:val="Normal"/>
-        <w:spacing w:before="0" w:after="80"/>
-        <w:rPr/>
-      </w:pPr>
-      <w:r>
-        <w:rPr>
-          <w:rFonts w:eastAsia="Arial" w:cs="Arial"/>
-          <w:sz w:val="20"/>
-          <w:szCs w:val="20"/>
-        </w:rPr>
-        <w:t>Compile with -DSMALL_TARGET to enable conservative defaults for 64 KB address spaces. Individual values can also be overridden on the command line:</w:t>
-      </w:r>
-    </w:p>
-    <w:p>
-      <w:pPr>
-        <w:pStyle w:val="Normal"/>
-        <w:spacing w:before="40" w:after="40"/>
-        <w:ind w:start="720"/>
-        <w:rPr/>
-      </w:pPr>
-      <w:r>
-        <w:rPr>
-          <w:rFonts w:eastAsia="Courier New" w:cs="Courier New" w:ascii="Courier New" w:hAnsi="Courier New"/>
-          <w:color w:val="333333"/>
-          <w:sz w:val="20"/>
-          <w:szCs w:val="20"/>
-        </w:rPr>
-        <w:t>gcc -DBUFFER_SIZE=80 -DNUM_VAR=130 -DCT_DEPTH=12 ...</w:t>
-      </w:r>
-    </w:p>
-    <w:tbl>
-      <w:tblPr>
-        <w:tblW w:w="9360" w:type="dxa"/>
-        <w:jc w:val="start"/>
-        <w:tblInd w:w="0" w:type="dxa"/>
-        <w:tblLayout w:type="fixed"/>
-        <w:tblCellMar>
-          <w:top w:w="80" w:type="dxa"/>
-          <w:start w:w="120" w:type="dxa"/>
-          <w:bottom w:w="80" w:type="dxa"/>
-          <w:end w:w="120" w:type="dxa"/>
-        </w:tblCellMar>
-      </w:tblPr>
-      <w:tblGrid>
-        <w:gridCol w:w="2999"/>
-        <w:gridCol w:w="6361"/>
-      </w:tblGrid>
-      <w:tr>
-        <w:trPr>
-          <w:tblHeader w:val="true"/>
-        </w:trPr>
-        <w:tc>
-          <w:tcPr>
-            <w:tcW w:w="2999" w:type="dxa"/>
-            <w:tcBorders>
-              <w:top w:val="single" w:sz="2" w:space="0" w:color="CCCCCC"/>
-              <w:start w:val="single" w:sz="2" w:space="0" w:color="CCCCCC"/>
-              <w:bottom w:val="single" w:sz="2" w:space="0" w:color="CCCCCC"/>
-              <w:end w:val="single" w:sz="2" w:space="0" w:color="CCCCCC"/>
-            </w:tcBorders>
-            <w:shd w:fill="2E5090" w:val="clear"/>
-          </w:tcPr>
-          <w:p>
-            <w:pPr>
-              <w:pStyle w:val="Normal"/>
-              <w:rPr/>
-            </w:pPr>
-            <w:r>
-              <w:rPr>
-                <w:rFonts w:eastAsia="Arial" w:cs="Arial"/>
-                <w:b/>
-                <w:bCs/>
-                <w:color w:val="FFFFFF"/>
-                <w:sz w:val="20"/>
-                <w:szCs w:val="20"/>
-              </w:rPr>
-              <w:t>Define</w:t>
-            </w:r>
-          </w:p>
-        </w:tc>
-        <w:tc>
-          <w:tcPr>
-            <w:tcW w:w="6361" w:type="dxa"/>
-            <w:tcBorders>
-              <w:top w:val="single" w:sz="2" w:space="0" w:color="CCCCCC"/>
-              <w:start w:val="single" w:sz="2" w:space="0" w:color="CCCCCC"/>
-              <w:bottom w:val="single" w:sz="2" w:space="0" w:color="CCCCCC"/>
-              <w:end w:val="single" w:sz="2" w:space="0" w:color="CCCCCC"/>
-            </w:tcBorders>
-            <w:shd w:fill="2E5090" w:val="clear"/>
-          </w:tcPr>
-          <w:p>
-            <w:pPr>
-              <w:pStyle w:val="Normal"/>
-              <w:rPr/>
-            </w:pPr>
-            <w:r>
-              <w:rPr>
-                <w:rFonts w:eastAsia="Arial" w:cs="Arial"/>
-                <w:b/>
-                <w:bCs/>
-                <w:color w:val="FFFFFF"/>
-                <w:sz w:val="20"/>
-                <w:szCs w:val="20"/>
-              </w:rPr>
-              <w:t>Effect</w:t>
-            </w:r>
-          </w:p>
-        </w:tc>
-      </w:tr>
-      <w:tr>
-        <w:trPr/>
-        <w:tc>
-          <w:tcPr>
-            <w:tcW w:w="2999" w:type="dxa"/>
-            <w:tcBorders>
-              <w:top w:val="single" w:sz="2" w:space="0" w:color="CCCCCC"/>
-              <w:start w:val="single" w:sz="2" w:space="0" w:color="CCCCCC"/>
-              <w:bottom w:val="single" w:sz="2" w:space="0" w:color="CCCCCC"/>
-              <w:end w:val="single" w:sz="2" w:space="0" w:color="CCCCCC"/>
-            </w:tcBorders>
-            <w:shd w:fill="F0F0F0" w:val="clear"/>
-          </w:tcPr>
-          <w:p>
-            <w:pPr>
-              <w:pStyle w:val="Normal"/>
-              <w:rPr/>
-            </w:pPr>
-            <w:r>
-              <w:rPr>
-                <w:rFonts w:eastAsia="Arial" w:cs="Arial"/>
-                <w:b w:val="false"/>
-                <w:bCs w:val="false"/>
-                <w:sz w:val="20"/>
-                <w:szCs w:val="20"/>
-              </w:rPr>
-              <w:t>BUFFER_SIZE</w:t>
-            </w:r>
-          </w:p>
-        </w:tc>
-        <w:tc>
-          <w:tcPr>
-            <w:tcW w:w="6361" w:type="dxa"/>
-            <w:tcBorders>
-              <w:top w:val="single" w:sz="2" w:space="0" w:color="CCCCCC"/>
-              <w:start w:val="single" w:sz="2" w:space="0" w:color="CCCCCC"/>
-              <w:bottom w:val="single" w:sz="2" w:space="0" w:color="CCCCCC"/>
-              <w:end w:val="single" w:sz="2" w:space="0" w:color="CCCCCC"/>
-            </w:tcBorders>
-            <w:shd w:fill="FFFFFF" w:val="clear"/>
-          </w:tcPr>
-          <w:p>
-            <w:pPr>
-              <w:pStyle w:val="Normal"/>
-              <w:rPr/>
-            </w:pPr>
-            <w:r>
-              <w:rPr>
-                <w:rFonts w:eastAsia="Arial" w:cs="Arial"/>
-                <w:b w:val="false"/>
-                <w:bCs w:val="false"/>
-                <w:sz w:val="20"/>
-                <w:szCs w:val="20"/>
-              </w:rPr>
-              <w:t>Input line buffer size in bytes (default 100, small 80)</w:t>
-            </w:r>
-          </w:p>
-        </w:tc>
-      </w:tr>
-      <w:tr>
-        <w:trPr/>
-        <w:tc>
-          <w:tcPr>
-            <w:tcW w:w="2999" w:type="dxa"/>
-            <w:tcBorders>
-              <w:top w:val="single" w:sz="2" w:space="0" w:color="CCCCCC"/>
-              <w:start w:val="single" w:sz="2" w:space="0" w:color="CCCCCC"/>
-              <w:bottom w:val="single" w:sz="2" w:space="0" w:color="CCCCCC"/>
-              <w:end w:val="single" w:sz="2" w:space="0" w:color="CCCCCC"/>
-            </w:tcBorders>
-            <w:shd w:fill="F0F0F0" w:val="clear"/>
-          </w:tcPr>
-          <w:p>
-            <w:pPr>
-              <w:pStyle w:val="Normal"/>
-              <w:rPr/>
-            </w:pPr>
-            <w:r>
-              <w:rPr>
-                <w:rFonts w:eastAsia="Arial" w:cs="Arial"/>
-                <w:b w:val="false"/>
-                <w:bCs w:val="false"/>
-                <w:sz w:val="20"/>
-                <w:szCs w:val="20"/>
-              </w:rPr>
-              <w:t>SA_SIZE</w:t>
-            </w:r>
-          </w:p>
-        </w:tc>
-        <w:tc>
-          <w:tcPr>
-            <w:tcW w:w="6361" w:type="dxa"/>
-            <w:tcBorders>
-              <w:top w:val="single" w:sz="2" w:space="0" w:color="CCCCCC"/>
-              <w:start w:val="single" w:sz="2" w:space="0" w:color="CCCCCC"/>
-              <w:bottom w:val="single" w:sz="2" w:space="0" w:color="CCCCCC"/>
-              <w:end w:val="single" w:sz="2" w:space="0" w:color="CCCCCC"/>
-            </w:tcBorders>
-            <w:shd w:fill="FFFFFF" w:val="clear"/>
-          </w:tcPr>
-          <w:p>
-            <w:pPr>
-              <w:pStyle w:val="Normal"/>
-              <w:rPr/>
-            </w:pPr>
-            <w:r>
-              <w:rPr>
-                <w:rFonts w:eastAsia="Arial" w:cs="Arial"/>
-                <w:b w:val="false"/>
-                <w:bCs w:val="false"/>
-                <w:sz w:val="20"/>
-                <w:szCs w:val="20"/>
-              </w:rPr>
-              <w:t>String accumulator capacity in bytes (default 100, small 64)</w:t>
-            </w:r>
-          </w:p>
-        </w:tc>
-      </w:tr>
-      <w:tr>
-        <w:trPr/>
-        <w:tc>
-          <w:tcPr>
-            <w:tcW w:w="2999" w:type="dxa"/>
-            <w:tcBorders>
-              <w:top w:val="single" w:sz="2" w:space="0" w:color="CCCCCC"/>
-              <w:start w:val="single" w:sz="2" w:space="0" w:color="CCCCCC"/>
-              <w:bottom w:val="single" w:sz="2" w:space="0" w:color="CCCCCC"/>
-              <w:end w:val="single" w:sz="2" w:space="0" w:color="CCCCCC"/>
-            </w:tcBorders>
-            <w:shd w:fill="F0F0F0" w:val="clear"/>
-          </w:tcPr>
-          <w:p>
-            <w:pPr>
-              <w:pStyle w:val="Normal"/>
-              <w:rPr/>
-            </w:pPr>
-            <w:r>
-              <w:rPr>
-                <w:rFonts w:eastAsia="Arial" w:cs="Arial"/>
-                <w:b w:val="false"/>
-                <w:bCs w:val="false"/>
-                <w:sz w:val="20"/>
-                <w:szCs w:val="20"/>
-              </w:rPr>
-              <w:t>NUM_VAR</w:t>
-            </w:r>
-          </w:p>
-        </w:tc>
-        <w:tc>
-          <w:tcPr>
-            <w:tcW w:w="6361" w:type="dxa"/>
-            <w:tcBorders>
-              <w:top w:val="single" w:sz="2" w:space="0" w:color="CCCCCC"/>
-              <w:start w:val="single" w:sz="2" w:space="0" w:color="CCCCCC"/>
-              <w:bottom w:val="single" w:sz="2" w:space="0" w:color="CCCCCC"/>
-              <w:end w:val="single" w:sz="2" w:space="0" w:color="CCCCCC"/>
-            </w:tcBorders>
-            <w:shd w:fill="FFFFFF" w:val="clear"/>
-          </w:tcPr>
-          <w:p>
-            <w:pPr>
-              <w:pStyle w:val="Normal"/>
-              <w:rPr/>
-            </w:pPr>
-            <w:r>
-              <w:rPr>
-                <w:rFonts w:eastAsia="Arial" w:cs="Arial"/>
-                <w:b w:val="false"/>
-                <w:bCs w:val="false"/>
-                <w:sz w:val="20"/>
-                <w:szCs w:val="20"/>
-              </w:rPr>
-              <w:t>Variable slots: 260 full, 130 half, 52 minimal</w:t>
-            </w:r>
-          </w:p>
-        </w:tc>
-      </w:tr>
-      <w:tr>
-        <w:trPr/>
-        <w:tc>
-          <w:tcPr>
-            <w:tcW w:w="2999" w:type="dxa"/>
-            <w:tcBorders>
-              <w:top w:val="single" w:sz="2" w:space="0" w:color="CCCCCC"/>
-              <w:start w:val="single" w:sz="2" w:space="0" w:color="CCCCCC"/>
-              <w:bottom w:val="single" w:sz="2" w:space="0" w:color="CCCCCC"/>
-              <w:end w:val="single" w:sz="2" w:space="0" w:color="CCCCCC"/>
-            </w:tcBorders>
-            <w:shd w:fill="F0F0F0" w:val="clear"/>
-          </w:tcPr>
-          <w:p>
-            <w:pPr>
-              <w:pStyle w:val="Normal"/>
-              <w:rPr/>
-            </w:pPr>
-            <w:r>
-              <w:rPr>
-                <w:rFonts w:eastAsia="Arial" w:cs="Arial"/>
-                <w:b w:val="false"/>
-                <w:bCs w:val="false"/>
-                <w:sz w:val="20"/>
-                <w:szCs w:val="20"/>
-              </w:rPr>
-              <w:t>CTL_DEPTH</w:t>
-            </w:r>
-          </w:p>
-        </w:tc>
-        <w:tc>
-          <w:tcPr>
-            <w:tcW w:w="6361" w:type="dxa"/>
-            <w:tcBorders>
-              <w:top w:val="single" w:sz="2" w:space="0" w:color="CCCCCC"/>
-              <w:start w:val="single" w:sz="2" w:space="0" w:color="CCCCCC"/>
-              <w:bottom w:val="single" w:sz="2" w:space="0" w:color="CCCCCC"/>
-              <w:end w:val="single" w:sz="2" w:space="0" w:color="CCCCCC"/>
-            </w:tcBorders>
-            <w:shd w:fill="FFFFFF" w:val="clear"/>
-          </w:tcPr>
-          <w:p>
-            <w:pPr>
-              <w:pStyle w:val="Normal"/>
-              <w:rPr/>
-            </w:pPr>
-            <w:r>
-              <w:rPr>
-                <w:rFonts w:eastAsia="Arial" w:cs="Arial"/>
-                <w:b w:val="false"/>
-                <w:bCs w:val="false"/>
-                <w:sz w:val="20"/>
-                <w:szCs w:val="20"/>
-              </w:rPr>
-              <w:t>Control stack depth (default 50, small 24)</w:t>
-            </w:r>
-          </w:p>
-        </w:tc>
-      </w:tr>
-      <w:tr>
-        <w:trPr/>
-        <w:tc>
-          <w:tcPr>
-            <w:tcW w:w="2999" w:type="dxa"/>
-            <w:tcBorders>
-              <w:top w:val="single" w:sz="2" w:space="0" w:color="CCCCCC"/>
-              <w:start w:val="single" w:sz="2" w:space="0" w:color="CCCCCC"/>
-              <w:bottom w:val="single" w:sz="2" w:space="0" w:color="CCCCCC"/>
-              <w:end w:val="single" w:sz="2" w:space="0" w:color="CCCCCC"/>
-            </w:tcBorders>
-            <w:shd w:fill="F0F0F0" w:val="clear"/>
-          </w:tcPr>
-          <w:p>
-            <w:pPr>
-              <w:pStyle w:val="Normal"/>
-              <w:rPr/>
-            </w:pPr>
-            <w:r>
-              <w:rPr>
-                <w:rFonts w:eastAsia="Arial" w:cs="Arial"/>
-                <w:b w:val="false"/>
-                <w:bCs w:val="false"/>
-                <w:sz w:val="20"/>
-                <w:szCs w:val="20"/>
-              </w:rPr>
-              <w:t>MAX_FILES</w:t>
-            </w:r>
-          </w:p>
-        </w:tc>
-        <w:tc>
-          <w:tcPr>
-            <w:tcW w:w="6361" w:type="dxa"/>
-            <w:tcBorders>
-              <w:top w:val="single" w:sz="2" w:space="0" w:color="CCCCCC"/>
-              <w:start w:val="single" w:sz="2" w:space="0" w:color="CCCCCC"/>
-              <w:bottom w:val="single" w:sz="2" w:space="0" w:color="CCCCCC"/>
-              <w:end w:val="single" w:sz="2" w:space="0" w:color="CCCCCC"/>
+              <w:left w:val="single" w:sz="2" w:space="0" w:color="CCCCCC"/>
+              <w:bottom w:val="single" w:sz="2" w:space="0" w:color="CCCCCC"/>
+              <w:right w:val="single" w:sz="2" w:space="0" w:color="CCCCCC"/>
             </w:tcBorders>
             <w:shd w:fill="FFFFFF" w:val="clear"/>
           </w:tcPr>
@@ -6905,12 +7560,12 @@
       <w:start w:val="1"/>
       <w:numFmt w:val="bullet"/>
       <w:lvlText w:val=""/>
-      <w:lvlJc w:val="start"/>
+      <w:lvlJc w:val="left"/>
       <w:pPr>
         <w:tabs>
           <w:tab w:val="num" w:pos="0"/>
         </w:tabs>
-        <w:ind w:start="720" w:hanging="360"/>
+        <w:ind w:left="720" w:hanging="360"/>
       </w:pPr>
       <w:rPr>
         <w:rFonts w:ascii="Symbol" w:hAnsi="Symbol" w:cs="Symbol" w:hint="default"/>
@@ -6920,111 +7575,240 @@
       <w:start w:val="1"/>
       <w:numFmt w:val="decimal"/>
       <w:lvlText w:val="%2."/>
-      <w:lvlJc w:val="start"/>
+      <w:lvlJc w:val="left"/>
       <w:pPr>
         <w:tabs>
           <w:tab w:val="num" w:pos="1080"/>
         </w:tabs>
-        <w:ind w:start="1080" w:hanging="360"/>
-      </w:pPr>
+        <w:ind w:left="1080" w:hanging="360"/>
+      </w:pPr>
+      <w:rPr/>
     </w:lvl>
     <w:lvl w:ilvl="2">
       <w:start w:val="1"/>
       <w:numFmt w:val="decimal"/>
       <w:lvlText w:val="%3."/>
-      <w:lvlJc w:val="start"/>
+      <w:lvlJc w:val="left"/>
       <w:pPr>
         <w:tabs>
           <w:tab w:val="num" w:pos="1440"/>
         </w:tabs>
-        <w:ind w:start="1440" w:hanging="360"/>
-      </w:pPr>
+        <w:ind w:left="1440" w:hanging="360"/>
+      </w:pPr>
+      <w:rPr/>
     </w:lvl>
     <w:lvl w:ilvl="3">
       <w:start w:val="1"/>
       <w:numFmt w:val="decimal"/>
       <w:lvlText w:val="%4."/>
-      <w:lvlJc w:val="start"/>
+      <w:lvlJc w:val="left"/>
       <w:pPr>
         <w:tabs>
           <w:tab w:val="num" w:pos="1800"/>
         </w:tabs>
-        <w:ind w:start="1800" w:hanging="360"/>
-      </w:pPr>
+        <w:ind w:left="1800" w:hanging="360"/>
+      </w:pPr>
+      <w:rPr/>
     </w:lvl>
     <w:lvl w:ilvl="4">
       <w:start w:val="1"/>
       <w:numFmt w:val="decimal"/>
       <w:lvlText w:val="%5."/>
-      <w:lvlJc w:val="start"/>
+      <w:lvlJc w:val="left"/>
       <w:pPr>
         <w:tabs>
           <w:tab w:val="num" w:pos="2160"/>
         </w:tabs>
-        <w:ind w:start="2160" w:hanging="360"/>
-      </w:pPr>
+        <w:ind w:left="2160" w:hanging="360"/>
+      </w:pPr>
+      <w:rPr/>
     </w:lvl>
     <w:lvl w:ilvl="5">
       <w:start w:val="1"/>
       <w:numFmt w:val="decimal"/>
       <w:lvlText w:val="%6."/>
-      <w:lvlJc w:val="start"/>
+      <w:lvlJc w:val="left"/>
       <w:pPr>
         <w:tabs>
           <w:tab w:val="num" w:pos="2520"/>
         </w:tabs>
-        <w:ind w:start="2520" w:hanging="360"/>
-      </w:pPr>
+        <w:ind w:left="2520" w:hanging="360"/>
+      </w:pPr>
+      <w:rPr/>
     </w:lvl>
     <w:lvl w:ilvl="6">
       <w:start w:val="1"/>
       <w:numFmt w:val="decimal"/>
       <w:lvlText w:val="%7."/>
-      <w:lvlJc w:val="start"/>
+      <w:lvlJc w:val="left"/>
       <w:pPr>
         <w:tabs>
           <w:tab w:val="num" w:pos="2880"/>
         </w:tabs>
-        <w:ind w:start="2880" w:hanging="360"/>
-      </w:pPr>
+        <w:ind w:left="2880" w:hanging="360"/>
+      </w:pPr>
+      <w:rPr/>
     </w:lvl>
     <w:lvl w:ilvl="7">
       <w:start w:val="1"/>
       <w:numFmt w:val="decimal"/>
       <w:lvlText w:val="%8."/>
-      <w:lvlJc w:val="start"/>
+      <w:lvlJc w:val="left"/>
       <w:pPr>
         <w:tabs>
           <w:tab w:val="num" w:pos="3240"/>
         </w:tabs>
-        <w:ind w:start="3240" w:hanging="360"/>
-      </w:pPr>
+        <w:ind w:left="3240" w:hanging="360"/>
+      </w:pPr>
+      <w:rPr/>
     </w:lvl>
     <w:lvl w:ilvl="8">
       <w:start w:val="1"/>
       <w:numFmt w:val="decimal"/>
       <w:lvlText w:val="%9."/>
-      <w:lvlJc w:val="start"/>
+      <w:lvlJc w:val="left"/>
       <w:pPr>
         <w:tabs>
           <w:tab w:val="num" w:pos="3600"/>
         </w:tabs>
-        <w:ind w:start="3600" w:hanging="360"/>
-      </w:pPr>
+        <w:ind w:left="3600" w:hanging="360"/>
+      </w:pPr>
+      <w:rPr/>
     </w:lvl>
   </w:abstractNum>
   <w:abstractNum w:abstractNumId="2">
     <w:lvl w:ilvl="0">
       <w:start w:val="1"/>
+      <w:numFmt w:val="bullet"/>
+      <w:lvlText w:val=""/>
+      <w:lvlJc w:val="left"/>
+      <w:pPr>
+        <w:tabs>
+          <w:tab w:val="num" w:pos="0"/>
+        </w:tabs>
+        <w:ind w:left="720" w:hanging="360"/>
+      </w:pPr>
+      <w:rPr>
+        <w:rFonts w:ascii="Symbol" w:hAnsi="Symbol" w:cs="Symbol" w:hint="default"/>
+      </w:rPr>
+    </w:lvl>
+    <w:lvl w:ilvl="1">
+      <w:start w:val="1"/>
+      <w:numFmt w:val="decimal"/>
+      <w:lvlText w:val="%2."/>
+      <w:lvlJc w:val="left"/>
+      <w:pPr>
+        <w:tabs>
+          <w:tab w:val="num" w:pos="1080"/>
+        </w:tabs>
+        <w:ind w:left="1080" w:hanging="360"/>
+      </w:pPr>
+      <w:rPr/>
+    </w:lvl>
+    <w:lvl w:ilvl="2">
+      <w:start w:val="1"/>
+      <w:numFmt w:val="decimal"/>
+      <w:lvlText w:val="%3."/>
+      <w:lvlJc w:val="left"/>
+      <w:pPr>
+        <w:tabs>
+          <w:tab w:val="num" w:pos="1440"/>
+        </w:tabs>
+        <w:ind w:left="1440" w:hanging="360"/>
+      </w:pPr>
+      <w:rPr/>
+    </w:lvl>
+    <w:lvl w:ilvl="3">
+      <w:start w:val="1"/>
+      <w:numFmt w:val="decimal"/>
+      <w:lvlText w:val="%4."/>
+      <w:lvlJc w:val="left"/>
+      <w:pPr>
+        <w:tabs>
+          <w:tab w:val="num" w:pos="1800"/>
+        </w:tabs>
+        <w:ind w:left="1800" w:hanging="360"/>
+      </w:pPr>
+      <w:rPr/>
+    </w:lvl>
+    <w:lvl w:ilvl="4">
+      <w:start w:val="1"/>
+      <w:numFmt w:val="decimal"/>
+      <w:lvlText w:val="%5."/>
+      <w:lvlJc w:val="left"/>
+      <w:pPr>
+        <w:tabs>
+          <w:tab w:val="num" w:pos="2160"/>
+        </w:tabs>
+        <w:ind w:left="2160" w:hanging="360"/>
+      </w:pPr>
+      <w:rPr/>
+    </w:lvl>
+    <w:lvl w:ilvl="5">
+      <w:start w:val="1"/>
+      <w:numFmt w:val="decimal"/>
+      <w:lvlText w:val="%6."/>
+      <w:lvlJc w:val="left"/>
+      <w:pPr>
+        <w:tabs>
+          <w:tab w:val="num" w:pos="2520"/>
+        </w:tabs>
+        <w:ind w:left="2520" w:hanging="360"/>
+      </w:pPr>
+      <w:rPr/>
+    </w:lvl>
+    <w:lvl w:ilvl="6">
+      <w:start w:val="1"/>
+      <w:numFmt w:val="decimal"/>
+      <w:lvlText w:val="%7."/>
+      <w:lvlJc w:val="left"/>
+      <w:pPr>
+        <w:tabs>
+          <w:tab w:val="num" w:pos="2880"/>
+        </w:tabs>
+        <w:ind w:left="2880" w:hanging="360"/>
+      </w:pPr>
+      <w:rPr/>
+    </w:lvl>
+    <w:lvl w:ilvl="7">
+      <w:start w:val="1"/>
+      <w:numFmt w:val="decimal"/>
+      <w:lvlText w:val="%8."/>
+      <w:lvlJc w:val="left"/>
+      <w:pPr>
+        <w:tabs>
+          <w:tab w:val="num" w:pos="3240"/>
+        </w:tabs>
+        <w:ind w:left="3240" w:hanging="360"/>
+      </w:pPr>
+      <w:rPr/>
+    </w:lvl>
+    <w:lvl w:ilvl="8">
+      <w:start w:val="1"/>
+      <w:numFmt w:val="decimal"/>
+      <w:lvlText w:val="%9."/>
+      <w:lvlJc w:val="left"/>
+      <w:pPr>
+        <w:tabs>
+          <w:tab w:val="num" w:pos="3600"/>
+        </w:tabs>
+        <w:ind w:left="3600" w:hanging="360"/>
+      </w:pPr>
+      <w:rPr/>
+    </w:lvl>
+  </w:abstractNum>
+  <w:abstractNum w:abstractNumId="3">
+    <w:lvl w:ilvl="0">
+      <w:start w:val="1"/>
       <w:numFmt w:val="none"/>
       <w:suff w:val="nothing"/>
       <w:lvlText w:val=""/>
-      <w:lvlJc w:val="start"/>
+      <w:lvlJc w:val="left"/>
       <w:pPr>
         <w:tabs>
           <w:tab w:val="num" w:pos="0"/>
         </w:tabs>
-        <w:ind w:start="0" w:hanging="0"/>
+        <w:ind w:left="0" w:hanging="0"/>
       </w:pPr>
     </w:lvl>
     <w:lvl w:ilvl="1">
@@ -7032,12 +7816,12 @@
       <w:numFmt w:val="none"/>
       <w:suff w:val="nothing"/>
       <w:lvlText w:val=""/>
-      <w:lvlJc w:val="start"/>
+      <w:lvlJc w:val="left"/>
       <w:pPr>
         <w:tabs>
           <w:tab w:val="num" w:pos="0"/>
         </w:tabs>
-        <w:ind w:start="0" w:hanging="0"/>
+        <w:ind w:left="0" w:hanging="0"/>
       </w:pPr>
     </w:lvl>
     <w:lvl w:ilvl="2">
@@ -7045,12 +7829,12 @@
       <w:numFmt w:val="none"/>
       <w:suff w:val="nothing"/>
       <w:lvlText w:val=""/>
-      <w:lvlJc w:val="start"/>
+      <w:lvlJc w:val="left"/>
       <w:pPr>
         <w:tabs>
           <w:tab w:val="num" w:pos="0"/>
         </w:tabs>
-        <w:ind w:start="0" w:hanging="0"/>
+        <w:ind w:left="0" w:hanging="0"/>
       </w:pPr>
     </w:lvl>
     <w:lvl w:ilvl="3">
@@ -7058,12 +7842,12 @@
       <w:numFmt w:val="none"/>
       <w:suff w:val="nothing"/>
       <w:lvlText w:val=""/>
-      <w:lvlJc w:val="start"/>
+      <w:lvlJc w:val="left"/>
       <w:pPr>
         <w:tabs>
           <w:tab w:val="num" w:pos="0"/>
         </w:tabs>
-        <w:ind w:start="0" w:hanging="0"/>
+        <w:ind w:left="0" w:hanging="0"/>
       </w:pPr>
     </w:lvl>
     <w:lvl w:ilvl="4">
@@ -7071,12 +7855,12 @@
       <w:numFmt w:val="none"/>
       <w:suff w:val="nothing"/>
       <w:lvlText w:val=""/>
-      <w:lvlJc w:val="start"/>
+      <w:lvlJc w:val="left"/>
       <w:pPr>
         <w:tabs>
           <w:tab w:val="num" w:pos="0"/>
         </w:tabs>
-        <w:ind w:start="0" w:hanging="0"/>
+        <w:ind w:left="0" w:hanging="0"/>
       </w:pPr>
     </w:lvl>
     <w:lvl w:ilvl="5">
@@ -7084,12 +7868,12 @@
       <w:numFmt w:val="none"/>
       <w:suff w:val="nothing"/>
       <w:lvlText w:val=""/>
-      <w:lvlJc w:val="start"/>
+      <w:lvlJc w:val="left"/>
       <w:pPr>
         <w:tabs>
           <w:tab w:val="num" w:pos="0"/>
         </w:tabs>
-        <w:ind w:start="0" w:hanging="0"/>
+        <w:ind w:left="0" w:hanging="0"/>
       </w:pPr>
     </w:lvl>
     <w:lvl w:ilvl="6">
@@ -7097,12 +7881,12 @@
       <w:numFmt w:val="none"/>
       <w:suff w:val="nothing"/>
       <w:lvlText w:val=""/>
-      <w:lvlJc w:val="start"/>
+      <w:lvlJc w:val="left"/>
       <w:pPr>
         <w:tabs>
           <w:tab w:val="num" w:pos="0"/>
         </w:tabs>
-        <w:ind w:start="0" w:hanging="0"/>
+        <w:ind w:left="0" w:hanging="0"/>
       </w:pPr>
     </w:lvl>
     <w:lvl w:ilvl="7">
@@ -7110,12 +7894,12 @@
       <w:numFmt w:val="none"/>
       <w:suff w:val="nothing"/>
       <w:lvlText w:val=""/>
-      <w:lvlJc w:val="start"/>
+      <w:lvlJc w:val="left"/>
       <w:pPr>
         <w:tabs>
           <w:tab w:val="num" w:pos="0"/>
         </w:tabs>
-        <w:ind w:start="0" w:hanging="0"/>
+        <w:ind w:left="0" w:hanging="0"/>
       </w:pPr>
     </w:lvl>
     <w:lvl w:ilvl="8">
@@ -7123,12 +7907,12 @@
       <w:numFmt w:val="none"/>
       <w:suff w:val="nothing"/>
       <w:lvlText w:val=""/>
-      <w:lvlJc w:val="start"/>
+      <w:lvlJc w:val="left"/>
       <w:pPr>
         <w:tabs>
           <w:tab w:val="num" w:pos="0"/>
         </w:tabs>
-        <w:ind w:start="0" w:hanging="0"/>
+        <w:ind w:left="0" w:hanging="0"/>
       </w:pPr>
     </w:lvl>
   </w:abstractNum>
@@ -7139,10 +7923,28 @@
     <w:abstractNumId w:val="2"/>
   </w:num>
   <w:num w:numId="3">
-    <w:abstractNumId w:val="1"/>
+    <w:abstractNumId w:val="3"/>
+  </w:num>
+  <w:num w:numId="4">
+    <w:abstractNumId w:val="2"/>
     <w:lvlOverride w:ilvl="0">
       <w:startOverride w:val="1"/>
     </w:lvlOverride>
+  </w:num>
+  <w:num w:numId="5">
+    <w:abstractNumId w:val="2"/>
+  </w:num>
+  <w:num w:numId="6">
+    <w:abstractNumId w:val="2"/>
+  </w:num>
+  <w:num w:numId="7">
+    <w:abstractNumId w:val="2"/>
+  </w:num>
+  <w:num w:numId="8">
+    <w:abstractNumId w:val="2"/>
+  </w:num>
+  <w:num w:numId="9">
+    <w:abstractNumId w:val="2"/>
   </w:num>
 </w:numbering>
 </file>
@@ -7167,9 +7969,10 @@
     <w:qFormat/>
     <w:pPr>
       <w:widowControl/>
+      <w:suppressAutoHyphens w:val="true"/>
       <w:bidi w:val="0"/>
       <w:spacing w:before="0" w:after="0"/>
-      <w:jc w:val="start"/>
+      <w:jc w:val="left"/>
     </w:pPr>
     <w:rPr>
       <w:rFonts w:ascii="Arial" w:hAnsi="Arial" w:eastAsia="Arial" w:cs="Arial"/>
@@ -7181,7 +7984,7 @@
     </w:rPr>
   </w:style>
   <w:style w:type="paragraph" w:styleId="Heading1">
-    <w:name w:val="heading 1"/>
+    <w:name w:val="Heading 1"/>
     <w:basedOn w:val="Heading"/>
     <w:qFormat/>
     <w:pPr>
@@ -7198,7 +8001,7 @@
     </w:rPr>
   </w:style>
   <w:style w:type="paragraph" w:styleId="Heading2">
-    <w:name w:val="heading 2"/>
+    <w:name w:val="Heading 2"/>
     <w:basedOn w:val="Heading"/>
     <w:qFormat/>
     <w:pPr>
@@ -7215,7 +8018,7 @@
     </w:rPr>
   </w:style>
   <w:style w:type="paragraph" w:styleId="Heading3">
-    <w:name w:val="heading 3"/>
+    <w:name w:val="Heading 3"/>
     <w:basedOn w:val="Heading"/>
     <w:qFormat/>
     <w:pPr>
@@ -7232,7 +8035,7 @@
     </w:rPr>
   </w:style>
   <w:style w:type="paragraph" w:styleId="Heading4">
-    <w:name w:val="heading 4"/>
+    <w:name w:val="Heading 4"/>
     <w:basedOn w:val="Heading"/>
     <w:qFormat/>
     <w:pPr/>
@@ -7243,7 +8046,7 @@
     </w:rPr>
   </w:style>
   <w:style w:type="paragraph" w:styleId="Heading5">
-    <w:name w:val="heading 5"/>
+    <w:name w:val="Heading 5"/>
     <w:basedOn w:val="Heading"/>
     <w:qFormat/>
     <w:pPr/>
@@ -7252,7 +8055,7 @@
     </w:rPr>
   </w:style>
   <w:style w:type="paragraph" w:styleId="Heading6">
-    <w:name w:val="heading 6"/>
+    <w:name w:val="Heading 6"/>
     <w:basedOn w:val="Heading"/>
     <w:qFormat/>
     <w:pPr/>
@@ -7280,7 +8083,7 @@
     </w:rPr>
   </w:style>
   <w:style w:type="character" w:styleId="FootnoteReference">
-    <w:name w:val="footnote reference"/>
+    <w:name w:val="Footnote Reference"/>
     <w:rPr>
       <w:vertAlign w:val="superscript"/>
     </w:rPr>
@@ -7329,7 +8132,7 @@
     </w:rPr>
   </w:style>
   <w:style w:type="paragraph" w:styleId="Caption">
-    <w:name w:val="caption"/>
+    <w:name w:val="Caption"/>
     <w:basedOn w:val="Normal"/>
     <w:qFormat/>
     <w:pPr>
@@ -7370,9 +8173,10 @@
     <w:qFormat/>
     <w:pPr>
       <w:widowControl/>
+      <w:suppressAutoHyphens w:val="true"/>
       <w:bidi w:val="0"/>
       <w:spacing w:before="0" w:after="0"/>
-      <w:jc w:val="start"/>
+      <w:jc w:val="left"/>
     </w:pPr>
     <w:rPr>
       <w:rFonts w:ascii="Arial" w:hAnsi="Arial" w:eastAsia="Arial" w:cs="Arial"/>
@@ -7390,9 +8194,10 @@
     <w:qFormat/>
     <w:pPr>
       <w:widowControl/>
+      <w:suppressAutoHyphens w:val="true"/>
       <w:bidi w:val="0"/>
       <w:spacing w:before="0" w:after="0"/>
-      <w:jc w:val="start"/>
+      <w:jc w:val="left"/>
     </w:pPr>
     <w:rPr>
       <w:rFonts w:ascii="Arial" w:hAnsi="Arial" w:eastAsia="Arial" w:cs="Arial"/>
@@ -7404,7 +8209,7 @@
     </w:rPr>
   </w:style>
   <w:style w:type="paragraph" w:styleId="FootnoteText">
-    <w:name w:val="footnote text"/>
+    <w:name w:val="Footnote Text"/>
     <w:basedOn w:val="Normal"/>
     <w:link w:val="FootnoteTextChar"/>
     <w:uiPriority w:val="99"/>

</xml_diff>